<commit_message>
61-p version with optimized parameters, plus new code for ungroundedcontact and endangeredbridge with weights still set to 0. Revert addition of "ungroundedcontact" and "endangeredbridge" if they don't prove beneficial. Cake 1.85g 3162k (61p) - Kingsrow(x64) 1.18f : W-L-D:244-1016-3540  (41.96% overall, 24.01% relative) +:244 =:3486 -:1016 unknown:54 +B:730 -B:530 Cake 1.85g 3162k (61p) - Kingsrow(x64) 1.18 : W-L-D:1082-537-2113 +:1082 =:2103 -:537 unknown:10 +B:469 -B:1150  (57.30% overall, 201.5% relative)
</commit_message>
<xml_diff>
--- a/2019_04_22_EvaluationTuning.docx
+++ b/2019_04_22_EvaluationTuning.docx
@@ -5633,6 +5633,14 @@
           <w:lang w:val="en-US"/>
         </w:rPr>
       </w:pPr>
+      <w:r>
+        <w:rPr>
+          <w:lang w:val="en-US"/>
+        </w:rPr>
+        <w:t>14.5. with 61 params to optimize overall</w:t>
+      </w:r>
+      <w:bookmarkStart w:id="0" w:name="_GoBack"/>
+      <w:bookmarkEnd w:id="0"/>
     </w:p>
     <w:p>
       <w:pPr>
@@ -5726,6 +5734,532 @@
             </a:graphic>
           </wp:inline>
         </w:drawing>
+      </w:r>
+    </w:p>
+    <w:p>
+      <w:pPr>
+        <w:rPr>
+          <w:lang w:val="en-US"/>
+        </w:rPr>
+      </w:pPr>
+      <w:r>
+        <w:rPr>
+          <w:lang w:val="en-US"/>
+        </w:rPr>
+        <w:t>This version went on to be amazing in the match:</w:t>
+      </w:r>
+    </w:p>
+    <w:p>
+      <w:pPr>
+        <w:autoSpaceDE w:val="0"/>
+        <w:autoSpaceDN w:val="0"/>
+        <w:adjustRightInd w:val="0"/>
+        <w:spacing w:after="0" w:line="240" w:lineRule="auto"/>
+        <w:rPr>
+          <w:rFonts w:ascii="Consolas" w:hAnsi="Consolas" w:cs="Consolas"/>
+          <w:color w:val="000000"/>
+          <w:sz w:val="19"/>
+          <w:szCs w:val="19"/>
+          <w:lang w:val="en-US"/>
+        </w:rPr>
+      </w:pPr>
+      <w:r>
+        <w:rPr>
+          <w:rFonts w:ascii="Consolas" w:hAnsi="Consolas" w:cs="Consolas"/>
+          <w:color w:val="000000"/>
+          <w:sz w:val="19"/>
+          <w:szCs w:val="19"/>
+          <w:lang w:val="en-US"/>
+        </w:rPr>
+        <w:t>I add another 4 parameters to optimize</w:t>
+      </w:r>
+    </w:p>
+    <w:p>
+      <w:pPr>
+        <w:autoSpaceDE w:val="0"/>
+        <w:autoSpaceDN w:val="0"/>
+        <w:adjustRightInd w:val="0"/>
+        <w:spacing w:after="0" w:line="240" w:lineRule="auto"/>
+        <w:rPr>
+          <w:rFonts w:ascii="Consolas" w:hAnsi="Consolas" w:cs="Consolas"/>
+          <w:color w:val="000000"/>
+          <w:sz w:val="19"/>
+          <w:szCs w:val="19"/>
+          <w:lang w:val="en-US"/>
+        </w:rPr>
+      </w:pPr>
+      <w:r>
+        <w:rPr>
+          <w:rFonts w:ascii="Consolas" w:hAnsi="Consolas" w:cs="Consolas"/>
+          <w:color w:val="000000"/>
+          <w:sz w:val="19"/>
+          <w:szCs w:val="19"/>
+          <w:lang w:val="en-US"/>
+        </w:rPr>
+        <w:t xml:space="preserve">(badstructure3, badstructure4, badstructure2stones, </w:t>
+      </w:r>
+      <w:proofErr w:type="spellStart"/>
+      <w:r>
+        <w:rPr>
+          <w:rFonts w:ascii="Consolas" w:hAnsi="Consolas" w:cs="Consolas"/>
+          <w:color w:val="000000"/>
+          <w:sz w:val="19"/>
+          <w:szCs w:val="19"/>
+          <w:lang w:val="en-US"/>
+        </w:rPr>
+        <w:t>kingmanstones</w:t>
+      </w:r>
+      <w:proofErr w:type="spellEnd"/>
+      <w:r>
+        <w:rPr>
+          <w:rFonts w:ascii="Consolas" w:hAnsi="Consolas" w:cs="Consolas"/>
+          <w:color w:val="000000"/>
+          <w:sz w:val="19"/>
+          <w:szCs w:val="19"/>
+          <w:lang w:val="en-US"/>
+        </w:rPr>
+        <w:t>)</w:t>
+      </w:r>
+    </w:p>
+    <w:p>
+      <w:pPr>
+        <w:autoSpaceDE w:val="0"/>
+        <w:autoSpaceDN w:val="0"/>
+        <w:adjustRightInd w:val="0"/>
+        <w:spacing w:after="0" w:line="240" w:lineRule="auto"/>
+        <w:rPr>
+          <w:rFonts w:ascii="Consolas" w:hAnsi="Consolas" w:cs="Consolas"/>
+          <w:color w:val="000000"/>
+          <w:sz w:val="19"/>
+          <w:szCs w:val="19"/>
+          <w:lang w:val="en-US"/>
+        </w:rPr>
+      </w:pPr>
+      <w:r>
+        <w:rPr>
+          <w:rFonts w:ascii="Consolas" w:hAnsi="Consolas" w:cs="Consolas"/>
+          <w:color w:val="000000"/>
+          <w:sz w:val="19"/>
+          <w:szCs w:val="19"/>
+          <w:lang w:val="en-US"/>
+        </w:rPr>
+        <w:t xml:space="preserve">big change in terms of what it is doing with badstructure2stones and </w:t>
+      </w:r>
+      <w:proofErr w:type="spellStart"/>
+      <w:r>
+        <w:rPr>
+          <w:rFonts w:ascii="Consolas" w:hAnsi="Consolas" w:cs="Consolas"/>
+          <w:color w:val="000000"/>
+          <w:sz w:val="19"/>
+          <w:szCs w:val="19"/>
+          <w:lang w:val="en-US"/>
+        </w:rPr>
+        <w:t>kingmanstones</w:t>
+      </w:r>
+      <w:proofErr w:type="spellEnd"/>
+      <w:r>
+        <w:rPr>
+          <w:rFonts w:ascii="Consolas" w:hAnsi="Consolas" w:cs="Consolas"/>
+          <w:color w:val="000000"/>
+          <w:sz w:val="19"/>
+          <w:szCs w:val="19"/>
+          <w:lang w:val="en-US"/>
+        </w:rPr>
+        <w:t>, which are the limit value</w:t>
+      </w:r>
+    </w:p>
+    <w:p>
+      <w:pPr>
+        <w:autoSpaceDE w:val="0"/>
+        <w:autoSpaceDN w:val="0"/>
+        <w:adjustRightInd w:val="0"/>
+        <w:spacing w:after="0" w:line="240" w:lineRule="auto"/>
+        <w:rPr>
+          <w:rFonts w:ascii="Consolas" w:hAnsi="Consolas" w:cs="Consolas"/>
+          <w:color w:val="000000"/>
+          <w:sz w:val="19"/>
+          <w:szCs w:val="19"/>
+          <w:lang w:val="en-US"/>
+        </w:rPr>
+      </w:pPr>
+      <w:r>
+        <w:rPr>
+          <w:rFonts w:ascii="Consolas" w:hAnsi="Consolas" w:cs="Consolas"/>
+          <w:color w:val="000000"/>
+          <w:sz w:val="19"/>
+          <w:szCs w:val="19"/>
+          <w:lang w:val="en-US"/>
+        </w:rPr>
+        <w:t xml:space="preserve">for when to evaluate bad structures and king-man-interaction (such as </w:t>
+      </w:r>
+      <w:proofErr w:type="spellStart"/>
+      <w:r>
+        <w:rPr>
+          <w:rFonts w:ascii="Consolas" w:hAnsi="Consolas" w:cs="Consolas"/>
+          <w:color w:val="000000"/>
+          <w:sz w:val="19"/>
+          <w:szCs w:val="19"/>
+          <w:lang w:val="en-US"/>
+        </w:rPr>
+        <w:t>tailhooks</w:t>
+      </w:r>
+      <w:proofErr w:type="spellEnd"/>
+      <w:r>
+        <w:rPr>
+          <w:rFonts w:ascii="Consolas" w:hAnsi="Consolas" w:cs="Consolas"/>
+          <w:color w:val="000000"/>
+          <w:sz w:val="19"/>
+          <w:szCs w:val="19"/>
+          <w:lang w:val="en-US"/>
+        </w:rPr>
+        <w:t xml:space="preserve">), it does this </w:t>
+      </w:r>
+    </w:p>
+    <w:p>
+      <w:pPr>
+        <w:autoSpaceDE w:val="0"/>
+        <w:autoSpaceDN w:val="0"/>
+        <w:adjustRightInd w:val="0"/>
+        <w:spacing w:after="0" w:line="240" w:lineRule="auto"/>
+        <w:rPr>
+          <w:rFonts w:ascii="Consolas" w:hAnsi="Consolas" w:cs="Consolas"/>
+          <w:color w:val="000000"/>
+          <w:sz w:val="19"/>
+          <w:szCs w:val="19"/>
+          <w:lang w:val="en-US"/>
+        </w:rPr>
+      </w:pPr>
+      <w:r>
+        <w:rPr>
+          <w:rFonts w:ascii="Consolas" w:hAnsi="Consolas" w:cs="Consolas"/>
+          <w:color w:val="000000"/>
+          <w:sz w:val="19"/>
+          <w:szCs w:val="19"/>
+          <w:lang w:val="en-US"/>
+        </w:rPr>
+        <w:t xml:space="preserve">from the start (2*12 stones for badstructure2stones) and nearly from start (2*10 for </w:t>
+      </w:r>
+      <w:proofErr w:type="spellStart"/>
+      <w:r>
+        <w:rPr>
+          <w:rFonts w:ascii="Consolas" w:hAnsi="Consolas" w:cs="Consolas"/>
+          <w:color w:val="000000"/>
+          <w:sz w:val="19"/>
+          <w:szCs w:val="19"/>
+          <w:lang w:val="en-US"/>
+        </w:rPr>
+        <w:t>kingmanstones</w:t>
+      </w:r>
+      <w:proofErr w:type="spellEnd"/>
+      <w:r>
+        <w:rPr>
+          <w:rFonts w:ascii="Consolas" w:hAnsi="Consolas" w:cs="Consolas"/>
+          <w:color w:val="000000"/>
+          <w:sz w:val="19"/>
+          <w:szCs w:val="19"/>
+          <w:lang w:val="en-US"/>
+        </w:rPr>
+        <w:t>)</w:t>
+      </w:r>
+    </w:p>
+    <w:p>
+      <w:pPr>
+        <w:autoSpaceDE w:val="0"/>
+        <w:autoSpaceDN w:val="0"/>
+        <w:adjustRightInd w:val="0"/>
+        <w:spacing w:after="0" w:line="240" w:lineRule="auto"/>
+        <w:rPr>
+          <w:rFonts w:ascii="Consolas" w:hAnsi="Consolas" w:cs="Consolas"/>
+          <w:color w:val="000000"/>
+          <w:sz w:val="19"/>
+          <w:szCs w:val="19"/>
+          <w:lang w:val="en-US"/>
+        </w:rPr>
+      </w:pPr>
+    </w:p>
+    <w:p>
+      <w:pPr>
+        <w:autoSpaceDE w:val="0"/>
+        <w:autoSpaceDN w:val="0"/>
+        <w:adjustRightInd w:val="0"/>
+        <w:spacing w:after="0" w:line="240" w:lineRule="auto"/>
+        <w:rPr>
+          <w:rFonts w:ascii="Consolas" w:hAnsi="Consolas" w:cs="Consolas"/>
+          <w:color w:val="000000"/>
+          <w:sz w:val="19"/>
+          <w:szCs w:val="19"/>
+          <w:lang w:val="en-US"/>
+        </w:rPr>
+      </w:pPr>
+      <w:r>
+        <w:rPr>
+          <w:rFonts w:ascii="Consolas" w:hAnsi="Consolas" w:cs="Consolas"/>
+          <w:color w:val="000000"/>
+          <w:sz w:val="19"/>
+          <w:szCs w:val="19"/>
+          <w:lang w:val="en-US"/>
+        </w:rPr>
+        <w:t>***********************</w:t>
+      </w:r>
+      <w:proofErr w:type="gramStart"/>
+      <w:r>
+        <w:rPr>
+          <w:rFonts w:ascii="Consolas" w:hAnsi="Consolas" w:cs="Consolas"/>
+          <w:color w:val="000000"/>
+          <w:sz w:val="19"/>
+          <w:szCs w:val="19"/>
+          <w:lang w:val="en-US"/>
+        </w:rPr>
+        <w:t>*  clearly</w:t>
+      </w:r>
+      <w:proofErr w:type="gramEnd"/>
+      <w:r>
+        <w:rPr>
+          <w:rFonts w:ascii="Consolas" w:hAnsi="Consolas" w:cs="Consolas"/>
+          <w:color w:val="000000"/>
+          <w:sz w:val="19"/>
+          <w:szCs w:val="19"/>
+          <w:lang w:val="en-US"/>
+        </w:rPr>
+        <w:t xml:space="preserve"> best version so far!! </w:t>
+      </w:r>
+      <w:proofErr w:type="spellStart"/>
+      <w:r>
+        <w:rPr>
+          <w:rFonts w:ascii="Consolas" w:hAnsi="Consolas" w:cs="Consolas"/>
+          <w:color w:val="000000"/>
+          <w:sz w:val="19"/>
+          <w:szCs w:val="19"/>
+          <w:lang w:val="en-US"/>
+        </w:rPr>
+        <w:t>vvvvvvvvvvvvvvvvvvvvvvvvvvvvvvvvvvvvvvvvvv</w:t>
+      </w:r>
+      <w:proofErr w:type="spellEnd"/>
+    </w:p>
+    <w:p>
+      <w:pPr>
+        <w:autoSpaceDE w:val="0"/>
+        <w:autoSpaceDN w:val="0"/>
+        <w:adjustRightInd w:val="0"/>
+        <w:spacing w:after="0" w:line="240" w:lineRule="auto"/>
+        <w:rPr>
+          <w:rFonts w:ascii="Consolas" w:hAnsi="Consolas" w:cs="Consolas"/>
+          <w:color w:val="000000"/>
+          <w:sz w:val="19"/>
+          <w:szCs w:val="19"/>
+          <w:lang w:val="en-US"/>
+        </w:rPr>
+      </w:pPr>
+      <w:r>
+        <w:rPr>
+          <w:rFonts w:ascii="Consolas" w:hAnsi="Consolas" w:cs="Consolas"/>
+          <w:color w:val="000000"/>
+          <w:sz w:val="19"/>
+          <w:szCs w:val="19"/>
+          <w:lang w:val="en-US"/>
+        </w:rPr>
+        <w:t xml:space="preserve">Cake 1.85g 3162k (61p) - </w:t>
+      </w:r>
+      <w:proofErr w:type="spellStart"/>
+      <w:r>
+        <w:rPr>
+          <w:rFonts w:ascii="Consolas" w:hAnsi="Consolas" w:cs="Consolas"/>
+          <w:color w:val="000000"/>
+          <w:sz w:val="19"/>
+          <w:szCs w:val="19"/>
+          <w:lang w:val="en-US"/>
+        </w:rPr>
+        <w:t>Kingsrow</w:t>
+      </w:r>
+      <w:proofErr w:type="spellEnd"/>
+      <w:r>
+        <w:rPr>
+          <w:rFonts w:ascii="Consolas" w:hAnsi="Consolas" w:cs="Consolas"/>
+          <w:color w:val="000000"/>
+          <w:sz w:val="19"/>
+          <w:szCs w:val="19"/>
+          <w:lang w:val="en-US"/>
+        </w:rPr>
+        <w:t xml:space="preserve">(x64) </w:t>
+      </w:r>
+      <w:proofErr w:type="gramStart"/>
+      <w:r>
+        <w:rPr>
+          <w:rFonts w:ascii="Consolas" w:hAnsi="Consolas" w:cs="Consolas"/>
+          <w:color w:val="000000"/>
+          <w:sz w:val="19"/>
+          <w:szCs w:val="19"/>
+          <w:lang w:val="en-US"/>
+        </w:rPr>
+        <w:t>1.18f :</w:t>
+      </w:r>
+      <w:proofErr w:type="gramEnd"/>
+      <w:r>
+        <w:rPr>
+          <w:rFonts w:ascii="Consolas" w:hAnsi="Consolas" w:cs="Consolas"/>
+          <w:color w:val="000000"/>
+          <w:sz w:val="19"/>
+          <w:szCs w:val="19"/>
+          <w:lang w:val="en-US"/>
+        </w:rPr>
+        <w:t xml:space="preserve"> W-L-D:244-1016-3540  (41.96% overall, 24.01% relative)</w:t>
+      </w:r>
+    </w:p>
+    <w:p>
+      <w:pPr>
+        <w:autoSpaceDE w:val="0"/>
+        <w:autoSpaceDN w:val="0"/>
+        <w:adjustRightInd w:val="0"/>
+        <w:spacing w:after="0" w:line="240" w:lineRule="auto"/>
+        <w:rPr>
+          <w:rFonts w:ascii="Consolas" w:hAnsi="Consolas" w:cs="Consolas"/>
+          <w:color w:val="000000"/>
+          <w:sz w:val="19"/>
+          <w:szCs w:val="19"/>
+          <w:lang w:val="en-US"/>
+        </w:rPr>
+      </w:pPr>
+      <w:r>
+        <w:rPr>
+          <w:rFonts w:ascii="Consolas" w:hAnsi="Consolas" w:cs="Consolas"/>
+          <w:color w:val="000000"/>
+          <w:sz w:val="19"/>
+          <w:szCs w:val="19"/>
+          <w:lang w:val="en-US"/>
+        </w:rPr>
+        <w:t>+:244 =:3486 -:1016 unknown:54 +B:730 -B:530</w:t>
+      </w:r>
+    </w:p>
+    <w:p>
+      <w:pPr>
+        <w:autoSpaceDE w:val="0"/>
+        <w:autoSpaceDN w:val="0"/>
+        <w:adjustRightInd w:val="0"/>
+        <w:spacing w:after="0" w:line="240" w:lineRule="auto"/>
+        <w:rPr>
+          <w:rFonts w:ascii="Consolas" w:hAnsi="Consolas" w:cs="Consolas"/>
+          <w:color w:val="000000"/>
+          <w:sz w:val="19"/>
+          <w:szCs w:val="19"/>
+          <w:lang w:val="en-US"/>
+        </w:rPr>
+      </w:pPr>
+      <w:r>
+        <w:rPr>
+          <w:rFonts w:ascii="Consolas" w:hAnsi="Consolas" w:cs="Consolas"/>
+          <w:color w:val="000000"/>
+          <w:sz w:val="19"/>
+          <w:szCs w:val="19"/>
+          <w:lang w:val="en-US"/>
+        </w:rPr>
+        <w:t xml:space="preserve">Cake 1.85g 3162k (61p) - </w:t>
+      </w:r>
+      <w:proofErr w:type="spellStart"/>
+      <w:r>
+        <w:rPr>
+          <w:rFonts w:ascii="Consolas" w:hAnsi="Consolas" w:cs="Consolas"/>
+          <w:color w:val="000000"/>
+          <w:sz w:val="19"/>
+          <w:szCs w:val="19"/>
+          <w:lang w:val="en-US"/>
+        </w:rPr>
+        <w:t>Kingsrow</w:t>
+      </w:r>
+      <w:proofErr w:type="spellEnd"/>
+      <w:r>
+        <w:rPr>
+          <w:rFonts w:ascii="Consolas" w:hAnsi="Consolas" w:cs="Consolas"/>
+          <w:color w:val="000000"/>
+          <w:sz w:val="19"/>
+          <w:szCs w:val="19"/>
+          <w:lang w:val="en-US"/>
+        </w:rPr>
+        <w:t xml:space="preserve">(x64) </w:t>
+      </w:r>
+      <w:proofErr w:type="gramStart"/>
+      <w:r>
+        <w:rPr>
+          <w:rFonts w:ascii="Consolas" w:hAnsi="Consolas" w:cs="Consolas"/>
+          <w:color w:val="000000"/>
+          <w:sz w:val="19"/>
+          <w:szCs w:val="19"/>
+          <w:lang w:val="en-US"/>
+        </w:rPr>
+        <w:t>1.18 :</w:t>
+      </w:r>
+      <w:proofErr w:type="gramEnd"/>
+      <w:r>
+        <w:rPr>
+          <w:rFonts w:ascii="Consolas" w:hAnsi="Consolas" w:cs="Consolas"/>
+          <w:color w:val="000000"/>
+          <w:sz w:val="19"/>
+          <w:szCs w:val="19"/>
+          <w:lang w:val="en-US"/>
+        </w:rPr>
+        <w:t xml:space="preserve"> W-L-D:1082-537-2113</w:t>
+      </w:r>
+    </w:p>
+    <w:p>
+      <w:pPr>
+        <w:autoSpaceDE w:val="0"/>
+        <w:autoSpaceDN w:val="0"/>
+        <w:adjustRightInd w:val="0"/>
+        <w:spacing w:after="0" w:line="240" w:lineRule="auto"/>
+        <w:rPr>
+          <w:rFonts w:ascii="Consolas" w:hAnsi="Consolas" w:cs="Consolas"/>
+          <w:color w:val="000000"/>
+          <w:sz w:val="19"/>
+          <w:szCs w:val="19"/>
+          <w:lang w:val="en-US"/>
+        </w:rPr>
+      </w:pPr>
+      <w:r>
+        <w:rPr>
+          <w:rFonts w:ascii="Consolas" w:hAnsi="Consolas" w:cs="Consolas"/>
+          <w:color w:val="000000"/>
+          <w:sz w:val="19"/>
+          <w:szCs w:val="19"/>
+          <w:lang w:val="en-US"/>
+        </w:rPr>
+        <w:t>+:1082 =:2103 -:537 unknown:10 +B:469 -B:</w:t>
+      </w:r>
+      <w:proofErr w:type="gramStart"/>
+      <w:r>
+        <w:rPr>
+          <w:rFonts w:ascii="Consolas" w:hAnsi="Consolas" w:cs="Consolas"/>
+          <w:color w:val="000000"/>
+          <w:sz w:val="19"/>
+          <w:szCs w:val="19"/>
+          <w:lang w:val="en-US"/>
+        </w:rPr>
+        <w:t>1150  (</w:t>
+      </w:r>
+      <w:proofErr w:type="gramEnd"/>
+      <w:r>
+        <w:rPr>
+          <w:rFonts w:ascii="Consolas" w:hAnsi="Consolas" w:cs="Consolas"/>
+          <w:color w:val="000000"/>
+          <w:sz w:val="19"/>
+          <w:szCs w:val="19"/>
+          <w:lang w:val="en-US"/>
+        </w:rPr>
+        <w:t>57.30% overall, 201.5% relative)</w:t>
+      </w:r>
+    </w:p>
+    <w:p>
+      <w:pPr>
+        <w:rPr>
+          <w:lang w:val="en-US"/>
+        </w:rPr>
+      </w:pPr>
+      <w:r>
+        <w:rPr>
+          <w:rFonts w:ascii="Consolas" w:hAnsi="Consolas" w:cs="Consolas"/>
+          <w:color w:val="000000"/>
+          <w:sz w:val="19"/>
+          <w:szCs w:val="19"/>
+        </w:rPr>
+        <w:t>----------------------------------------------------------------------------------------------------</w:t>
       </w:r>
     </w:p>
     <w:p>
@@ -5822,8 +6356,6 @@
         </w:rPr>
         <w:t xml:space="preserve"> repeated moves!? Check this game and move rep code?</w:t>
       </w:r>
-      <w:bookmarkStart w:id="0" w:name="_GoBack"/>
-      <w:bookmarkEnd w:id="0"/>
     </w:p>
     <w:sectPr>
       <w:pgSz w:w="11906" w:h="16838"/>

</xml_diff>

<commit_message>
Removed contactpenalty and endangeredbridge again, added br array to optimization.
</commit_message>
<xml_diff>
--- a/2019_04_22_EvaluationTuning.docx
+++ b/2019_04_22_EvaluationTuning.docx
@@ -5639,8 +5639,6 @@
         </w:rPr>
         <w:t>14.5. with 61 params to optimize overall</w:t>
       </w:r>
-      <w:bookmarkStart w:id="0" w:name="_GoBack"/>
-      <w:bookmarkEnd w:id="0"/>
     </w:p>
     <w:p>
       <w:pPr>
@@ -5746,7 +5744,33 @@
         <w:rPr>
           <w:lang w:val="en-US"/>
         </w:rPr>
+        <w:t xml:space="preserve">I also added </w:t>
+      </w:r>
+      <w:proofErr w:type="spellStart"/>
+      <w:r>
+        <w:rPr>
+          <w:lang w:val="en-US"/>
+        </w:rPr>
+        <w:t>kingmanstones</w:t>
+      </w:r>
+      <w:proofErr w:type="spellEnd"/>
+      <w:r>
+        <w:rPr>
+          <w:lang w:val="en-US"/>
+        </w:rPr>
+        <w:t xml:space="preserve">, and </w:t>
+      </w:r>
+      <w:r>
+        <w:rPr>
+          <w:lang w:val="en-US"/>
+        </w:rPr>
         <w:t>This version went on to be amazing in the match:</w:t>
+      </w:r>
+      <w:r>
+        <w:rPr>
+          <w:lang w:val="en-US"/>
+        </w:rPr>
+        <w:t xml:space="preserve"> </w:t>
       </w:r>
     </w:p>
     <w:p>
@@ -6201,6 +6225,9 @@
     </w:p>
     <w:p>
       <w:pPr>
+        <w:pBdr>
+          <w:bottom w:val="single" w:sz="6" w:space="1" w:color="auto"/>
+        </w:pBdr>
         <w:autoSpaceDE w:val="0"/>
         <w:autoSpaceDN w:val="0"/>
         <w:adjustRightInd w:val="0"/>
@@ -6249,55 +6276,226 @@
     <w:p>
       <w:pPr>
         <w:rPr>
-          <w:lang w:val="en-US"/>
-        </w:rPr>
-      </w:pPr>
-      <w:r>
-        <w:rPr>
-          <w:rFonts w:ascii="Consolas" w:hAnsi="Consolas" w:cs="Consolas"/>
-          <w:color w:val="000000"/>
-          <w:sz w:val="19"/>
-          <w:szCs w:val="19"/>
-        </w:rPr>
-        <w:t>----------------------------------------------------------------------------------------------------</w:t>
-      </w:r>
-    </w:p>
-    <w:p>
-      <w:pPr>
-        <w:rPr>
-          <w:lang w:val="en-US"/>
-        </w:rPr>
-      </w:pPr>
-    </w:p>
-    <w:p>
-      <w:pPr>
-        <w:rPr>
-          <w:lang w:val="en-US"/>
-        </w:rPr>
-      </w:pPr>
-      <w:r>
-        <w:rPr>
-          <w:lang w:val="en-US"/>
-        </w:rPr>
-        <w:t xml:space="preserve">1 or two games before this </w:t>
-      </w:r>
-    </w:p>
-    <w:p>
-      <w:pPr>
-        <w:rPr>
-          <w:lang w:val="en-US"/>
-        </w:rPr>
-      </w:pPr>
-      <w:r>
-        <w:rPr>
-          <w:noProof/>
+          <w:rFonts w:ascii="Consolas" w:hAnsi="Consolas" w:cs="Consolas"/>
+          <w:color w:val="000000"/>
+          <w:sz w:val="19"/>
+          <w:szCs w:val="19"/>
+          <w:lang w:val="en-US"/>
+        </w:rPr>
+      </w:pPr>
+    </w:p>
+    <w:p>
+      <w:pPr>
+        <w:rPr>
+          <w:rFonts w:ascii="Consolas" w:hAnsi="Consolas" w:cs="Consolas"/>
+          <w:color w:val="000000"/>
+          <w:sz w:val="19"/>
+          <w:szCs w:val="19"/>
+          <w:lang w:val="en-US"/>
+        </w:rPr>
+      </w:pPr>
+    </w:p>
+    <w:p>
+      <w:pPr>
+        <w:rPr>
+          <w:rFonts w:ascii="Consolas" w:hAnsi="Consolas" w:cs="Consolas"/>
+          <w:color w:val="000000"/>
+          <w:sz w:val="19"/>
+          <w:szCs w:val="19"/>
+          <w:lang w:val="en-US"/>
+        </w:rPr>
+      </w:pPr>
+      <w:r>
+        <w:rPr>
+          <w:rFonts w:ascii="Consolas" w:hAnsi="Consolas" w:cs="Consolas"/>
+          <w:color w:val="000000"/>
+          <w:sz w:val="19"/>
+          <w:szCs w:val="19"/>
+          <w:lang w:val="en-US"/>
+        </w:rPr>
+        <w:t>17.5.2019</w:t>
+      </w:r>
+    </w:p>
+    <w:p>
+      <w:pPr>
+        <w:rPr>
+          <w:rFonts w:ascii="Consolas" w:hAnsi="Consolas" w:cs="Consolas"/>
+          <w:color w:val="000000"/>
+          <w:sz w:val="19"/>
+          <w:szCs w:val="19"/>
+          <w:lang w:val="en-US"/>
+        </w:rPr>
+      </w:pPr>
+      <w:r>
+        <w:rPr>
+          <w:rFonts w:ascii="Consolas" w:hAnsi="Consolas" w:cs="Consolas"/>
+          <w:color w:val="000000"/>
+          <w:sz w:val="19"/>
+          <w:szCs w:val="19"/>
+          <w:lang w:val="en-US"/>
+        </w:rPr>
+        <w:t>A lot of motivati</w:t>
+      </w:r>
+      <w:r>
+        <w:rPr>
+          <w:rFonts w:ascii="Consolas" w:hAnsi="Consolas" w:cs="Consolas"/>
+          <w:color w:val="000000"/>
+          <w:sz w:val="19"/>
+          <w:szCs w:val="19"/>
+          <w:lang w:val="en-US"/>
+        </w:rPr>
+        <w:t>o</w:t>
+      </w:r>
+      <w:r>
+        <w:rPr>
+          <w:rFonts w:ascii="Consolas" w:hAnsi="Consolas" w:cs="Consolas"/>
+          <w:color w:val="000000"/>
+          <w:sz w:val="19"/>
+          <w:szCs w:val="19"/>
+          <w:lang w:val="en-US"/>
+        </w:rPr>
+        <w:t>n w</w:t>
+      </w:r>
+      <w:r>
+        <w:rPr>
+          <w:rFonts w:ascii="Consolas" w:hAnsi="Consolas" w:cs="Consolas"/>
+          <w:color w:val="000000"/>
+          <w:sz w:val="19"/>
+          <w:szCs w:val="19"/>
+          <w:lang w:val="en-US"/>
+        </w:rPr>
+        <w:t xml:space="preserve">ith the fantastic result above </w:t>
+      </w:r>
+      <w:r>
+        <w:rPr>
+          <mc:AlternateContent>
+            <mc:Choice Requires="w16se">
+              <w:rFonts w:ascii="Consolas" w:hAnsi="Consolas" w:cs="Consolas"/>
+            </mc:Choice>
+            <mc:Fallback>
+              <w:rFonts w:ascii="Segoe UI Emoji" w:eastAsia="Segoe UI Emoji" w:hAnsi="Segoe UI Emoji" w:cs="Segoe UI Emoji"/>
+            </mc:Fallback>
+          </mc:AlternateContent>
+          <w:color w:val="000000"/>
+          <w:sz w:val="19"/>
+          <w:szCs w:val="19"/>
+          <w:lang w:val="en-US"/>
+        </w:rPr>
+        <mc:AlternateContent>
+          <mc:Choice Requires="w16se">
+            <w16se:symEx w16se:font="Segoe UI Emoji" w16se:char="1F60A"/>
+          </mc:Choice>
+          <mc:Fallback>
+            <w:t>😊</w:t>
+          </mc:Fallback>
+        </mc:AlternateContent>
+      </w:r>
+    </w:p>
+    <w:p>
+      <w:pPr>
+        <w:rPr>
+          <w:rFonts w:ascii="Consolas" w:hAnsi="Consolas" w:cs="Consolas"/>
+          <w:color w:val="000000"/>
+          <w:sz w:val="19"/>
+          <w:szCs w:val="19"/>
+          <w:lang w:val="en-US"/>
+        </w:rPr>
+      </w:pPr>
+      <w:r>
+        <w:rPr>
+          <w:rFonts w:ascii="Consolas" w:hAnsi="Consolas" w:cs="Consolas"/>
+          <w:color w:val="000000"/>
+          <w:sz w:val="19"/>
+          <w:szCs w:val="19"/>
+          <w:lang w:val="en-US"/>
         </w:rPr>
         <w:lastRenderedPageBreak/>
+        <w:t>I added "</w:t>
+      </w:r>
+      <w:proofErr w:type="spellStart"/>
+      <w:r>
+        <w:rPr>
+          <w:rFonts w:ascii="Consolas" w:hAnsi="Consolas" w:cs="Consolas"/>
+          <w:color w:val="000000"/>
+          <w:sz w:val="19"/>
+          <w:szCs w:val="19"/>
+          <w:lang w:val="en-US"/>
+        </w:rPr>
+        <w:t>ungroundedcontact</w:t>
+      </w:r>
+      <w:proofErr w:type="spellEnd"/>
+      <w:r>
+        <w:rPr>
+          <w:rFonts w:ascii="Consolas" w:hAnsi="Consolas" w:cs="Consolas"/>
+          <w:color w:val="000000"/>
+          <w:sz w:val="19"/>
+          <w:szCs w:val="19"/>
+          <w:lang w:val="en-US"/>
+        </w:rPr>
+        <w:t>" and "</w:t>
+      </w:r>
+      <w:proofErr w:type="spellStart"/>
+      <w:r>
+        <w:rPr>
+          <w:rFonts w:ascii="Consolas" w:hAnsi="Consolas" w:cs="Consolas"/>
+          <w:color w:val="000000"/>
+          <w:sz w:val="19"/>
+          <w:szCs w:val="19"/>
+          <w:lang w:val="en-US"/>
+        </w:rPr>
+        <w:t>endangeredbridge</w:t>
+      </w:r>
+      <w:proofErr w:type="spellEnd"/>
+      <w:r>
+        <w:rPr>
+          <w:rFonts w:ascii="Consolas" w:hAnsi="Consolas" w:cs="Consolas"/>
+          <w:color w:val="000000"/>
+          <w:sz w:val="19"/>
+          <w:szCs w:val="19"/>
+          <w:lang w:val="en-US"/>
+        </w:rPr>
+        <w:t xml:space="preserve">" to evaluation (new eval terms) and ran the optimizer </w:t>
+      </w:r>
+      <w:r>
+        <w:rPr>
+          <w:rFonts w:ascii="Consolas" w:hAnsi="Consolas" w:cs="Consolas"/>
+          <w:color w:val="000000"/>
+          <w:sz w:val="19"/>
+          <w:szCs w:val="19"/>
+          <w:lang w:val="en-US"/>
+        </w:rPr>
+        <w:t xml:space="preserve">on 64params </w:t>
+      </w:r>
+      <w:r>
+        <w:rPr>
+          <w:rFonts w:ascii="Consolas" w:hAnsi="Consolas" w:cs="Consolas"/>
+          <w:color w:val="000000"/>
+          <w:sz w:val="19"/>
+          <w:szCs w:val="19"/>
+          <w:lang w:val="en-US"/>
+        </w:rPr>
+        <w:t xml:space="preserve">and got: </w:t>
+      </w:r>
+    </w:p>
+    <w:p>
+      <w:pPr>
+        <w:rPr>
+          <w:rFonts w:ascii="Consolas" w:hAnsi="Consolas" w:cs="Consolas"/>
+          <w:color w:val="000000"/>
+          <w:sz w:val="19"/>
+          <w:szCs w:val="19"/>
+          <w:lang w:val="en-US"/>
+        </w:rPr>
+      </w:pPr>
+      <w:r>
+        <w:rPr>
+          <w:noProof/>
+        </w:rPr>
         <w:drawing>
-          <wp:inline distT="0" distB="0" distL="0" distR="0" wp14:anchorId="208E9108" wp14:editId="3AF01288">
-            <wp:extent cx="3218786" cy="3693160"/>
-            <wp:effectExtent l="0" t="0" r="1270" b="2540"/>
-            <wp:docPr id="44" name="Picture 44"/>
+          <wp:inline distT="0" distB="0" distL="0" distR="0" wp14:anchorId="636FC75B" wp14:editId="77DA58A2">
+            <wp:extent cx="2645365" cy="4138246"/>
+            <wp:effectExtent l="0" t="0" r="3175" b="0"/>
+            <wp:docPr id="45" name="Picture 45"/>
             <wp:cNvGraphicFramePr>
               <a:graphicFrameLocks xmlns:a="http://schemas.openxmlformats.org/drawingml/2006/main" noChangeAspect="1"/>
             </wp:cNvGraphicFramePr>
@@ -6317,6 +6515,310 @@
                   <pic:spPr>
                     <a:xfrm>
                       <a:off x="0" y="0"/>
+                      <a:ext cx="2656634" cy="4155874"/>
+                    </a:xfrm>
+                    <a:prstGeom prst="rect">
+                      <a:avLst/>
+                    </a:prstGeom>
+                  </pic:spPr>
+                </pic:pic>
+              </a:graphicData>
+            </a:graphic>
+          </wp:inline>
+        </w:drawing>
+      </w:r>
+      <w:r>
+        <w:rPr>
+          <w:noProof/>
+          <w:lang w:val="en-US"/>
+        </w:rPr>
+        <w:t xml:space="preserve"> </w:t>
+      </w:r>
+      <w:r>
+        <w:rPr>
+          <w:noProof/>
+        </w:rPr>
+        <w:drawing>
+          <wp:inline distT="0" distB="0" distL="0" distR="0" wp14:anchorId="2A2886B7" wp14:editId="2DBD7F78">
+            <wp:extent cx="2640160" cy="4130105"/>
+            <wp:effectExtent l="0" t="0" r="8255" b="3810"/>
+            <wp:docPr id="47" name="Picture 47"/>
+            <wp:cNvGraphicFramePr>
+              <a:graphicFrameLocks xmlns:a="http://schemas.openxmlformats.org/drawingml/2006/main" noChangeAspect="1"/>
+            </wp:cNvGraphicFramePr>
+            <a:graphic xmlns:a="http://schemas.openxmlformats.org/drawingml/2006/main">
+              <a:graphicData uri="http://schemas.openxmlformats.org/drawingml/2006/picture">
+                <pic:pic xmlns:pic="http://schemas.openxmlformats.org/drawingml/2006/picture">
+                  <pic:nvPicPr>
+                    <pic:cNvPr id="1" name=""/>
+                    <pic:cNvPicPr/>
+                  </pic:nvPicPr>
+                  <pic:blipFill>
+                    <a:blip r:embed="rId40"/>
+                    <a:stretch>
+                      <a:fillRect/>
+                    </a:stretch>
+                  </pic:blipFill>
+                  <pic:spPr>
+                    <a:xfrm>
+                      <a:off x="0" y="0"/>
+                      <a:ext cx="2668908" cy="4175077"/>
+                    </a:xfrm>
+                    <a:prstGeom prst="rect">
+                      <a:avLst/>
+                    </a:prstGeom>
+                  </pic:spPr>
+                </pic:pic>
+              </a:graphicData>
+            </a:graphic>
+          </wp:inline>
+        </w:drawing>
+      </w:r>
+    </w:p>
+    <w:p>
+      <w:pPr>
+        <w:rPr>
+          <w:rFonts w:ascii="Consolas" w:hAnsi="Consolas" w:cs="Consolas"/>
+          <w:color w:val="000000"/>
+          <w:sz w:val="19"/>
+          <w:szCs w:val="19"/>
+          <w:lang w:val="en-US"/>
+        </w:rPr>
+      </w:pPr>
+    </w:p>
+    <w:p>
+      <w:pPr>
+        <w:rPr>
+          <w:rFonts w:ascii="Consolas" w:hAnsi="Consolas" w:cs="Consolas"/>
+          <w:color w:val="000000"/>
+          <w:sz w:val="19"/>
+          <w:szCs w:val="19"/>
+          <w:lang w:val="en-US"/>
+        </w:rPr>
+      </w:pPr>
+    </w:p>
+    <w:p>
+      <w:pPr>
+        <w:rPr>
+          <w:rFonts w:ascii="Consolas" w:hAnsi="Consolas" w:cs="Consolas"/>
+          <w:color w:val="000000"/>
+          <w:sz w:val="19"/>
+          <w:szCs w:val="19"/>
+          <w:lang w:val="en-US"/>
+        </w:rPr>
+      </w:pPr>
+      <w:r>
+        <w:rPr>
+          <w:rFonts w:ascii="Consolas" w:hAnsi="Consolas" w:cs="Consolas"/>
+          <w:color w:val="000000"/>
+          <w:sz w:val="19"/>
+          <w:szCs w:val="19"/>
+          <w:lang w:val="en-US"/>
+        </w:rPr>
+        <w:t>Maybe add 9/14 as bad structure against 2/5? Or add "more than two men" in 10,9,13,14, 17, 21 against 2/5 as bad structure?</w:t>
+      </w:r>
+    </w:p>
+    <w:p>
+      <w:pPr>
+        <w:rPr>
+          <w:rFonts w:ascii="Consolas" w:hAnsi="Consolas" w:cs="Consolas"/>
+          <w:color w:val="000000"/>
+          <w:sz w:val="19"/>
+          <w:szCs w:val="19"/>
+          <w:lang w:val="en-US"/>
+        </w:rPr>
+      </w:pPr>
+    </w:p>
+    <w:p>
+      <w:pPr>
+        <w:rPr>
+          <w:rFonts w:ascii="Consolas" w:hAnsi="Consolas" w:cs="Consolas"/>
+          <w:color w:val="000000"/>
+          <w:sz w:val="19"/>
+          <w:szCs w:val="19"/>
+          <w:lang w:val="en-US"/>
+        </w:rPr>
+      </w:pPr>
+    </w:p>
+    <w:p>
+      <w:pPr>
+        <w:rPr>
+          <w:rFonts w:ascii="Consolas" w:hAnsi="Consolas" w:cs="Consolas"/>
+          <w:color w:val="000000"/>
+          <w:sz w:val="19"/>
+          <w:szCs w:val="19"/>
+          <w:lang w:val="en-US"/>
+        </w:rPr>
+      </w:pPr>
+    </w:p>
+    <w:p>
+      <w:pPr>
+        <w:rPr>
+          <w:lang w:val="en-US"/>
+        </w:rPr>
+      </w:pPr>
+    </w:p>
+    <w:p>
+      <w:pPr>
+        <w:pStyle w:val="Heading2"/>
+        <w:rPr>
+          <w:lang w:val="en-US"/>
+        </w:rPr>
+      </w:pPr>
+      <w:r>
+        <w:rPr>
+          <w:lang w:val="en-US"/>
+        </w:rPr>
+        <w:t>Future things to check</w:t>
+      </w:r>
+    </w:p>
+    <w:p>
+      <w:pPr>
+        <w:rPr>
+          <w:lang w:val="en-US"/>
+        </w:rPr>
+      </w:pPr>
+      <w:r>
+        <w:rPr>
+          <w:lang w:val="en-US"/>
+        </w:rPr>
+        <w:t xml:space="preserve">Logfile </w:t>
+      </w:r>
+      <w:proofErr w:type="gramStart"/>
+      <w:r>
+        <w:rPr>
+          <w:lang w:val="en-US"/>
+        </w:rPr>
+        <w:t>has to</w:t>
+      </w:r>
+      <w:proofErr w:type="gramEnd"/>
+      <w:r>
+        <w:rPr>
+          <w:lang w:val="en-US"/>
+        </w:rPr>
+        <w:t xml:space="preserve"> be written again, but with less </w:t>
+      </w:r>
+      <w:proofErr w:type="spellStart"/>
+      <w:r>
+        <w:rPr>
+          <w:lang w:val="en-US"/>
+        </w:rPr>
+        <w:t>fopen</w:t>
+      </w:r>
+      <w:proofErr w:type="spellEnd"/>
+      <w:r>
+        <w:rPr>
+          <w:lang w:val="en-US"/>
+        </w:rPr>
+        <w:t>/</w:t>
+      </w:r>
+      <w:proofErr w:type="spellStart"/>
+      <w:r>
+        <w:rPr>
+          <w:lang w:val="en-US"/>
+        </w:rPr>
+        <w:t>fclose</w:t>
+      </w:r>
+      <w:proofErr w:type="spellEnd"/>
+      <w:r>
+        <w:rPr>
+          <w:lang w:val="en-US"/>
+        </w:rPr>
+        <w:t>/</w:t>
+      </w:r>
+      <w:proofErr w:type="spellStart"/>
+      <w:r>
+        <w:rPr>
+          <w:lang w:val="en-US"/>
+        </w:rPr>
+        <w:t>fflush</w:t>
+      </w:r>
+      <w:proofErr w:type="spellEnd"/>
+      <w:r>
+        <w:rPr>
+          <w:lang w:val="en-US"/>
+        </w:rPr>
+        <w:t>!</w:t>
+      </w:r>
+    </w:p>
+    <w:p>
+      <w:pPr>
+        <w:rPr>
+          <w:lang w:val="en-US"/>
+        </w:rPr>
+      </w:pPr>
+      <w:r>
+        <w:rPr>
+          <w:lang w:val="en-US"/>
+        </w:rPr>
+        <w:t xml:space="preserve">Possibly it's not that the logfile was being opened and closed, but that I don't clear the </w:t>
+      </w:r>
+      <w:proofErr w:type="spellStart"/>
+      <w:r>
+        <w:rPr>
+          <w:lang w:val="en-US"/>
+        </w:rPr>
+        <w:t>hashtable</w:t>
+      </w:r>
+      <w:proofErr w:type="spellEnd"/>
+      <w:r>
+        <w:rPr>
+          <w:lang w:val="en-US"/>
+        </w:rPr>
+        <w:t xml:space="preserve"> any more!</w:t>
+      </w:r>
+      <w:bookmarkStart w:id="0" w:name="_GoBack"/>
+      <w:bookmarkEnd w:id="0"/>
+    </w:p>
+    <w:p>
+      <w:pPr>
+        <w:pStyle w:val="Heading3"/>
+        <w:rPr>
+          <w:lang w:val="en-US"/>
+        </w:rPr>
+      </w:pPr>
+      <w:r>
+        <w:rPr>
+          <w:lang w:val="en-US"/>
+        </w:rPr>
+        <w:lastRenderedPageBreak/>
+        <w:t xml:space="preserve">Repetition issue: </w:t>
+      </w:r>
+    </w:p>
+    <w:p>
+      <w:pPr>
+        <w:rPr>
+          <w:lang w:val="en-US"/>
+        </w:rPr>
+      </w:pPr>
+      <w:r>
+        <w:rPr>
+          <w:noProof/>
+        </w:rPr>
+        <w:drawing>
+          <wp:inline distT="0" distB="0" distL="0" distR="0" wp14:anchorId="208E9108" wp14:editId="3AF01288">
+            <wp:extent cx="3218786" cy="3693160"/>
+            <wp:effectExtent l="0" t="0" r="1270" b="2540"/>
+            <wp:docPr id="44" name="Picture 44"/>
+            <wp:cNvGraphicFramePr>
+              <a:graphicFrameLocks xmlns:a="http://schemas.openxmlformats.org/drawingml/2006/main" noChangeAspect="1"/>
+            </wp:cNvGraphicFramePr>
+            <a:graphic xmlns:a="http://schemas.openxmlformats.org/drawingml/2006/main">
+              <a:graphicData uri="http://schemas.openxmlformats.org/drawingml/2006/picture">
+                <pic:pic xmlns:pic="http://schemas.openxmlformats.org/drawingml/2006/picture">
+                  <pic:nvPicPr>
+                    <pic:cNvPr id="1" name=""/>
+                    <pic:cNvPicPr/>
+                  </pic:nvPicPr>
+                  <pic:blipFill>
+                    <a:blip r:embed="rId41"/>
+                    <a:stretch>
+                      <a:fillRect/>
+                    </a:stretch>
+                  </pic:blipFill>
+                  <pic:spPr>
+                    <a:xfrm>
+                      <a:off x="0" y="0"/>
                       <a:ext cx="3227006" cy="3702591"/>
                     </a:xfrm>
                     <a:prstGeom prst="rect">
@@ -6356,6 +6858,148 @@
         </w:rPr>
         <w:t xml:space="preserve"> repeated moves!? Check this game and move rep code?</w:t>
       </w:r>
+    </w:p>
+    <w:p>
+      <w:pPr>
+        <w:rPr>
+          <w:lang w:val="en-US"/>
+        </w:rPr>
+      </w:pPr>
+    </w:p>
+    <w:p>
+      <w:pPr>
+        <w:pStyle w:val="Heading3"/>
+        <w:rPr>
+          <w:lang w:val="en-US"/>
+        </w:rPr>
+      </w:pPr>
+      <w:r>
+        <w:rPr>
+          <w:lang w:val="en-US"/>
+        </w:rPr>
+        <w:t>Search ideas</w:t>
+      </w:r>
+    </w:p>
+    <w:p>
+      <w:pPr>
+        <w:rPr>
+          <w:lang w:val="en-US"/>
+        </w:rPr>
+      </w:pPr>
+      <w:r>
+        <w:rPr>
+          <w:lang w:val="en-US"/>
+        </w:rPr>
+        <w:t>If Eval is better, then my feeling is it starts to get dominated by the 5-6% positions where it's way off because it misses a pitch or squeeze =&gt; I should revisit QS!</w:t>
+      </w:r>
+    </w:p>
+    <w:p>
+      <w:pPr>
+        <w:rPr>
+          <w:lang w:val="en-US"/>
+        </w:rPr>
+      </w:pPr>
+      <w:r>
+        <w:rPr>
+          <w:lang w:val="en-US"/>
+        </w:rPr>
+        <w:t>If Eval is better, then pruning could be more aggressive!</w:t>
+      </w:r>
+    </w:p>
+    <w:p>
+      <w:pPr>
+        <w:rPr>
+          <w:lang w:val="en-US"/>
+        </w:rPr>
+      </w:pPr>
+      <w:r>
+        <w:rPr>
+          <w:lang w:val="en-US"/>
+        </w:rPr>
+        <w:t xml:space="preserve">Watch out, </w:t>
+      </w:r>
+      <w:proofErr w:type="spellStart"/>
+      <w:r>
+        <w:rPr>
+          <w:lang w:val="en-US"/>
+        </w:rPr>
+        <w:t>switches.h</w:t>
+      </w:r>
+      <w:proofErr w:type="spellEnd"/>
+      <w:r>
+        <w:rPr>
+          <w:lang w:val="en-US"/>
+        </w:rPr>
+        <w:t xml:space="preserve"> is not the same for Cake and </w:t>
+      </w:r>
+      <w:proofErr w:type="spellStart"/>
+      <w:r>
+        <w:rPr>
+          <w:lang w:val="en-US"/>
+        </w:rPr>
+        <w:t>OptimizeCakeEvaluation</w:t>
+      </w:r>
+      <w:proofErr w:type="spellEnd"/>
+      <w:r>
+        <w:rPr>
+          <w:lang w:val="en-US"/>
+        </w:rPr>
+        <w:t>!</w:t>
+      </w:r>
+    </w:p>
+    <w:p>
+      <w:pPr>
+        <w:rPr>
+          <w:lang w:val="en-US"/>
+        </w:rPr>
+      </w:pPr>
+    </w:p>
+    <w:p>
+      <w:pPr>
+        <w:pStyle w:val="Heading3"/>
+        <w:rPr>
+          <w:lang w:val="en-US"/>
+        </w:rPr>
+      </w:pPr>
+      <w:r>
+        <w:rPr>
+          <w:lang w:val="en-US"/>
+        </w:rPr>
+        <w:t>Tuning idea</w:t>
+      </w:r>
+    </w:p>
+    <w:p>
+      <w:pPr>
+        <w:rPr>
+          <w:lang w:val="en-US"/>
+        </w:rPr>
+      </w:pPr>
+      <w:r>
+        <w:rPr>
+          <w:lang w:val="en-US"/>
+        </w:rPr>
+        <w:t>I get the idea that most games are won or lost early in the game, and therefore, I would need to tune mainly to say the 1</w:t>
+      </w:r>
+      <w:r>
+        <w:rPr>
+          <w:vertAlign w:val="superscript"/>
+          <w:lang w:val="en-US"/>
+        </w:rPr>
+        <w:t>st</w:t>
+      </w:r>
+      <w:r>
+        <w:rPr>
+          <w:lang w:val="en-US"/>
+        </w:rPr>
+        <w:t xml:space="preserve"> 40 ply and throw away the rest!?</w:t>
+      </w:r>
+    </w:p>
+    <w:p>
+      <w:pPr>
+        <w:rPr>
+          <w:lang w:val="en-US"/>
+        </w:rPr>
+      </w:pPr>
     </w:p>
     <w:sectPr>
       <w:pgSz w:w="11906" w:h="16838"/>
@@ -7188,6 +7832,50 @@
     <w:name w:val="Normal"/>
     <w:qFormat/>
   </w:style>
+  <w:style w:type="paragraph" w:styleId="Heading2">
+    <w:name w:val="heading 2"/>
+    <w:basedOn w:val="Normal"/>
+    <w:next w:val="Normal"/>
+    <w:link w:val="Heading2Char"/>
+    <w:uiPriority w:val="9"/>
+    <w:unhideWhenUsed/>
+    <w:qFormat/>
+    <w:rsid w:val="009C7BBF"/>
+    <w:pPr>
+      <w:keepNext/>
+      <w:keepLines/>
+      <w:spacing w:before="40" w:after="0"/>
+      <w:outlineLvl w:val="1"/>
+    </w:pPr>
+    <w:rPr>
+      <w:rFonts w:asciiTheme="majorHAnsi" w:eastAsiaTheme="majorEastAsia" w:hAnsiTheme="majorHAnsi" w:cstheme="majorBidi"/>
+      <w:color w:val="2F5496" w:themeColor="accent1" w:themeShade="BF"/>
+      <w:sz w:val="26"/>
+      <w:szCs w:val="26"/>
+    </w:rPr>
+  </w:style>
+  <w:style w:type="paragraph" w:styleId="Heading3">
+    <w:name w:val="heading 3"/>
+    <w:basedOn w:val="Normal"/>
+    <w:next w:val="Normal"/>
+    <w:link w:val="Heading3Char"/>
+    <w:uiPriority w:val="9"/>
+    <w:unhideWhenUsed/>
+    <w:qFormat/>
+    <w:rsid w:val="009C7BBF"/>
+    <w:pPr>
+      <w:keepNext/>
+      <w:keepLines/>
+      <w:spacing w:before="40" w:after="0"/>
+      <w:outlineLvl w:val="2"/>
+    </w:pPr>
+    <w:rPr>
+      <w:rFonts w:asciiTheme="majorHAnsi" w:eastAsiaTheme="majorEastAsia" w:hAnsiTheme="majorHAnsi" w:cstheme="majorBidi"/>
+      <w:color w:val="1F3763" w:themeColor="accent1" w:themeShade="7F"/>
+      <w:sz w:val="24"/>
+      <w:szCs w:val="24"/>
+    </w:rPr>
+  </w:style>
   <w:style w:type="character" w:default="1" w:styleId="DefaultParagraphFont">
     <w:name w:val="Default Paragraph Font"/>
     <w:uiPriority w:val="1"/>
@@ -7254,6 +7942,32 @@
       <w:rFonts w:ascii="Segoe UI" w:hAnsi="Segoe UI" w:cs="Segoe UI"/>
       <w:sz w:val="18"/>
       <w:szCs w:val="18"/>
+    </w:rPr>
+  </w:style>
+  <w:style w:type="character" w:customStyle="1" w:styleId="Heading2Char">
+    <w:name w:val="Heading 2 Char"/>
+    <w:basedOn w:val="DefaultParagraphFont"/>
+    <w:link w:val="Heading2"/>
+    <w:uiPriority w:val="9"/>
+    <w:rsid w:val="009C7BBF"/>
+    <w:rPr>
+      <w:rFonts w:asciiTheme="majorHAnsi" w:eastAsiaTheme="majorEastAsia" w:hAnsiTheme="majorHAnsi" w:cstheme="majorBidi"/>
+      <w:color w:val="2F5496" w:themeColor="accent1" w:themeShade="BF"/>
+      <w:sz w:val="26"/>
+      <w:szCs w:val="26"/>
+    </w:rPr>
+  </w:style>
+  <w:style w:type="character" w:customStyle="1" w:styleId="Heading3Char">
+    <w:name w:val="Heading 3 Char"/>
+    <w:basedOn w:val="DefaultParagraphFont"/>
+    <w:link w:val="Heading3"/>
+    <w:uiPriority w:val="9"/>
+    <w:rsid w:val="009C7BBF"/>
+    <w:rPr>
+      <w:rFonts w:asciiTheme="majorHAnsi" w:eastAsiaTheme="majorEastAsia" w:hAnsiTheme="majorHAnsi" w:cstheme="majorBidi"/>
+      <w:color w:val="1F3763" w:themeColor="accent1" w:themeShade="7F"/>
+      <w:sz w:val="24"/>
+      <w:szCs w:val="24"/>
     </w:rPr>
   </w:style>
 </w:styles>

</xml_diff>

<commit_message>
3162k 94p optimized version
</commit_message>
<xml_diff>
--- a/2019_04_22_EvaluationTuning.docx
+++ b/2019_04_22_EvaluationTuning.docx
@@ -6034,7 +6034,18 @@
           <w:szCs w:val="19"/>
           <w:lang w:val="en-US"/>
         </w:rPr>
-        <w:t>*  clearly</w:t>
+        <w:t xml:space="preserve">*  </w:t>
+      </w:r>
+      <w:r>
+        <w:rPr>
+          <w:rFonts w:ascii="Consolas" w:hAnsi="Consolas" w:cs="Consolas"/>
+          <w:color w:val="000000"/>
+          <w:sz w:val="19"/>
+          <w:szCs w:val="19"/>
+          <w:highlight w:val="yellow"/>
+          <w:lang w:val="en-US"/>
+        </w:rPr>
+        <w:t>clearly</w:t>
       </w:r>
       <w:proofErr w:type="gramEnd"/>
       <w:r>
@@ -6639,136 +6650,427 @@
           <w:lang w:val="en-US"/>
         </w:rPr>
       </w:pPr>
-    </w:p>
-    <w:p>
-      <w:pPr>
-        <w:rPr>
-          <w:rFonts w:ascii="Consolas" w:hAnsi="Consolas" w:cs="Consolas"/>
-          <w:color w:val="000000"/>
-          <w:sz w:val="19"/>
-          <w:szCs w:val="19"/>
-          <w:lang w:val="en-US"/>
-        </w:rPr>
-      </w:pPr>
-    </w:p>
-    <w:p>
-      <w:pPr>
-        <w:rPr>
-          <w:lang w:val="en-US"/>
-        </w:rPr>
-      </w:pPr>
-    </w:p>
-    <w:p>
-      <w:pPr>
-        <w:pStyle w:val="Heading2"/>
-        <w:rPr>
-          <w:lang w:val="en-US"/>
-        </w:rPr>
-      </w:pPr>
-      <w:r>
-        <w:rPr>
-          <w:lang w:val="en-US"/>
-        </w:rPr>
-        <w:t>Future things to check</w:t>
-      </w:r>
-    </w:p>
-    <w:p>
-      <w:pPr>
-        <w:rPr>
-          <w:lang w:val="en-US"/>
-        </w:rPr>
-      </w:pPr>
-      <w:r>
-        <w:rPr>
-          <w:lang w:val="en-US"/>
-        </w:rPr>
-        <w:t xml:space="preserve">Logfile </w:t>
+      <w:r>
+        <w:rPr>
+          <w:rFonts w:ascii="Consolas" w:hAnsi="Consolas" w:cs="Consolas"/>
+          <w:color w:val="000000"/>
+          <w:sz w:val="19"/>
+          <w:szCs w:val="19"/>
+          <w:lang w:val="en-US"/>
+        </w:rPr>
+        <w:t>17.5.2019</w:t>
+      </w:r>
+    </w:p>
+    <w:p>
+      <w:pPr>
+        <w:rPr>
+          <w:rFonts w:ascii="Consolas" w:hAnsi="Consolas" w:cs="Consolas"/>
+          <w:color w:val="000000"/>
+          <w:sz w:val="19"/>
+          <w:szCs w:val="19"/>
+          <w:lang w:val="en-US"/>
+        </w:rPr>
+      </w:pPr>
+      <w:r>
+        <w:rPr>
+          <w:rFonts w:ascii="Consolas" w:hAnsi="Consolas" w:cs="Consolas"/>
+          <w:color w:val="000000"/>
+          <w:sz w:val="19"/>
+          <w:szCs w:val="19"/>
+          <w:lang w:val="en-US"/>
+        </w:rPr>
+        <w:t xml:space="preserve">I add </w:t>
+      </w:r>
+      <w:proofErr w:type="spellStart"/>
+      <w:r>
+        <w:rPr>
+          <w:rFonts w:ascii="Consolas" w:hAnsi="Consolas" w:cs="Consolas"/>
+          <w:color w:val="000000"/>
+          <w:sz w:val="19"/>
+          <w:szCs w:val="19"/>
+          <w:lang w:val="en-US"/>
+        </w:rPr>
+        <w:t>br</w:t>
+      </w:r>
+      <w:proofErr w:type="spellEnd"/>
+      <w:r>
+        <w:rPr>
+          <w:rFonts w:ascii="Consolas" w:hAnsi="Consolas" w:cs="Consolas"/>
+          <w:color w:val="000000"/>
+          <w:sz w:val="19"/>
+          <w:szCs w:val="19"/>
+          <w:lang w:val="en-US"/>
+        </w:rPr>
+        <w:t xml:space="preserve"> array to </w:t>
       </w:r>
       <w:proofErr w:type="gramStart"/>
       <w:r>
         <w:rPr>
-          <w:lang w:val="en-US"/>
-        </w:rPr>
-        <w:t>has to</w:t>
+          <w:rFonts w:ascii="Consolas" w:hAnsi="Consolas" w:cs="Consolas"/>
+          <w:color w:val="000000"/>
+          <w:sz w:val="19"/>
+          <w:szCs w:val="19"/>
+          <w:lang w:val="en-US"/>
+        </w:rPr>
+        <w:t>optimizer, but</w:t>
       </w:r>
       <w:proofErr w:type="gramEnd"/>
       <w:r>
         <w:rPr>
-          <w:lang w:val="en-US"/>
-        </w:rPr>
-        <w:t xml:space="preserve"> be written again, but with less </w:t>
+          <w:rFonts w:ascii="Consolas" w:hAnsi="Consolas" w:cs="Consolas"/>
+          <w:color w:val="000000"/>
+          <w:sz w:val="19"/>
+          <w:szCs w:val="19"/>
+          <w:lang w:val="en-US"/>
+        </w:rPr>
+        <w:t xml:space="preserve"> remove </w:t>
       </w:r>
       <w:proofErr w:type="spellStart"/>
       <w:r>
         <w:rPr>
-          <w:lang w:val="en-US"/>
-        </w:rPr>
-        <w:t>fopen</w:t>
+          <w:rFonts w:ascii="Consolas" w:hAnsi="Consolas" w:cs="Consolas"/>
+          <w:color w:val="000000"/>
+          <w:sz w:val="19"/>
+          <w:szCs w:val="19"/>
+          <w:lang w:val="en-US"/>
+        </w:rPr>
+        <w:t>ungroundedcontact</w:t>
       </w:r>
       <w:proofErr w:type="spellEnd"/>
       <w:r>
         <w:rPr>
-          <w:lang w:val="en-US"/>
-        </w:rPr>
-        <w:t>/</w:t>
+          <w:rFonts w:ascii="Consolas" w:hAnsi="Consolas" w:cs="Consolas"/>
+          <w:color w:val="000000"/>
+          <w:sz w:val="19"/>
+          <w:szCs w:val="19"/>
+          <w:lang w:val="en-US"/>
+        </w:rPr>
+        <w:t xml:space="preserve"> and </w:t>
       </w:r>
       <w:proofErr w:type="spellStart"/>
       <w:r>
         <w:rPr>
-          <w:lang w:val="en-US"/>
-        </w:rPr>
-        <w:t>fclose</w:t>
+          <w:rFonts w:ascii="Consolas" w:hAnsi="Consolas" w:cs="Consolas"/>
+          <w:color w:val="000000"/>
+          <w:sz w:val="19"/>
+          <w:szCs w:val="19"/>
+          <w:lang w:val="en-US"/>
+        </w:rPr>
+        <w:t>endangeredbridge</w:t>
       </w:r>
       <w:proofErr w:type="spellEnd"/>
       <w:r>
         <w:rPr>
-          <w:lang w:val="en-US"/>
-        </w:rPr>
-        <w:t>/</w:t>
-      </w:r>
+          <w:rFonts w:ascii="Consolas" w:hAnsi="Consolas" w:cs="Consolas"/>
+          <w:color w:val="000000"/>
+          <w:sz w:val="19"/>
+          <w:szCs w:val="19"/>
+          <w:lang w:val="en-US"/>
+        </w:rPr>
+        <w:t xml:space="preserve"> after match result was worse with them. </w:t>
+      </w:r>
+    </w:p>
+    <w:p>
+      <w:pPr>
+        <w:rPr>
+          <w:rFonts w:ascii="Consolas" w:hAnsi="Consolas" w:cs="Consolas"/>
+          <w:color w:val="000000"/>
+          <w:sz w:val="19"/>
+          <w:szCs w:val="19"/>
+          <w:lang w:val="en-US"/>
+        </w:rPr>
+      </w:pPr>
+      <w:r>
+        <w:rPr>
+          <w:noProof/>
+        </w:rPr>
+        <w:lastRenderedPageBreak/>
+        <w:drawing>
+          <wp:inline distT="0" distB="0" distL="0" distR="0" wp14:anchorId="4B5062C7" wp14:editId="0962E651">
+            <wp:extent cx="2329166" cy="3838596"/>
+            <wp:effectExtent l="0" t="0" r="0" b="0"/>
+            <wp:docPr id="50" name="Picture 50"/>
+            <wp:cNvGraphicFramePr>
+              <a:graphicFrameLocks xmlns:a="http://schemas.openxmlformats.org/drawingml/2006/main" noChangeAspect="1"/>
+            </wp:cNvGraphicFramePr>
+            <a:graphic xmlns:a="http://schemas.openxmlformats.org/drawingml/2006/main">
+              <a:graphicData uri="http://schemas.openxmlformats.org/drawingml/2006/picture">
+                <pic:pic xmlns:pic="http://schemas.openxmlformats.org/drawingml/2006/picture">
+                  <pic:nvPicPr>
+                    <pic:cNvPr id="1" name=""/>
+                    <pic:cNvPicPr/>
+                  </pic:nvPicPr>
+                  <pic:blipFill>
+                    <a:blip r:embed="rId41"/>
+                    <a:stretch>
+                      <a:fillRect/>
+                    </a:stretch>
+                  </pic:blipFill>
+                  <pic:spPr>
+                    <a:xfrm>
+                      <a:off x="0" y="0"/>
+                      <a:ext cx="2353844" cy="3879266"/>
+                    </a:xfrm>
+                    <a:prstGeom prst="rect">
+                      <a:avLst/>
+                    </a:prstGeom>
+                  </pic:spPr>
+                </pic:pic>
+              </a:graphicData>
+            </a:graphic>
+          </wp:inline>
+        </w:drawing>
+      </w:r>
+      <w:r>
+        <w:rPr>
+          <w:noProof/>
+        </w:rPr>
+        <w:drawing>
+          <wp:inline distT="0" distB="0" distL="0" distR="0" wp14:anchorId="24AAA0E9" wp14:editId="24C667DB">
+            <wp:extent cx="2293943" cy="3780546"/>
+            <wp:effectExtent l="0" t="0" r="0" b="0"/>
+            <wp:docPr id="49" name="Picture 49"/>
+            <wp:cNvGraphicFramePr>
+              <a:graphicFrameLocks xmlns:a="http://schemas.openxmlformats.org/drawingml/2006/main" noChangeAspect="1"/>
+            </wp:cNvGraphicFramePr>
+            <a:graphic xmlns:a="http://schemas.openxmlformats.org/drawingml/2006/main">
+              <a:graphicData uri="http://schemas.openxmlformats.org/drawingml/2006/picture">
+                <pic:pic xmlns:pic="http://schemas.openxmlformats.org/drawingml/2006/picture">
+                  <pic:nvPicPr>
+                    <pic:cNvPr id="1" name=""/>
+                    <pic:cNvPicPr/>
+                  </pic:nvPicPr>
+                  <pic:blipFill>
+                    <a:blip r:embed="rId42"/>
+                    <a:stretch>
+                      <a:fillRect/>
+                    </a:stretch>
+                  </pic:blipFill>
+                  <pic:spPr>
+                    <a:xfrm>
+                      <a:off x="0" y="0"/>
+                      <a:ext cx="2310216" cy="3807365"/>
+                    </a:xfrm>
+                    <a:prstGeom prst="rect">
+                      <a:avLst/>
+                    </a:prstGeom>
+                  </pic:spPr>
+                </pic:pic>
+              </a:graphicData>
+            </a:graphic>
+          </wp:inline>
+        </w:drawing>
+      </w:r>
+    </w:p>
+    <w:p>
+      <w:pPr>
+        <w:rPr>
+          <w:rFonts w:ascii="Consolas" w:hAnsi="Consolas" w:cs="Consolas"/>
+          <w:color w:val="000000"/>
+          <w:sz w:val="19"/>
+          <w:szCs w:val="19"/>
+          <w:lang w:val="en-US"/>
+        </w:rPr>
+      </w:pPr>
       <w:proofErr w:type="spellStart"/>
       <w:r>
         <w:rPr>
-          <w:lang w:val="en-US"/>
-        </w:rPr>
-        <w:t>fflush</w:t>
+          <w:rFonts w:ascii="Consolas" w:hAnsi="Consolas" w:cs="Consolas"/>
+          <w:color w:val="000000"/>
+          <w:sz w:val="19"/>
+          <w:szCs w:val="19"/>
+          <w:lang w:val="en-US"/>
+        </w:rPr>
+        <w:t>Todo</w:t>
       </w:r>
       <w:proofErr w:type="spellEnd"/>
       <w:r>
         <w:rPr>
-          <w:lang w:val="en-US"/>
-        </w:rPr>
-        <w:t>!</w:t>
-      </w:r>
-    </w:p>
-    <w:p>
-      <w:pPr>
-        <w:rPr>
-          <w:lang w:val="en-US"/>
-        </w:rPr>
-      </w:pPr>
-      <w:r>
-        <w:rPr>
-          <w:lang w:val="en-US"/>
-        </w:rPr>
-        <w:t xml:space="preserve">Possibly it's not that the logfile was being opened and closed, but that I don't clear the </w:t>
+          <w:rFonts w:ascii="Consolas" w:hAnsi="Consolas" w:cs="Consolas"/>
+          <w:color w:val="000000"/>
+          <w:sz w:val="19"/>
+          <w:szCs w:val="19"/>
+          <w:lang w:val="en-US"/>
+        </w:rPr>
+        <w:t xml:space="preserve">: parse </w:t>
       </w:r>
       <w:proofErr w:type="spellStart"/>
       <w:r>
         <w:rPr>
-          <w:lang w:val="en-US"/>
-        </w:rPr>
-        <w:t>hashtable</w:t>
+          <w:rFonts w:ascii="Consolas" w:hAnsi="Consolas" w:cs="Consolas"/>
+          <w:color w:val="000000"/>
+          <w:sz w:val="19"/>
+          <w:szCs w:val="19"/>
+          <w:lang w:val="en-US"/>
+        </w:rPr>
+        <w:t>matchprogress</w:t>
       </w:r>
       <w:proofErr w:type="spellEnd"/>
       <w:r>
         <w:rPr>
-          <w:lang w:val="en-US"/>
-        </w:rPr>
-        <w:t xml:space="preserve"> any more!</w:t>
+          <w:rFonts w:ascii="Consolas" w:hAnsi="Consolas" w:cs="Consolas"/>
+          <w:color w:val="000000"/>
+          <w:sz w:val="19"/>
+          <w:szCs w:val="19"/>
+          <w:lang w:val="en-US"/>
+        </w:rPr>
+        <w:t xml:space="preserve"> file and make a score(game) timeline to see if something is strange with match36.</w:t>
       </w:r>
       <w:bookmarkStart w:id="0" w:name="_GoBack"/>
       <w:bookmarkEnd w:id="0"/>
+    </w:p>
+    <w:p>
+      <w:pPr>
+        <w:rPr>
+          <w:rFonts w:ascii="Consolas" w:hAnsi="Consolas" w:cs="Consolas"/>
+          <w:color w:val="000000"/>
+          <w:sz w:val="19"/>
+          <w:szCs w:val="19"/>
+          <w:lang w:val="en-US"/>
+        </w:rPr>
+      </w:pPr>
+    </w:p>
+    <w:p>
+      <w:pPr>
+        <w:rPr>
+          <w:rFonts w:ascii="Consolas" w:hAnsi="Consolas" w:cs="Consolas"/>
+          <w:color w:val="000000"/>
+          <w:sz w:val="19"/>
+          <w:szCs w:val="19"/>
+          <w:lang w:val="en-US"/>
+        </w:rPr>
+      </w:pPr>
+    </w:p>
+    <w:p>
+      <w:pPr>
+        <w:rPr>
+          <w:lang w:val="en-US"/>
+        </w:rPr>
+      </w:pPr>
+    </w:p>
+    <w:p>
+      <w:pPr>
+        <w:pStyle w:val="Heading2"/>
+        <w:rPr>
+          <w:lang w:val="en-US"/>
+        </w:rPr>
+      </w:pPr>
+      <w:r>
+        <w:rPr>
+          <w:lang w:val="en-US"/>
+        </w:rPr>
+        <w:t>Future things to check</w:t>
+      </w:r>
+    </w:p>
+    <w:p>
+      <w:pPr>
+        <w:rPr>
+          <w:lang w:val="en-US"/>
+        </w:rPr>
+      </w:pPr>
+      <w:r>
+        <w:rPr>
+          <w:lang w:val="en-US"/>
+        </w:rPr>
+        <w:t xml:space="preserve">Logfile </w:t>
+      </w:r>
+      <w:proofErr w:type="gramStart"/>
+      <w:r>
+        <w:rPr>
+          <w:lang w:val="en-US"/>
+        </w:rPr>
+        <w:t>has to</w:t>
+      </w:r>
+      <w:proofErr w:type="gramEnd"/>
+      <w:r>
+        <w:rPr>
+          <w:lang w:val="en-US"/>
+        </w:rPr>
+        <w:t xml:space="preserve"> be written again, but with less </w:t>
+      </w:r>
+      <w:proofErr w:type="spellStart"/>
+      <w:r>
+        <w:rPr>
+          <w:lang w:val="en-US"/>
+        </w:rPr>
+        <w:t>fopen</w:t>
+      </w:r>
+      <w:proofErr w:type="spellEnd"/>
+      <w:r>
+        <w:rPr>
+          <w:lang w:val="en-US"/>
+        </w:rPr>
+        <w:t>/</w:t>
+      </w:r>
+      <w:proofErr w:type="spellStart"/>
+      <w:r>
+        <w:rPr>
+          <w:lang w:val="en-US"/>
+        </w:rPr>
+        <w:t>fclose</w:t>
+      </w:r>
+      <w:proofErr w:type="spellEnd"/>
+      <w:r>
+        <w:rPr>
+          <w:lang w:val="en-US"/>
+        </w:rPr>
+        <w:t>/</w:t>
+      </w:r>
+      <w:proofErr w:type="spellStart"/>
+      <w:r>
+        <w:rPr>
+          <w:lang w:val="en-US"/>
+        </w:rPr>
+        <w:t>fflush</w:t>
+      </w:r>
+      <w:proofErr w:type="spellEnd"/>
+      <w:r>
+        <w:rPr>
+          <w:lang w:val="en-US"/>
+        </w:rPr>
+        <w:t>!</w:t>
+      </w:r>
+    </w:p>
+    <w:p>
+      <w:pPr>
+        <w:rPr>
+          <w:lang w:val="en-US"/>
+        </w:rPr>
+      </w:pPr>
+      <w:r>
+        <w:rPr>
+          <w:lang w:val="en-US"/>
+        </w:rPr>
+        <w:t xml:space="preserve">Possibly it's not that the logfile was being opened and closed, but that I don't clear the </w:t>
+      </w:r>
+      <w:proofErr w:type="spellStart"/>
+      <w:r>
+        <w:rPr>
+          <w:lang w:val="en-US"/>
+        </w:rPr>
+        <w:t>hashtable</w:t>
+      </w:r>
+      <w:proofErr w:type="spellEnd"/>
+      <w:r>
+        <w:rPr>
+          <w:lang w:val="en-US"/>
+        </w:rPr>
+        <w:t xml:space="preserve"> </w:t>
+      </w:r>
+      <w:proofErr w:type="spellStart"/>
+      <w:r>
+        <w:rPr>
+          <w:lang w:val="en-US"/>
+        </w:rPr>
+        <w:t>any more</w:t>
+      </w:r>
+      <w:proofErr w:type="spellEnd"/>
+      <w:r>
+        <w:rPr>
+          <w:lang w:val="en-US"/>
+        </w:rPr>
+        <w:t>!</w:t>
+      </w:r>
     </w:p>
     <w:p>
       <w:pPr>
@@ -6811,7 +7113,7 @@
                     <pic:cNvPicPr/>
                   </pic:nvPicPr>
                   <pic:blipFill>
-                    <a:blip r:embed="rId41"/>
+                    <a:blip r:embed="rId43"/>
                     <a:stretch>
                       <a:fillRect/>
                     </a:stretch>

</xml_diff>

<commit_message>
Cake 1.85g 5534k (94p) - slightly better than 3162k (94p)
</commit_message>
<xml_diff>
--- a/2019_04_22_EvaluationTuning.docx
+++ b/2019_04_22_EvaluationTuning.docx
@@ -6916,34 +6916,947 @@
         </w:rPr>
         <w:t xml:space="preserve"> file and make a score(game) timeline to see if something is strange with match36.</w:t>
       </w:r>
+    </w:p>
+    <w:p>
+      <w:pPr>
+        <w:pStyle w:val="Heading2"/>
+        <w:rPr>
+          <w:lang w:val="en-US"/>
+        </w:rPr>
+      </w:pPr>
+      <w:proofErr w:type="spellStart"/>
+      <w:r>
+        <w:rPr>
+          <w:lang w:val="en-US"/>
+        </w:rPr>
+        <w:t>Nonrepeatability</w:t>
+      </w:r>
+      <w:proofErr w:type="spellEnd"/>
+      <w:r>
+        <w:rPr>
+          <w:lang w:val="en-US"/>
+        </w:rPr>
+        <w:t>! (19.5.2019)</w:t>
+      </w:r>
+    </w:p>
+    <w:p>
+      <w:pPr>
+        <w:rPr>
+          <w:lang w:val="en-US"/>
+        </w:rPr>
+      </w:pPr>
+      <w:r>
+        <w:rPr>
+          <w:lang w:val="en-US"/>
+        </w:rPr>
+        <w:t xml:space="preserve">I notice that match36 was </w:t>
+      </w:r>
+      <w:proofErr w:type="gramStart"/>
+      <w:r>
+        <w:rPr>
+          <w:lang w:val="en-US"/>
+        </w:rPr>
+        <w:t>really strange</w:t>
+      </w:r>
+      <w:proofErr w:type="gramEnd"/>
+      <w:r>
+        <w:rPr>
+          <w:lang w:val="en-US"/>
+        </w:rPr>
+        <w:t xml:space="preserve"> – a Python </w:t>
+      </w:r>
+      <w:proofErr w:type="spellStart"/>
+      <w:r>
+        <w:rPr>
+          <w:lang w:val="en-US"/>
+        </w:rPr>
+        <w:t>Jupyter</w:t>
+      </w:r>
+      <w:proofErr w:type="spellEnd"/>
+      <w:r>
+        <w:rPr>
+          <w:lang w:val="en-US"/>
+        </w:rPr>
+        <w:t xml:space="preserve"> notebook script analyzes the match-progress files I give it and here are the results of many matches against </w:t>
+      </w:r>
+      <w:proofErr w:type="spellStart"/>
+      <w:r>
+        <w:rPr>
+          <w:lang w:val="en-US"/>
+        </w:rPr>
+        <w:t>kr</w:t>
+      </w:r>
+      <w:proofErr w:type="spellEnd"/>
+      <w:r>
+        <w:rPr>
+          <w:lang w:val="en-US"/>
+        </w:rPr>
+        <w:t xml:space="preserve"> 1.18 with different parameter sets. </w:t>
+      </w:r>
+    </w:p>
+    <w:p>
+      <w:pPr>
+        <w:rPr>
+          <w:lang w:val="en-US"/>
+        </w:rPr>
+      </w:pPr>
+      <w:r>
+        <w:rPr>
+          <w:noProof/>
+          <w:lang w:val="en-US"/>
+        </w:rPr>
+        <w:drawing>
+          <wp:inline distT="0" distB="0" distL="0" distR="0" wp14:anchorId="7033B72A" wp14:editId="58C46DE2">
+            <wp:extent cx="5760720" cy="2232025"/>
+            <wp:effectExtent l="0" t="0" r="0" b="0"/>
+            <wp:docPr id="48" name="Picture 48" descr="C:\Users\MARTIN~1\AppData\Local\Temp\bkfgjjnandghiebm.png"/>
+            <wp:cNvGraphicFramePr>
+              <a:graphicFrameLocks xmlns:a="http://schemas.openxmlformats.org/drawingml/2006/main" noChangeAspect="1"/>
+            </wp:cNvGraphicFramePr>
+            <a:graphic xmlns:a="http://schemas.openxmlformats.org/drawingml/2006/main">
+              <a:graphicData uri="http://schemas.openxmlformats.org/drawingml/2006/picture">
+                <pic:pic xmlns:pic="http://schemas.openxmlformats.org/drawingml/2006/picture">
+                  <pic:nvPicPr>
+                    <pic:cNvPr id="0" name="Picture 1" descr="C:\Users\MARTIN~1\AppData\Local\Temp\bkfgjjnandghiebm.png"/>
+                    <pic:cNvPicPr>
+                      <a:picLocks noChangeAspect="1" noChangeArrowheads="1"/>
+                    </pic:cNvPicPr>
+                  </pic:nvPicPr>
+                  <pic:blipFill>
+                    <a:blip r:embed="rId43">
+                      <a:extLst>
+                        <a:ext uri="{28A0092B-C50C-407E-A947-70E740481C1C}">
+                          <a14:useLocalDpi xmlns:a14="http://schemas.microsoft.com/office/drawing/2010/main" val="0"/>
+                        </a:ext>
+                      </a:extLst>
+                    </a:blip>
+                    <a:srcRect/>
+                    <a:stretch>
+                      <a:fillRect/>
+                    </a:stretch>
+                  </pic:blipFill>
+                  <pic:spPr bwMode="auto">
+                    <a:xfrm>
+                      <a:off x="0" y="0"/>
+                      <a:ext cx="5760720" cy="2232025"/>
+                    </a:xfrm>
+                    <a:prstGeom prst="rect">
+                      <a:avLst/>
+                    </a:prstGeom>
+                    <a:noFill/>
+                    <a:ln>
+                      <a:noFill/>
+                    </a:ln>
+                  </pic:spPr>
+                </pic:pic>
+              </a:graphicData>
+            </a:graphic>
+          </wp:inline>
+        </w:drawing>
+      </w:r>
+    </w:p>
+    <w:p>
+      <w:pPr>
+        <w:rPr>
+          <w:lang w:val="en-US"/>
+        </w:rPr>
+      </w:pPr>
+      <w:r>
+        <w:rPr>
+          <w:lang w:val="en-US"/>
+        </w:rPr>
+        <w:t>The very best result with match_progress36 is looking very strange with its sudden improvement after 2000 games =&gt; what happened?</w:t>
+      </w:r>
+    </w:p>
+    <w:p>
+      <w:pPr>
+        <w:rPr>
+          <w:lang w:val="en-US"/>
+        </w:rPr>
+      </w:pPr>
+      <w:r>
+        <w:rPr>
+          <w:lang w:val="en-US"/>
+        </w:rPr>
+        <w:t>I repeat that match and call it mach_progress36', and I get:</w:t>
+      </w:r>
+    </w:p>
+    <w:p>
+      <w:pPr>
+        <w:rPr>
+          <w:lang w:val="en-US"/>
+        </w:rPr>
+      </w:pPr>
+      <w:r>
+        <w:rPr>
+          <w:noProof/>
+          <w:lang w:val="en-US"/>
+        </w:rPr>
+        <w:lastRenderedPageBreak/>
+        <w:drawing>
+          <wp:inline distT="0" distB="0" distL="0" distR="0" wp14:anchorId="1BFDFF06" wp14:editId="730637AA">
+            <wp:extent cx="5760720" cy="2232025"/>
+            <wp:effectExtent l="0" t="0" r="0" b="0"/>
+            <wp:docPr id="51" name="Picture 51" descr="C:\Users\MARTIN~1\AppData\Local\Temp\ihajfelghnbgifal.png"/>
+            <wp:cNvGraphicFramePr>
+              <a:graphicFrameLocks xmlns:a="http://schemas.openxmlformats.org/drawingml/2006/main" noChangeAspect="1"/>
+            </wp:cNvGraphicFramePr>
+            <a:graphic xmlns:a="http://schemas.openxmlformats.org/drawingml/2006/main">
+              <a:graphicData uri="http://schemas.openxmlformats.org/drawingml/2006/picture">
+                <pic:pic xmlns:pic="http://schemas.openxmlformats.org/drawingml/2006/picture">
+                  <pic:nvPicPr>
+                    <pic:cNvPr id="0" name="Picture 2" descr="C:\Users\MARTIN~1\AppData\Local\Temp\ihajfelghnbgifal.png"/>
+                    <pic:cNvPicPr>
+                      <a:picLocks noChangeAspect="1" noChangeArrowheads="1"/>
+                    </pic:cNvPicPr>
+                  </pic:nvPicPr>
+                  <pic:blipFill>
+                    <a:blip r:embed="rId44">
+                      <a:extLst>
+                        <a:ext uri="{28A0092B-C50C-407E-A947-70E740481C1C}">
+                          <a14:useLocalDpi xmlns:a14="http://schemas.microsoft.com/office/drawing/2010/main" val="0"/>
+                        </a:ext>
+                      </a:extLst>
+                    </a:blip>
+                    <a:srcRect/>
+                    <a:stretch>
+                      <a:fillRect/>
+                    </a:stretch>
+                  </pic:blipFill>
+                  <pic:spPr bwMode="auto">
+                    <a:xfrm>
+                      <a:off x="0" y="0"/>
+                      <a:ext cx="5760720" cy="2232025"/>
+                    </a:xfrm>
+                    <a:prstGeom prst="rect">
+                      <a:avLst/>
+                    </a:prstGeom>
+                    <a:noFill/>
+                    <a:ln>
+                      <a:noFill/>
+                    </a:ln>
+                  </pic:spPr>
+                </pic:pic>
+              </a:graphicData>
+            </a:graphic>
+          </wp:inline>
+        </w:drawing>
+      </w:r>
+    </w:p>
+    <w:p>
+      <w:pPr>
+        <w:rPr>
+          <w:lang w:val="en-US"/>
+        </w:rPr>
+      </w:pPr>
+      <w:r>
+        <w:rPr>
+          <w:lang w:val="en-US"/>
+        </w:rPr>
+        <w:t>Ouch! Repeatability is once again a big issue in engine matches – how can I use them as a tool for improvement if I don't believe the result??</w:t>
+      </w:r>
+    </w:p>
+    <w:p>
+      <w:pPr>
+        <w:rPr>
+          <w:lang w:val="en-US"/>
+        </w:rPr>
+      </w:pPr>
+      <w:proofErr w:type="spellStart"/>
+      <w:r>
+        <w:rPr>
+          <w:lang w:val="en-US"/>
+        </w:rPr>
+        <w:t>Todo</w:t>
+      </w:r>
+      <w:proofErr w:type="spellEnd"/>
+      <w:r>
+        <w:rPr>
+          <w:lang w:val="en-US"/>
+        </w:rPr>
+        <w:t>: run same match X times!</w:t>
+      </w:r>
+    </w:p>
+    <w:p>
+      <w:pPr>
+        <w:rPr>
+          <w:lang w:val="en-US"/>
+        </w:rPr>
+      </w:pPr>
+    </w:p>
+    <w:p>
+      <w:pPr>
+        <w:pStyle w:val="Heading2"/>
+        <w:rPr>
+          <w:lang w:val="en-US"/>
+        </w:rPr>
+      </w:pPr>
+      <w:r>
+        <w:rPr>
+          <w:lang w:val="en-US"/>
+        </w:rPr>
+        <w:t>Larger Data Set! (19.5.2019)</w:t>
+      </w:r>
+    </w:p>
+    <w:p>
+      <w:pPr>
+        <w:rPr>
+          <w:lang w:val="en-US"/>
+        </w:rPr>
+      </w:pPr>
+      <w:r>
+        <w:rPr>
+          <w:lang w:val="en-US"/>
+        </w:rPr>
+        <w:t>I move to a larger data set including everything up to match41:</w:t>
+      </w:r>
+    </w:p>
+    <w:p>
+      <w:pPr>
+        <w:rPr>
+          <w:lang w:val="en-US"/>
+        </w:rPr>
+      </w:pPr>
+      <w:r>
+        <w:rPr>
+          <w:noProof/>
+        </w:rPr>
+        <w:drawing>
+          <wp:inline distT="0" distB="0" distL="0" distR="0" wp14:anchorId="5FF394DD" wp14:editId="7B00CD83">
+            <wp:extent cx="5760720" cy="1964055"/>
+            <wp:effectExtent l="0" t="0" r="0" b="0"/>
+            <wp:docPr id="52" name="Picture 52"/>
+            <wp:cNvGraphicFramePr>
+              <a:graphicFrameLocks xmlns:a="http://schemas.openxmlformats.org/drawingml/2006/main" noChangeAspect="1"/>
+            </wp:cNvGraphicFramePr>
+            <a:graphic xmlns:a="http://schemas.openxmlformats.org/drawingml/2006/main">
+              <a:graphicData uri="http://schemas.openxmlformats.org/drawingml/2006/picture">
+                <pic:pic xmlns:pic="http://schemas.openxmlformats.org/drawingml/2006/picture">
+                  <pic:nvPicPr>
+                    <pic:cNvPr id="1" name=""/>
+                    <pic:cNvPicPr/>
+                  </pic:nvPicPr>
+                  <pic:blipFill>
+                    <a:blip r:embed="rId45"/>
+                    <a:stretch>
+                      <a:fillRect/>
+                    </a:stretch>
+                  </pic:blipFill>
+                  <pic:spPr>
+                    <a:xfrm>
+                      <a:off x="0" y="0"/>
+                      <a:ext cx="5760720" cy="1964055"/>
+                    </a:xfrm>
+                    <a:prstGeom prst="rect">
+                      <a:avLst/>
+                    </a:prstGeom>
+                  </pic:spPr>
+                </pic:pic>
+              </a:graphicData>
+            </a:graphic>
+          </wp:inline>
+        </w:drawing>
+      </w:r>
+    </w:p>
+    <w:p>
+      <w:pPr>
+        <w:rPr>
+          <w:lang w:val="en-US"/>
+        </w:rPr>
+      </w:pPr>
+      <w:r>
+        <w:rPr>
+          <w:lang w:val="en-US"/>
+        </w:rPr>
+        <w:t>187'147 games, 5891k positions!</w:t>
+      </w:r>
+      <w:r>
+        <w:rPr>
+          <w:lang w:val="en-US"/>
+        </w:rPr>
+        <w:t xml:space="preserve">  5534 are </w:t>
+      </w:r>
+      <w:proofErr w:type="gramStart"/>
+      <w:r>
+        <w:rPr>
+          <w:lang w:val="en-US"/>
+        </w:rPr>
+        <w:t>quite</w:t>
+      </w:r>
+      <w:proofErr w:type="gramEnd"/>
+      <w:r>
+        <w:rPr>
+          <w:lang w:val="en-US"/>
+        </w:rPr>
+        <w:t>, so my new engines will be called</w:t>
+      </w:r>
+    </w:p>
+    <w:p>
+      <w:pPr>
+        <w:rPr>
+          <w:lang w:val="en-US"/>
+        </w:rPr>
+      </w:pPr>
+      <w:r>
+        <w:rPr>
+          <w:lang w:val="en-US"/>
+        </w:rPr>
+        <w:t>Cake_5534k_xyp.dll</w:t>
+      </w:r>
+    </w:p>
+    <w:p>
+      <w:pPr>
+        <w:rPr>
+          <w:lang w:val="en-US"/>
+        </w:rPr>
+      </w:pPr>
+      <w:r>
+        <w:rPr>
+          <w:lang w:val="en-US"/>
+        </w:rPr>
+        <w:t>6% of all positions appear to be non-quiet.</w:t>
+      </w:r>
+    </w:p>
+    <w:p>
+      <w:pPr>
+        <w:rPr>
+          <w:lang w:val="en-US"/>
+        </w:rPr>
+      </w:pPr>
+    </w:p>
+    <w:p>
+      <w:pPr>
+        <w:rPr>
+          <w:lang w:val="en-US"/>
+        </w:rPr>
+      </w:pPr>
+      <w:r>
+        <w:rPr>
+          <w:lang w:val="en-US"/>
+        </w:rPr>
+        <w:lastRenderedPageBreak/>
+        <w:t>Optimizer with 94 params:</w:t>
+      </w:r>
+      <w:r>
+        <w:rPr>
+          <w:lang w:val="en-US"/>
+        </w:rPr>
+        <w:br/>
+      </w:r>
+      <w:r>
+        <w:rPr>
+          <w:noProof/>
+        </w:rPr>
+        <w:drawing>
+          <wp:inline distT="0" distB="0" distL="0" distR="0" wp14:anchorId="7F0BA9C8" wp14:editId="589B8C23">
+            <wp:extent cx="2900957" cy="5364480"/>
+            <wp:effectExtent l="0" t="0" r="0" b="7620"/>
+            <wp:docPr id="53" name="Picture 53"/>
+            <wp:cNvGraphicFramePr>
+              <a:graphicFrameLocks xmlns:a="http://schemas.openxmlformats.org/drawingml/2006/main" noChangeAspect="1"/>
+            </wp:cNvGraphicFramePr>
+            <a:graphic xmlns:a="http://schemas.openxmlformats.org/drawingml/2006/main">
+              <a:graphicData uri="http://schemas.openxmlformats.org/drawingml/2006/picture">
+                <pic:pic xmlns:pic="http://schemas.openxmlformats.org/drawingml/2006/picture">
+                  <pic:nvPicPr>
+                    <pic:cNvPr id="1" name=""/>
+                    <pic:cNvPicPr/>
+                  </pic:nvPicPr>
+                  <pic:blipFill>
+                    <a:blip r:embed="rId46"/>
+                    <a:stretch>
+                      <a:fillRect/>
+                    </a:stretch>
+                  </pic:blipFill>
+                  <pic:spPr>
+                    <a:xfrm>
+                      <a:off x="0" y="0"/>
+                      <a:ext cx="2913609" cy="5387877"/>
+                    </a:xfrm>
+                    <a:prstGeom prst="rect">
+                      <a:avLst/>
+                    </a:prstGeom>
+                  </pic:spPr>
+                </pic:pic>
+              </a:graphicData>
+            </a:graphic>
+          </wp:inline>
+        </w:drawing>
+      </w:r>
+      <w:r>
+        <w:rPr>
+          <w:noProof/>
+        </w:rPr>
+        <w:drawing>
+          <wp:inline distT="0" distB="0" distL="0" distR="0" wp14:anchorId="029B1E96" wp14:editId="20E340BD">
+            <wp:extent cx="2278735" cy="4213860"/>
+            <wp:effectExtent l="0" t="0" r="7620" b="0"/>
+            <wp:docPr id="54" name="Picture 54"/>
+            <wp:cNvGraphicFramePr>
+              <a:graphicFrameLocks xmlns:a="http://schemas.openxmlformats.org/drawingml/2006/main" noChangeAspect="1"/>
+            </wp:cNvGraphicFramePr>
+            <a:graphic xmlns:a="http://schemas.openxmlformats.org/drawingml/2006/main">
+              <a:graphicData uri="http://schemas.openxmlformats.org/drawingml/2006/picture">
+                <pic:pic xmlns:pic="http://schemas.openxmlformats.org/drawingml/2006/picture">
+                  <pic:nvPicPr>
+                    <pic:cNvPr id="1" name=""/>
+                    <pic:cNvPicPr/>
+                  </pic:nvPicPr>
+                  <pic:blipFill>
+                    <a:blip r:embed="rId47"/>
+                    <a:stretch>
+                      <a:fillRect/>
+                    </a:stretch>
+                  </pic:blipFill>
+                  <pic:spPr>
+                    <a:xfrm>
+                      <a:off x="0" y="0"/>
+                      <a:ext cx="2309575" cy="4270889"/>
+                    </a:xfrm>
+                    <a:prstGeom prst="rect">
+                      <a:avLst/>
+                    </a:prstGeom>
+                  </pic:spPr>
+                </pic:pic>
+              </a:graphicData>
+            </a:graphic>
+          </wp:inline>
+        </w:drawing>
+      </w:r>
+    </w:p>
+    <w:p>
+      <w:pPr>
+        <w:rPr>
+          <w:rFonts w:ascii="Consolas" w:hAnsi="Consolas" w:cs="Consolas"/>
+          <w:color w:val="000000"/>
+          <w:sz w:val="19"/>
+          <w:szCs w:val="19"/>
+          <w:lang w:val="en-US"/>
+        </w:rPr>
+      </w:pPr>
+    </w:p>
+    <w:p>
+      <w:pPr>
+        <w:rPr>
+          <w:rFonts w:ascii="Consolas" w:hAnsi="Consolas" w:cs="Consolas"/>
+          <w:color w:val="000000"/>
+          <w:sz w:val="19"/>
+          <w:szCs w:val="19"/>
+          <w:lang w:val="en-US"/>
+        </w:rPr>
+      </w:pPr>
+      <w:r>
+        <w:rPr>
+          <w:rFonts w:ascii="Consolas" w:hAnsi="Consolas" w:cs="Consolas"/>
+          <w:color w:val="000000"/>
+          <w:sz w:val="19"/>
+          <w:szCs w:val="19"/>
+          <w:lang w:val="en-US"/>
+        </w:rPr>
+        <w:t xml:space="preserve">I check thinking times: </w:t>
+      </w:r>
+    </w:p>
+    <w:p>
+      <w:pPr>
+        <w:rPr>
+          <w:rFonts w:ascii="Consolas" w:hAnsi="Consolas" w:cs="Consolas"/>
+          <w:color w:val="000000"/>
+          <w:sz w:val="19"/>
+          <w:szCs w:val="19"/>
+          <w:lang w:val="en-US"/>
+        </w:rPr>
+      </w:pPr>
+      <w:r>
+        <w:rPr>
+          <w:rFonts w:ascii="Consolas" w:hAnsi="Consolas" w:cs="Consolas"/>
+          <w:color w:val="000000"/>
+          <w:sz w:val="19"/>
+          <w:szCs w:val="19"/>
+          <w:lang w:val="en-US"/>
+        </w:rPr>
+        <w:t xml:space="preserve">Match36: </w:t>
+      </w:r>
+      <w:proofErr w:type="spellStart"/>
+      <w:r>
+        <w:rPr>
+          <w:rFonts w:ascii="Consolas" w:hAnsi="Consolas" w:cs="Consolas"/>
+          <w:color w:val="000000"/>
+          <w:sz w:val="19"/>
+          <w:szCs w:val="19"/>
+          <w:lang w:val="en-US"/>
+        </w:rPr>
+        <w:t>kr</w:t>
+      </w:r>
+      <w:proofErr w:type="spellEnd"/>
+      <w:r>
+        <w:rPr>
+          <w:rFonts w:ascii="Consolas" w:hAnsi="Consolas" w:cs="Consolas"/>
+          <w:color w:val="000000"/>
+          <w:sz w:val="19"/>
+          <w:szCs w:val="19"/>
+          <w:lang w:val="en-US"/>
+        </w:rPr>
+        <w:t xml:space="preserve"> 0.118, cake 0.129</w:t>
+      </w:r>
+    </w:p>
+    <w:p>
+      <w:pPr>
+        <w:rPr>
+          <w:rFonts w:ascii="Consolas" w:hAnsi="Consolas" w:cs="Consolas"/>
+          <w:color w:val="000000"/>
+          <w:sz w:val="19"/>
+          <w:szCs w:val="19"/>
+          <w:lang w:val="en-US"/>
+        </w:rPr>
+      </w:pPr>
+      <w:r>
+        <w:rPr>
+          <w:rFonts w:ascii="Consolas" w:hAnsi="Consolas" w:cs="Consolas"/>
+          <w:color w:val="000000"/>
+          <w:sz w:val="19"/>
+          <w:szCs w:val="19"/>
+          <w:lang w:val="en-US"/>
+        </w:rPr>
+        <w:t xml:space="preserve">Match 36': </w:t>
+      </w:r>
+      <w:proofErr w:type="spellStart"/>
+      <w:r>
+        <w:rPr>
+          <w:rFonts w:ascii="Consolas" w:hAnsi="Consolas" w:cs="Consolas"/>
+          <w:color w:val="000000"/>
+          <w:sz w:val="19"/>
+          <w:szCs w:val="19"/>
+          <w:lang w:val="en-US"/>
+        </w:rPr>
+        <w:t>kr</w:t>
+      </w:r>
+      <w:proofErr w:type="spellEnd"/>
+      <w:r>
+        <w:rPr>
+          <w:rFonts w:ascii="Consolas" w:hAnsi="Consolas" w:cs="Consolas"/>
+          <w:color w:val="000000"/>
+          <w:sz w:val="19"/>
+          <w:szCs w:val="19"/>
+          <w:lang w:val="en-US"/>
+        </w:rPr>
+        <w:t xml:space="preserve"> 0.116, cake 0.126</w:t>
+      </w:r>
+    </w:p>
+    <w:p>
+      <w:pPr>
+        <w:rPr>
+          <w:rFonts w:ascii="Consolas" w:hAnsi="Consolas" w:cs="Consolas"/>
+          <w:color w:val="000000"/>
+          <w:sz w:val="19"/>
+          <w:szCs w:val="19"/>
+          <w:lang w:val="en-US"/>
+        </w:rPr>
+      </w:pPr>
+    </w:p>
+    <w:p>
+      <w:pPr>
+        <w:autoSpaceDE w:val="0"/>
+        <w:autoSpaceDN w:val="0"/>
+        <w:adjustRightInd w:val="0"/>
+        <w:spacing w:after="0" w:line="240" w:lineRule="auto"/>
+        <w:rPr>
+          <w:rFonts w:ascii="Consolas" w:hAnsi="Consolas" w:cs="Consolas"/>
+          <w:color w:val="000000"/>
+          <w:sz w:val="19"/>
+          <w:szCs w:val="19"/>
+          <w:lang w:val="en-US"/>
+        </w:rPr>
+      </w:pPr>
+      <w:r>
+        <w:rPr>
+          <w:rFonts w:ascii="Consolas" w:hAnsi="Consolas" w:cs="Consolas"/>
+          <w:color w:val="000000"/>
+          <w:sz w:val="19"/>
+          <w:szCs w:val="19"/>
+          <w:lang w:val="en-US"/>
+        </w:rPr>
+        <w:t>19.5.2019</w:t>
+      </w:r>
+    </w:p>
+    <w:p>
+      <w:pPr>
+        <w:autoSpaceDE w:val="0"/>
+        <w:autoSpaceDN w:val="0"/>
+        <w:adjustRightInd w:val="0"/>
+        <w:spacing w:after="0" w:line="240" w:lineRule="auto"/>
+        <w:rPr>
+          <w:rFonts w:ascii="Consolas" w:hAnsi="Consolas" w:cs="Consolas"/>
+          <w:color w:val="000000"/>
+          <w:sz w:val="19"/>
+          <w:szCs w:val="19"/>
+          <w:lang w:val="en-US"/>
+        </w:rPr>
+      </w:pPr>
+      <w:r>
+        <w:rPr>
+          <w:rFonts w:ascii="Consolas" w:hAnsi="Consolas" w:cs="Consolas"/>
+          <w:color w:val="000000"/>
+          <w:sz w:val="19"/>
+          <w:szCs w:val="19"/>
+          <w:lang w:val="en-US"/>
+        </w:rPr>
+        <w:t>Expand data set to 187k games, with 5890k positions, of which 5534 are quiet</w:t>
+      </w:r>
+    </w:p>
+    <w:p>
+      <w:pPr>
+        <w:autoSpaceDE w:val="0"/>
+        <w:autoSpaceDN w:val="0"/>
+        <w:adjustRightInd w:val="0"/>
+        <w:spacing w:after="0" w:line="240" w:lineRule="auto"/>
+        <w:rPr>
+          <w:rFonts w:ascii="Consolas" w:hAnsi="Consolas" w:cs="Consolas"/>
+          <w:color w:val="000000"/>
+          <w:sz w:val="19"/>
+          <w:szCs w:val="19"/>
+          <w:lang w:val="en-US"/>
+        </w:rPr>
+      </w:pPr>
+    </w:p>
+    <w:p>
+      <w:pPr>
+        <w:autoSpaceDE w:val="0"/>
+        <w:autoSpaceDN w:val="0"/>
+        <w:adjustRightInd w:val="0"/>
+        <w:spacing w:after="0" w:line="240" w:lineRule="auto"/>
+        <w:rPr>
+          <w:rFonts w:ascii="Consolas" w:hAnsi="Consolas" w:cs="Consolas"/>
+          <w:color w:val="000000"/>
+          <w:sz w:val="19"/>
+          <w:szCs w:val="19"/>
+          <w:lang w:val="en-US"/>
+        </w:rPr>
+      </w:pPr>
+      <w:r>
+        <w:rPr>
+          <w:rFonts w:ascii="Consolas" w:hAnsi="Consolas" w:cs="Consolas"/>
+          <w:color w:val="000000"/>
+          <w:sz w:val="19"/>
+          <w:szCs w:val="19"/>
+          <w:lang w:val="en-US"/>
+        </w:rPr>
+        <w:t>***********************</w:t>
+      </w:r>
+      <w:proofErr w:type="gramStart"/>
+      <w:r>
+        <w:rPr>
+          <w:rFonts w:ascii="Consolas" w:hAnsi="Consolas" w:cs="Consolas"/>
+          <w:color w:val="000000"/>
+          <w:sz w:val="19"/>
+          <w:szCs w:val="19"/>
+          <w:lang w:val="en-US"/>
+        </w:rPr>
+        <w:t>*  best</w:t>
+      </w:r>
+      <w:proofErr w:type="gramEnd"/>
+      <w:r>
+        <w:rPr>
+          <w:rFonts w:ascii="Consolas" w:hAnsi="Consolas" w:cs="Consolas"/>
+          <w:color w:val="000000"/>
+          <w:sz w:val="19"/>
+          <w:szCs w:val="19"/>
+          <w:lang w:val="en-US"/>
+        </w:rPr>
+        <w:t xml:space="preserve"> version so far!! vvvvvvvvvvvvvvvvvvvvvvvvvvvvvvvvvvvvvvvvvv</w:t>
+      </w:r>
+    </w:p>
+    <w:p>
+      <w:pPr>
+        <w:autoSpaceDE w:val="0"/>
+        <w:autoSpaceDN w:val="0"/>
+        <w:adjustRightInd w:val="0"/>
+        <w:spacing w:after="0" w:line="240" w:lineRule="auto"/>
+        <w:rPr>
+          <w:rFonts w:ascii="Consolas" w:hAnsi="Consolas" w:cs="Consolas"/>
+          <w:color w:val="000000"/>
+          <w:sz w:val="19"/>
+          <w:szCs w:val="19"/>
+          <w:lang w:val="en-US"/>
+        </w:rPr>
+      </w:pPr>
+      <w:r>
+        <w:rPr>
+          <w:rFonts w:ascii="Consolas" w:hAnsi="Consolas" w:cs="Consolas"/>
+          <w:color w:val="000000"/>
+          <w:sz w:val="19"/>
+          <w:szCs w:val="19"/>
+          <w:lang w:val="en-US"/>
+        </w:rPr>
+        <w:t xml:space="preserve">but difference to 3162k 94p is small. </w:t>
+      </w:r>
+    </w:p>
+    <w:p>
+      <w:pPr>
+        <w:autoSpaceDE w:val="0"/>
+        <w:autoSpaceDN w:val="0"/>
+        <w:adjustRightInd w:val="0"/>
+        <w:spacing w:after="0" w:line="240" w:lineRule="auto"/>
+        <w:rPr>
+          <w:rFonts w:ascii="Consolas" w:hAnsi="Consolas" w:cs="Consolas"/>
+          <w:color w:val="000000"/>
+          <w:sz w:val="19"/>
+          <w:szCs w:val="19"/>
+          <w:lang w:val="en-US"/>
+        </w:rPr>
+      </w:pPr>
+      <w:r>
+        <w:rPr>
+          <w:rFonts w:ascii="Consolas" w:hAnsi="Consolas" w:cs="Consolas"/>
+          <w:color w:val="000000"/>
+          <w:sz w:val="19"/>
+          <w:szCs w:val="19"/>
+          <w:lang w:val="en-US"/>
+        </w:rPr>
+        <w:t xml:space="preserve">Cake 1.85g 5534k (94p) - Kingsrow(x64) </w:t>
+      </w:r>
+      <w:proofErr w:type="gramStart"/>
+      <w:r>
+        <w:rPr>
+          <w:rFonts w:ascii="Consolas" w:hAnsi="Consolas" w:cs="Consolas"/>
+          <w:color w:val="000000"/>
+          <w:sz w:val="19"/>
+          <w:szCs w:val="19"/>
+          <w:lang w:val="en-US"/>
+        </w:rPr>
+        <w:t>1.18 :</w:t>
+      </w:r>
+      <w:proofErr w:type="gramEnd"/>
+      <w:r>
+        <w:rPr>
+          <w:rFonts w:ascii="Consolas" w:hAnsi="Consolas" w:cs="Consolas"/>
+          <w:color w:val="000000"/>
+          <w:sz w:val="19"/>
+          <w:szCs w:val="19"/>
+          <w:lang w:val="en-US"/>
+        </w:rPr>
+        <w:t xml:space="preserve"> W-L-D:949-585-2198  (match 42, 54.88%, 162.2% relative)</w:t>
+      </w:r>
+    </w:p>
+    <w:p>
+      <w:pPr>
+        <w:autoSpaceDE w:val="0"/>
+        <w:autoSpaceDN w:val="0"/>
+        <w:adjustRightInd w:val="0"/>
+        <w:spacing w:after="0" w:line="240" w:lineRule="auto"/>
+        <w:rPr>
+          <w:rFonts w:ascii="Consolas" w:hAnsi="Consolas" w:cs="Consolas"/>
+          <w:color w:val="000000"/>
+          <w:sz w:val="19"/>
+          <w:szCs w:val="19"/>
+          <w:lang w:val="en-US"/>
+        </w:rPr>
+      </w:pPr>
+      <w:r>
+        <w:rPr>
+          <w:rFonts w:ascii="Consolas" w:hAnsi="Consolas" w:cs="Consolas"/>
+          <w:color w:val="000000"/>
+          <w:sz w:val="19"/>
+          <w:szCs w:val="19"/>
+          <w:lang w:val="en-US"/>
+        </w:rPr>
+        <w:t>+:949 =:2195 -:585 unknown:3 +B:383 -B:1151</w:t>
+      </w:r>
+    </w:p>
+    <w:p>
+      <w:pPr>
+        <w:autoSpaceDE w:val="0"/>
+        <w:autoSpaceDN w:val="0"/>
+        <w:adjustRightInd w:val="0"/>
+        <w:spacing w:after="0" w:line="240" w:lineRule="auto"/>
+        <w:rPr>
+          <w:rFonts w:ascii="Consolas" w:hAnsi="Consolas" w:cs="Consolas"/>
+          <w:color w:val="000000"/>
+          <w:sz w:val="19"/>
+          <w:szCs w:val="19"/>
+          <w:lang w:val="en-US"/>
+        </w:rPr>
+      </w:pPr>
+      <w:r>
+        <w:rPr>
+          <w:rFonts w:ascii="Consolas" w:hAnsi="Consolas" w:cs="Consolas"/>
+          <w:color w:val="000000"/>
+          <w:sz w:val="19"/>
+          <w:szCs w:val="19"/>
+          <w:lang w:val="en-US"/>
+        </w:rPr>
+        <w:t xml:space="preserve">Cake 1.85g 5534k (94p) - Kingsrow(x64) </w:t>
+      </w:r>
+      <w:proofErr w:type="gramStart"/>
+      <w:r>
+        <w:rPr>
+          <w:rFonts w:ascii="Consolas" w:hAnsi="Consolas" w:cs="Consolas"/>
+          <w:color w:val="000000"/>
+          <w:sz w:val="19"/>
+          <w:szCs w:val="19"/>
+          <w:lang w:val="en-US"/>
+        </w:rPr>
+        <w:t>1.18f :</w:t>
+      </w:r>
+      <w:proofErr w:type="gramEnd"/>
+      <w:r>
+        <w:rPr>
+          <w:rFonts w:ascii="Consolas" w:hAnsi="Consolas" w:cs="Consolas"/>
+          <w:color w:val="000000"/>
+          <w:sz w:val="19"/>
+          <w:szCs w:val="19"/>
+          <w:lang w:val="en-US"/>
+        </w:rPr>
+        <w:t xml:space="preserve"> W-L-D:259-984-3557 (match 43, 42.45%, 26.32% relative, 3.61 draw-loss)</w:t>
+      </w:r>
+    </w:p>
+    <w:p>
+      <w:pPr>
+        <w:autoSpaceDE w:val="0"/>
+        <w:autoSpaceDN w:val="0"/>
+        <w:adjustRightInd w:val="0"/>
+        <w:spacing w:after="0" w:line="240" w:lineRule="auto"/>
+        <w:rPr>
+          <w:rFonts w:ascii="Consolas" w:hAnsi="Consolas" w:cs="Consolas"/>
+          <w:color w:val="000000"/>
+          <w:sz w:val="19"/>
+          <w:szCs w:val="19"/>
+        </w:rPr>
+      </w:pPr>
+      <w:r>
+        <w:rPr>
+          <w:rFonts w:ascii="Consolas" w:hAnsi="Consolas" w:cs="Consolas"/>
+          <w:color w:val="000000"/>
+          <w:sz w:val="19"/>
+          <w:szCs w:val="19"/>
+        </w:rPr>
+        <w:t>+:259 =:3515 -:984 unknown:42 +B:718 -B:525</w:t>
+      </w:r>
+    </w:p>
+    <w:p>
+      <w:pPr>
+        <w:rPr>
+          <w:rFonts w:ascii="Consolas" w:hAnsi="Consolas" w:cs="Consolas"/>
+          <w:color w:val="000000"/>
+          <w:sz w:val="19"/>
+          <w:szCs w:val="19"/>
+          <w:lang w:val="en-US"/>
+        </w:rPr>
+      </w:pPr>
+      <w:r>
+        <w:rPr>
+          <w:rFonts w:ascii="Consolas" w:hAnsi="Consolas" w:cs="Consolas"/>
+          <w:color w:val="000000"/>
+          <w:sz w:val="19"/>
+          <w:szCs w:val="19"/>
+        </w:rPr>
+        <w:t>----------------------------------------------------------------------------------------------</w:t>
+      </w:r>
       <w:bookmarkStart w:id="0" w:name="_GoBack"/>
       <w:bookmarkEnd w:id="0"/>
     </w:p>
     <w:p>
       <w:pPr>
         <w:rPr>
-          <w:rFonts w:ascii="Consolas" w:hAnsi="Consolas" w:cs="Consolas"/>
-          <w:color w:val="000000"/>
-          <w:sz w:val="19"/>
-          <w:szCs w:val="19"/>
-          <w:lang w:val="en-US"/>
-        </w:rPr>
-      </w:pPr>
-    </w:p>
-    <w:p>
-      <w:pPr>
-        <w:rPr>
-          <w:rFonts w:ascii="Consolas" w:hAnsi="Consolas" w:cs="Consolas"/>
-          <w:color w:val="000000"/>
-          <w:sz w:val="19"/>
-          <w:szCs w:val="19"/>
-          <w:lang w:val="en-US"/>
-        </w:rPr>
-      </w:pPr>
-    </w:p>
-    <w:p>
-      <w:pPr>
-        <w:rPr>
           <w:lang w:val="en-US"/>
         </w:rPr>
       </w:pPr>
@@ -7083,7 +7996,6 @@
         <w:rPr>
           <w:lang w:val="en-US"/>
         </w:rPr>
-        <w:lastRenderedPageBreak/>
         <w:t xml:space="preserve">Repetition issue: </w:t>
       </w:r>
     </w:p>
@@ -7113,7 +8025,7 @@
                     <pic:cNvPicPr/>
                   </pic:nvPicPr>
                   <pic:blipFill>
-                    <a:blip r:embed="rId43"/>
+                    <a:blip r:embed="rId48"/>
                     <a:stretch>
                       <a:fillRect/>
                     </a:stretch>

</xml_diff>

<commit_message>
Found strange negative weights for immobile men and for augment-doghole - looks like code was buggy, recoded that part!
</commit_message>
<xml_diff>
--- a/2019_04_22_EvaluationTuning.docx
+++ b/2019_04_22_EvaluationTuning.docx
@@ -7662,8 +7662,20 @@
           <w:szCs w:val="19"/>
           <w:lang w:val="en-US"/>
         </w:rPr>
-        <w:t xml:space="preserve"> version so far!! vvvvvvvvvvvvvvvvvvvvvvvvvvvvvvvvvvvvvvvvvv</w:t>
-      </w:r>
+        <w:t xml:space="preserve"> version so far!! </w:t>
+      </w:r>
+      <w:proofErr w:type="spellStart"/>
+      <w:r>
+        <w:rPr>
+          <w:rFonts w:ascii="Consolas" w:hAnsi="Consolas" w:cs="Consolas"/>
+          <w:color w:val="000000"/>
+          <w:sz w:val="19"/>
+          <w:szCs w:val="19"/>
+          <w:lang w:val="en-US"/>
+        </w:rPr>
+        <w:t>vvvvvvvvvvvvvvvvvvvvvvvvvvvvvvvvvvvvvvvvvv</w:t>
+      </w:r>
+      <w:proofErr w:type="spellEnd"/>
     </w:p>
     <w:p>
       <w:pPr>
@@ -7687,7 +7699,27 @@
           <w:szCs w:val="19"/>
           <w:lang w:val="en-US"/>
         </w:rPr>
-        <w:t xml:space="preserve">but difference to 3162k 94p is small. </w:t>
+        <w:t xml:space="preserve">but difference to 3162k 94p is </w:t>
+      </w:r>
+      <w:r>
+        <w:rPr>
+          <w:rFonts w:ascii="Consolas" w:hAnsi="Consolas" w:cs="Consolas"/>
+          <w:color w:val="000000"/>
+          <w:sz w:val="19"/>
+          <w:szCs w:val="19"/>
+          <w:lang w:val="en-US"/>
+        </w:rPr>
+        <w:t xml:space="preserve">very </w:t>
+      </w:r>
+      <w:r>
+        <w:rPr>
+          <w:rFonts w:ascii="Consolas" w:hAnsi="Consolas" w:cs="Consolas"/>
+          <w:color w:val="000000"/>
+          <w:sz w:val="19"/>
+          <w:szCs w:val="19"/>
+          <w:lang w:val="en-US"/>
+        </w:rPr>
+        <w:t xml:space="preserve">small. </w:t>
       </w:r>
     </w:p>
     <w:p>
@@ -7712,7 +7744,29 @@
           <w:szCs w:val="19"/>
           <w:lang w:val="en-US"/>
         </w:rPr>
-        <w:t xml:space="preserve">Cake 1.85g 5534k (94p) - Kingsrow(x64) </w:t>
+        <w:t xml:space="preserve">Cake 1.85g 5534k (94p) - </w:t>
+      </w:r>
+      <w:proofErr w:type="spellStart"/>
+      <w:r>
+        <w:rPr>
+          <w:rFonts w:ascii="Consolas" w:hAnsi="Consolas" w:cs="Consolas"/>
+          <w:color w:val="000000"/>
+          <w:sz w:val="19"/>
+          <w:szCs w:val="19"/>
+          <w:lang w:val="en-US"/>
+        </w:rPr>
+        <w:t>Kingsrow</w:t>
+      </w:r>
+      <w:proofErr w:type="spellEnd"/>
+      <w:r>
+        <w:rPr>
+          <w:rFonts w:ascii="Consolas" w:hAnsi="Consolas" w:cs="Consolas"/>
+          <w:color w:val="000000"/>
+          <w:sz w:val="19"/>
+          <w:szCs w:val="19"/>
+          <w:lang w:val="en-US"/>
+        </w:rPr>
+        <w:t xml:space="preserve">(x64) </w:t>
       </w:r>
       <w:proofErr w:type="gramStart"/>
       <w:r>
@@ -7784,7 +7838,29 @@
           <w:szCs w:val="19"/>
           <w:lang w:val="en-US"/>
         </w:rPr>
-        <w:t xml:space="preserve">Cake 1.85g 5534k (94p) - Kingsrow(x64) </w:t>
+        <w:t xml:space="preserve">Cake 1.85g 5534k (94p) - </w:t>
+      </w:r>
+      <w:proofErr w:type="spellStart"/>
+      <w:r>
+        <w:rPr>
+          <w:rFonts w:ascii="Consolas" w:hAnsi="Consolas" w:cs="Consolas"/>
+          <w:color w:val="000000"/>
+          <w:sz w:val="19"/>
+          <w:szCs w:val="19"/>
+          <w:lang w:val="en-US"/>
+        </w:rPr>
+        <w:t>Kingsrow</w:t>
+      </w:r>
+      <w:proofErr w:type="spellEnd"/>
+      <w:r>
+        <w:rPr>
+          <w:rFonts w:ascii="Consolas" w:hAnsi="Consolas" w:cs="Consolas"/>
+          <w:color w:val="000000"/>
+          <w:sz w:val="19"/>
+          <w:szCs w:val="19"/>
+          <w:lang w:val="en-US"/>
+        </w:rPr>
+        <w:t xml:space="preserve">(x64) </w:t>
       </w:r>
       <w:proofErr w:type="gramStart"/>
       <w:r>
@@ -7811,6 +7887,9 @@
     </w:p>
     <w:p>
       <w:pPr>
+        <w:pBdr>
+          <w:bottom w:val="single" w:sz="6" w:space="1" w:color="auto"/>
+        </w:pBdr>
         <w:autoSpaceDE w:val="0"/>
         <w:autoSpaceDN w:val="0"/>
         <w:adjustRightInd w:val="0"/>
@@ -7820,14 +7899,16 @@
           <w:color w:val="000000"/>
           <w:sz w:val="19"/>
           <w:szCs w:val="19"/>
-        </w:rPr>
-      </w:pPr>
-      <w:r>
-        <w:rPr>
-          <w:rFonts w:ascii="Consolas" w:hAnsi="Consolas" w:cs="Consolas"/>
-          <w:color w:val="000000"/>
-          <w:sz w:val="19"/>
-          <w:szCs w:val="19"/>
+          <w:lang w:val="en-US"/>
+        </w:rPr>
+      </w:pPr>
+      <w:r>
+        <w:rPr>
+          <w:rFonts w:ascii="Consolas" w:hAnsi="Consolas" w:cs="Consolas"/>
+          <w:color w:val="000000"/>
+          <w:sz w:val="19"/>
+          <w:szCs w:val="19"/>
+          <w:lang w:val="en-US"/>
         </w:rPr>
         <w:t>+:259 =:3515 -:984 unknown:42 +B:718 -B:525</w:t>
       </w:r>
@@ -7842,148 +7923,6 @@
           <w:lang w:val="en-US"/>
         </w:rPr>
       </w:pPr>
-      <w:r>
-        <w:rPr>
-          <w:rFonts w:ascii="Consolas" w:hAnsi="Consolas" w:cs="Consolas"/>
-          <w:color w:val="000000"/>
-          <w:sz w:val="19"/>
-          <w:szCs w:val="19"/>
-        </w:rPr>
-        <w:t>----------------------------------------------------------------------------------------------</w:t>
-      </w:r>
-      <w:bookmarkStart w:id="0" w:name="_GoBack"/>
-      <w:bookmarkEnd w:id="0"/>
-    </w:p>
-    <w:p>
-      <w:pPr>
-        <w:rPr>
-          <w:lang w:val="en-US"/>
-        </w:rPr>
-      </w:pPr>
-    </w:p>
-    <w:p>
-      <w:pPr>
-        <w:pStyle w:val="Heading2"/>
-        <w:rPr>
-          <w:lang w:val="en-US"/>
-        </w:rPr>
-      </w:pPr>
-      <w:r>
-        <w:rPr>
-          <w:lang w:val="en-US"/>
-        </w:rPr>
-        <w:t>Future things to check</w:t>
-      </w:r>
-    </w:p>
-    <w:p>
-      <w:pPr>
-        <w:rPr>
-          <w:lang w:val="en-US"/>
-        </w:rPr>
-      </w:pPr>
-      <w:r>
-        <w:rPr>
-          <w:lang w:val="en-US"/>
-        </w:rPr>
-        <w:t xml:space="preserve">Logfile </w:t>
-      </w:r>
-      <w:proofErr w:type="gramStart"/>
-      <w:r>
-        <w:rPr>
-          <w:lang w:val="en-US"/>
-        </w:rPr>
-        <w:t>has to</w:t>
-      </w:r>
-      <w:proofErr w:type="gramEnd"/>
-      <w:r>
-        <w:rPr>
-          <w:lang w:val="en-US"/>
-        </w:rPr>
-        <w:t xml:space="preserve"> be written again, but with less </w:t>
-      </w:r>
-      <w:proofErr w:type="spellStart"/>
-      <w:r>
-        <w:rPr>
-          <w:lang w:val="en-US"/>
-        </w:rPr>
-        <w:t>fopen</w:t>
-      </w:r>
-      <w:proofErr w:type="spellEnd"/>
-      <w:r>
-        <w:rPr>
-          <w:lang w:val="en-US"/>
-        </w:rPr>
-        <w:t>/</w:t>
-      </w:r>
-      <w:proofErr w:type="spellStart"/>
-      <w:r>
-        <w:rPr>
-          <w:lang w:val="en-US"/>
-        </w:rPr>
-        <w:t>fclose</w:t>
-      </w:r>
-      <w:proofErr w:type="spellEnd"/>
-      <w:r>
-        <w:rPr>
-          <w:lang w:val="en-US"/>
-        </w:rPr>
-        <w:t>/</w:t>
-      </w:r>
-      <w:proofErr w:type="spellStart"/>
-      <w:r>
-        <w:rPr>
-          <w:lang w:val="en-US"/>
-        </w:rPr>
-        <w:t>fflush</w:t>
-      </w:r>
-      <w:proofErr w:type="spellEnd"/>
-      <w:r>
-        <w:rPr>
-          <w:lang w:val="en-US"/>
-        </w:rPr>
-        <w:t>!</w:t>
-      </w:r>
-    </w:p>
-    <w:p>
-      <w:pPr>
-        <w:rPr>
-          <w:lang w:val="en-US"/>
-        </w:rPr>
-      </w:pPr>
-      <w:r>
-        <w:rPr>
-          <w:lang w:val="en-US"/>
-        </w:rPr>
-        <w:t xml:space="preserve">Possibly it's not that the logfile was being opened and closed, but that I don't clear the </w:t>
-      </w:r>
-      <w:proofErr w:type="spellStart"/>
-      <w:r>
-        <w:rPr>
-          <w:lang w:val="en-US"/>
-        </w:rPr>
-        <w:t>hashtable</w:t>
-      </w:r>
-      <w:proofErr w:type="spellEnd"/>
-      <w:r>
-        <w:rPr>
-          <w:lang w:val="en-US"/>
-        </w:rPr>
-        <w:t xml:space="preserve"> </w:t>
-      </w:r>
-      <w:proofErr w:type="spellStart"/>
-      <w:r>
-        <w:rPr>
-          <w:lang w:val="en-US"/>
-        </w:rPr>
-        <w:t>any more</w:t>
-      </w:r>
-      <w:proofErr w:type="spellEnd"/>
-      <w:r>
-        <w:rPr>
-          <w:lang w:val="en-US"/>
-        </w:rPr>
-        <w:t>!</w:t>
-      </w:r>
     </w:p>
     <w:p>
       <w:pPr>
@@ -7996,7 +7935,21 @@
         <w:rPr>
           <w:lang w:val="en-US"/>
         </w:rPr>
-        <w:t xml:space="preserve">Repetition issue: </w:t>
+        <w:lastRenderedPageBreak/>
+        <w:t>More parameters (20.5.2019)</w:t>
+      </w:r>
+    </w:p>
+    <w:p>
+      <w:pPr>
+        <w:rPr>
+          <w:lang w:val="en-US"/>
+        </w:rPr>
+      </w:pPr>
+      <w:r>
+        <w:rPr>
+          <w:lang w:val="en-US"/>
+        </w:rPr>
+        <w:t>I add another 9 parameters, now only tempo array is missing:</w:t>
       </w:r>
     </w:p>
     <w:p>
@@ -8010,10 +7963,10 @@
           <w:noProof/>
         </w:rPr>
         <w:drawing>
-          <wp:inline distT="0" distB="0" distL="0" distR="0" wp14:anchorId="208E9108" wp14:editId="3AF01288">
-            <wp:extent cx="3218786" cy="3693160"/>
-            <wp:effectExtent l="0" t="0" r="1270" b="2540"/>
-            <wp:docPr id="44" name="Picture 44"/>
+          <wp:inline distT="0" distB="0" distL="0" distR="0" wp14:anchorId="4EF23C93" wp14:editId="31DAF04D">
+            <wp:extent cx="1805373" cy="3741420"/>
+            <wp:effectExtent l="0" t="0" r="4445" b="0"/>
+            <wp:docPr id="57" name="Picture 57"/>
             <wp:cNvGraphicFramePr>
               <a:graphicFrameLocks xmlns:a="http://schemas.openxmlformats.org/drawingml/2006/main" noChangeAspect="1"/>
             </wp:cNvGraphicFramePr>
@@ -8033,6 +7986,1329 @@
                   <pic:spPr>
                     <a:xfrm>
                       <a:off x="0" y="0"/>
+                      <a:ext cx="1832051" cy="3796707"/>
+                    </a:xfrm>
+                    <a:prstGeom prst="rect">
+                      <a:avLst/>
+                    </a:prstGeom>
+                  </pic:spPr>
+                </pic:pic>
+              </a:graphicData>
+            </a:graphic>
+          </wp:inline>
+        </w:drawing>
+      </w:r>
+      <w:r>
+        <w:rPr>
+          <w:noProof/>
+        </w:rPr>
+        <w:drawing>
+          <wp:inline distT="0" distB="0" distL="0" distR="0" wp14:anchorId="33080A01" wp14:editId="1B8EA258">
+            <wp:extent cx="1801612" cy="3733625"/>
+            <wp:effectExtent l="0" t="0" r="8255" b="635"/>
+            <wp:docPr id="56" name="Picture 56"/>
+            <wp:cNvGraphicFramePr>
+              <a:graphicFrameLocks xmlns:a="http://schemas.openxmlformats.org/drawingml/2006/main" noChangeAspect="1"/>
+            </wp:cNvGraphicFramePr>
+            <a:graphic xmlns:a="http://schemas.openxmlformats.org/drawingml/2006/main">
+              <a:graphicData uri="http://schemas.openxmlformats.org/drawingml/2006/picture">
+                <pic:pic xmlns:pic="http://schemas.openxmlformats.org/drawingml/2006/picture">
+                  <pic:nvPicPr>
+                    <pic:cNvPr id="1" name=""/>
+                    <pic:cNvPicPr/>
+                  </pic:nvPicPr>
+                  <pic:blipFill>
+                    <a:blip r:embed="rId49"/>
+                    <a:stretch>
+                      <a:fillRect/>
+                    </a:stretch>
+                  </pic:blipFill>
+                  <pic:spPr>
+                    <a:xfrm>
+                      <a:off x="0" y="0"/>
+                      <a:ext cx="1833570" cy="3799853"/>
+                    </a:xfrm>
+                    <a:prstGeom prst="rect">
+                      <a:avLst/>
+                    </a:prstGeom>
+                  </pic:spPr>
+                </pic:pic>
+              </a:graphicData>
+            </a:graphic>
+          </wp:inline>
+        </w:drawing>
+      </w:r>
+      <w:r>
+        <w:rPr>
+          <w:noProof/>
+        </w:rPr>
+        <w:drawing>
+          <wp:inline distT="0" distB="0" distL="0" distR="0" wp14:anchorId="7B180F48" wp14:editId="0B24D623">
+            <wp:extent cx="1768568" cy="3740566"/>
+            <wp:effectExtent l="0" t="0" r="3175" b="0"/>
+            <wp:docPr id="55" name="Picture 55"/>
+            <wp:cNvGraphicFramePr>
+              <a:graphicFrameLocks xmlns:a="http://schemas.openxmlformats.org/drawingml/2006/main" noChangeAspect="1"/>
+            </wp:cNvGraphicFramePr>
+            <a:graphic xmlns:a="http://schemas.openxmlformats.org/drawingml/2006/main">
+              <a:graphicData uri="http://schemas.openxmlformats.org/drawingml/2006/picture">
+                <pic:pic xmlns:pic="http://schemas.openxmlformats.org/drawingml/2006/picture">
+                  <pic:nvPicPr>
+                    <pic:cNvPr id="1" name=""/>
+                    <pic:cNvPicPr/>
+                  </pic:nvPicPr>
+                  <pic:blipFill>
+                    <a:blip r:embed="rId50"/>
+                    <a:stretch>
+                      <a:fillRect/>
+                    </a:stretch>
+                  </pic:blipFill>
+                  <pic:spPr>
+                    <a:xfrm>
+                      <a:off x="0" y="0"/>
+                      <a:ext cx="1808727" cy="3825502"/>
+                    </a:xfrm>
+                    <a:prstGeom prst="rect">
+                      <a:avLst/>
+                    </a:prstGeom>
+                  </pic:spPr>
+                </pic:pic>
+              </a:graphicData>
+            </a:graphic>
+          </wp:inline>
+        </w:drawing>
+      </w:r>
+    </w:p>
+    <w:p>
+      <w:pPr>
+        <w:rPr>
+          <w:lang w:val="en-US"/>
+        </w:rPr>
+      </w:pPr>
+    </w:p>
+    <w:p>
+      <w:pPr>
+        <w:rPr>
+          <w:lang w:val="en-US"/>
+        </w:rPr>
+      </w:pPr>
+      <w:r>
+        <w:rPr>
+          <w:lang w:val="en-US"/>
+        </w:rPr>
+        <w:t xml:space="preserve">I see negative values for </w:t>
+      </w:r>
+      <w:proofErr w:type="spellStart"/>
+      <w:r>
+        <w:rPr>
+          <w:lang w:val="en-US"/>
+        </w:rPr>
+        <w:t>immobile_mult</w:t>
+      </w:r>
+      <w:proofErr w:type="spellEnd"/>
+      <w:r>
+        <w:rPr>
+          <w:lang w:val="en-US"/>
+        </w:rPr>
+        <w:t xml:space="preserve"> and </w:t>
+      </w:r>
+      <w:proofErr w:type="spellStart"/>
+      <w:r>
+        <w:rPr>
+          <w:lang w:val="en-US"/>
+        </w:rPr>
+        <w:t>augment_dogholeval</w:t>
+      </w:r>
+      <w:proofErr w:type="spellEnd"/>
+      <w:r>
+        <w:rPr>
+          <w:lang w:val="en-US"/>
+        </w:rPr>
+        <w:t xml:space="preserve">, which means something is wrong. I look at these and get the feeling that both are seeing stupid things: </w:t>
+      </w:r>
+      <w:proofErr w:type="spellStart"/>
+      <w:r>
+        <w:rPr>
+          <w:lang w:val="en-US"/>
+        </w:rPr>
+        <w:t>immobile_mult</w:t>
+      </w:r>
+      <w:proofErr w:type="spellEnd"/>
+      <w:r>
+        <w:rPr>
+          <w:lang w:val="en-US"/>
+        </w:rPr>
+        <w:t xml:space="preserve"> is mainly seeing men on the back rank that are immobile, but that make sense there; </w:t>
+      </w:r>
+      <w:proofErr w:type="spellStart"/>
+      <w:r>
+        <w:rPr>
+          <w:lang w:val="en-US"/>
+        </w:rPr>
+        <w:t>augment_dogholeval</w:t>
+      </w:r>
+      <w:proofErr w:type="spellEnd"/>
+      <w:r>
+        <w:rPr>
+          <w:lang w:val="en-US"/>
+        </w:rPr>
+        <w:t xml:space="preserve"> is seeing compensation where there is nothing, or rather, the compensation I was giving before that is ridiculous so the optimizer was counteracting it strongly with the </w:t>
+      </w:r>
+      <w:proofErr w:type="spellStart"/>
+      <w:r>
+        <w:rPr>
+          <w:lang w:val="en-US"/>
+        </w:rPr>
+        <w:t>augment_dogholeval</w:t>
+      </w:r>
+      <w:proofErr w:type="spellEnd"/>
+      <w:r>
+        <w:rPr>
+          <w:lang w:val="en-US"/>
+        </w:rPr>
+        <w:t xml:space="preserve"> parameter. </w:t>
+      </w:r>
+    </w:p>
+    <w:p>
+      <w:pPr>
+        <w:rPr>
+          <w:lang w:val="en-US"/>
+        </w:rPr>
+      </w:pPr>
+      <w:r>
+        <w:rPr>
+          <w:lang w:val="en-US"/>
+        </w:rPr>
+        <w:t xml:space="preserve">I change the whole eval around </w:t>
+      </w:r>
+      <w:proofErr w:type="spellStart"/>
+      <w:r>
+        <w:rPr>
+          <w:lang w:val="en-US"/>
+        </w:rPr>
+        <w:t>augment_dogholeval</w:t>
+      </w:r>
+      <w:proofErr w:type="spellEnd"/>
+      <w:r>
+        <w:rPr>
+          <w:lang w:val="en-US"/>
+        </w:rPr>
+        <w:t xml:space="preserve"> and give it a new name as </w:t>
+      </w:r>
+      <w:proofErr w:type="spellStart"/>
+      <w:r>
+        <w:rPr>
+          <w:lang w:val="en-US"/>
+        </w:rPr>
+        <w:t>compensation_mandown</w:t>
+      </w:r>
+      <w:proofErr w:type="spellEnd"/>
+      <w:r>
+        <w:rPr>
+          <w:lang w:val="en-US"/>
+        </w:rPr>
+        <w:t xml:space="preserve"> (given if only men, man-down-side with strong back rank + a runaway)</w:t>
+      </w:r>
+      <w:r>
+        <w:rPr>
+          <w:lang w:val="en-US"/>
+        </w:rPr>
+        <w:t>; the entire code is also much simpler and clearer now.</w:t>
+      </w:r>
+    </w:p>
+    <w:p>
+      <w:pPr>
+        <w:rPr>
+          <w:lang w:val="en-US"/>
+        </w:rPr>
+      </w:pPr>
+      <w:r>
+        <w:rPr>
+          <w:lang w:val="en-US"/>
+        </w:rPr>
+        <w:t xml:space="preserve">I change the </w:t>
+      </w:r>
+      <w:proofErr w:type="spellStart"/>
+      <w:r>
+        <w:rPr>
+          <w:lang w:val="en-US"/>
+        </w:rPr>
+        <w:t>immobile_mult</w:t>
+      </w:r>
+      <w:proofErr w:type="spellEnd"/>
+      <w:r>
+        <w:rPr>
+          <w:lang w:val="en-US"/>
+        </w:rPr>
+        <w:t xml:space="preserve"> evaluation to penalize only ungrounded men so all men on edge + </w:t>
+      </w:r>
+      <w:proofErr w:type="spellStart"/>
+      <w:r>
+        <w:rPr>
+          <w:lang w:val="en-US"/>
+        </w:rPr>
+        <w:t>backrank</w:t>
+      </w:r>
+      <w:proofErr w:type="spellEnd"/>
+      <w:r>
+        <w:rPr>
+          <w:lang w:val="en-US"/>
+        </w:rPr>
+        <w:t xml:space="preserve"> that are immobile no longer count.</w:t>
+      </w:r>
+    </w:p>
+    <w:p>
+      <w:pPr>
+        <w:rPr>
+          <w:lang w:val="en-US"/>
+        </w:rPr>
+      </w:pPr>
+      <w:proofErr w:type="spellStart"/>
+      <w:r>
+        <w:rPr>
+          <w:lang w:val="en-US"/>
+        </w:rPr>
+        <w:t>King_no_mobility</w:t>
+      </w:r>
+      <w:proofErr w:type="spellEnd"/>
+      <w:r>
+        <w:rPr>
+          <w:lang w:val="en-US"/>
+        </w:rPr>
+        <w:t xml:space="preserve"> is also negative indicating that something is wrong; but I don't see how to fix it easily, will try this later.</w:t>
+      </w:r>
+    </w:p>
+    <w:p>
+      <w:pPr>
+        <w:rPr>
+          <w:lang w:val="en-US"/>
+        </w:rPr>
+      </w:pPr>
+      <w:r>
+        <w:rPr>
+          <w:lang w:val="en-US"/>
+        </w:rPr>
+        <w:t>I rerun the optimizer in the hope that the error becomes smaller than it was originally!</w:t>
+      </w:r>
+      <w:r>
+        <w:rPr>
+          <w:lang w:val="en-US"/>
+        </w:rPr>
+        <w:t xml:space="preserve"> (0.2189668 old), and it is</w:t>
+      </w:r>
+      <w:r>
+        <w:rPr>
+          <w:lang w:val="en-US"/>
+        </w:rPr>
+        <w:t xml:space="preserve"> </w:t>
+      </w:r>
+      <w:r>
+        <w:rPr>
+          <w:lang w:val="en-US"/>
+        </w:rPr>
+        <w:t xml:space="preserve">better </w:t>
+      </w:r>
+      <w:r>
+        <w:rPr>
+          <w:lang w:val="en-US"/>
+        </w:rPr>
+        <w:t>new</w:t>
+      </w:r>
+      <w:r>
+        <w:rPr>
+          <w:lang w:val="en-US"/>
+        </w:rPr>
+        <w:t xml:space="preserve">: </w:t>
+      </w:r>
+      <w:r>
+        <w:rPr>
+          <w:lang w:val="en-US"/>
+        </w:rPr>
+        <w:t>0.2187939</w:t>
+      </w:r>
+    </w:p>
+    <w:p>
+      <w:pPr>
+        <w:rPr>
+          <w:lang w:val="en-US"/>
+        </w:rPr>
+      </w:pPr>
+      <w:r>
+        <w:rPr>
+          <w:lang w:val="en-US"/>
+        </w:rPr>
+        <w:t xml:space="preserve">Also, </w:t>
+      </w:r>
+      <w:proofErr w:type="spellStart"/>
+      <w:r>
+        <w:rPr>
+          <w:lang w:val="en-US"/>
+        </w:rPr>
+        <w:t>backrankpower</w:t>
+      </w:r>
+      <w:proofErr w:type="spellEnd"/>
+      <w:r>
+        <w:rPr>
+          <w:lang w:val="en-US"/>
+        </w:rPr>
+        <w:t xml:space="preserve"> values are suddenly there where I expected them to be </w:t>
+      </w:r>
+      <w:r>
+        <w:rPr>
+          <mc:AlternateContent>
+            <mc:Choice Requires="w16se"/>
+            <mc:Fallback>
+              <w:rFonts w:ascii="Segoe UI Emoji" w:eastAsia="Segoe UI Emoji" w:hAnsi="Segoe UI Emoji" w:cs="Segoe UI Emoji"/>
+            </mc:Fallback>
+          </mc:AlternateContent>
+          <w:lang w:val="en-US"/>
+        </w:rPr>
+        <mc:AlternateContent>
+          <mc:Choice Requires="w16se">
+            <w16se:symEx w16se:font="Segoe UI Emoji" w16se:char="1F60A"/>
+          </mc:Choice>
+          <mc:Fallback>
+            <w:t>😊</w:t>
+          </mc:Fallback>
+        </mc:AlternateContent>
+      </w:r>
+    </w:p>
+    <w:p>
+      <w:pPr>
+        <w:rPr>
+          <w:lang w:val="en-US"/>
+        </w:rPr>
+      </w:pPr>
+    </w:p>
+    <w:p>
+      <w:pPr>
+        <w:rPr>
+          <w:noProof/>
+        </w:rPr>
+      </w:pPr>
+      <w:r>
+        <w:rPr>
+          <w:noProof/>
+        </w:rPr>
+        <w:lastRenderedPageBreak/>
+        <w:drawing>
+          <wp:inline distT="0" distB="0" distL="0" distR="0" wp14:anchorId="00401168" wp14:editId="600AE538">
+            <wp:extent cx="1778225" cy="3052445"/>
+            <wp:effectExtent l="0" t="0" r="0" b="0"/>
+            <wp:docPr id="59" name="Picture 59"/>
+            <wp:cNvGraphicFramePr>
+              <a:graphicFrameLocks xmlns:a="http://schemas.openxmlformats.org/drawingml/2006/main" noChangeAspect="1"/>
+            </wp:cNvGraphicFramePr>
+            <a:graphic xmlns:a="http://schemas.openxmlformats.org/drawingml/2006/main">
+              <a:graphicData uri="http://schemas.openxmlformats.org/drawingml/2006/picture">
+                <pic:pic xmlns:pic="http://schemas.openxmlformats.org/drawingml/2006/picture">
+                  <pic:nvPicPr>
+                    <pic:cNvPr id="1" name=""/>
+                    <pic:cNvPicPr/>
+                  </pic:nvPicPr>
+                  <pic:blipFill>
+                    <a:blip r:embed="rId51"/>
+                    <a:stretch>
+                      <a:fillRect/>
+                    </a:stretch>
+                  </pic:blipFill>
+                  <pic:spPr>
+                    <a:xfrm>
+                      <a:off x="0" y="0"/>
+                      <a:ext cx="1803603" cy="3096008"/>
+                    </a:xfrm>
+                    <a:prstGeom prst="rect">
+                      <a:avLst/>
+                    </a:prstGeom>
+                  </pic:spPr>
+                </pic:pic>
+              </a:graphicData>
+            </a:graphic>
+          </wp:inline>
+        </w:drawing>
+      </w:r>
+      <w:r>
+        <w:rPr>
+          <w:noProof/>
+        </w:rPr>
+        <w:drawing>
+          <wp:inline distT="0" distB="0" distL="0" distR="0" wp14:anchorId="1C845798" wp14:editId="4EC5352B">
+            <wp:extent cx="1771197" cy="3040380"/>
+            <wp:effectExtent l="0" t="0" r="635" b="7620"/>
+            <wp:docPr id="60" name="Picture 60"/>
+            <wp:cNvGraphicFramePr>
+              <a:graphicFrameLocks xmlns:a="http://schemas.openxmlformats.org/drawingml/2006/main" noChangeAspect="1"/>
+            </wp:cNvGraphicFramePr>
+            <a:graphic xmlns:a="http://schemas.openxmlformats.org/drawingml/2006/main">
+              <a:graphicData uri="http://schemas.openxmlformats.org/drawingml/2006/picture">
+                <pic:pic xmlns:pic="http://schemas.openxmlformats.org/drawingml/2006/picture">
+                  <pic:nvPicPr>
+                    <pic:cNvPr id="1" name=""/>
+                    <pic:cNvPicPr/>
+                  </pic:nvPicPr>
+                  <pic:blipFill>
+                    <a:blip r:embed="rId52"/>
+                    <a:stretch>
+                      <a:fillRect/>
+                    </a:stretch>
+                  </pic:blipFill>
+                  <pic:spPr>
+                    <a:xfrm>
+                      <a:off x="0" y="0"/>
+                      <a:ext cx="1857992" cy="3189369"/>
+                    </a:xfrm>
+                    <a:prstGeom prst="rect">
+                      <a:avLst/>
+                    </a:prstGeom>
+                  </pic:spPr>
+                </pic:pic>
+              </a:graphicData>
+            </a:graphic>
+          </wp:inline>
+        </w:drawing>
+      </w:r>
+      <w:r>
+        <w:rPr>
+          <w:noProof/>
+        </w:rPr>
+        <w:drawing>
+          <wp:anchor distT="0" distB="0" distL="114300" distR="114300" simplePos="0" relativeHeight="251658240" behindDoc="0" locked="0" layoutInCell="1" allowOverlap="1" wp14:anchorId="0E105077" wp14:editId="67ADA5A5">
+            <wp:simplePos x="899160" y="899160"/>
+            <wp:positionH relativeFrom="column">
+              <wp:align>left</wp:align>
+            </wp:positionH>
+            <wp:positionV relativeFrom="paragraph">
+              <wp:align>top</wp:align>
+            </wp:positionV>
+            <wp:extent cx="1771195" cy="3040380"/>
+            <wp:effectExtent l="0" t="0" r="635" b="7620"/>
+            <wp:wrapSquare wrapText="bothSides"/>
+            <wp:docPr id="58" name="Picture 58"/>
+            <wp:cNvGraphicFramePr>
+              <a:graphicFrameLocks xmlns:a="http://schemas.openxmlformats.org/drawingml/2006/main" noChangeAspect="1"/>
+            </wp:cNvGraphicFramePr>
+            <a:graphic xmlns:a="http://schemas.openxmlformats.org/drawingml/2006/main">
+              <a:graphicData uri="http://schemas.openxmlformats.org/drawingml/2006/picture">
+                <pic:pic xmlns:pic="http://schemas.openxmlformats.org/drawingml/2006/picture">
+                  <pic:nvPicPr>
+                    <pic:cNvPr id="1" name=""/>
+                    <pic:cNvPicPr/>
+                  </pic:nvPicPr>
+                  <pic:blipFill>
+                    <a:blip r:embed="rId53" cstate="print">
+                      <a:extLst>
+                        <a:ext uri="{28A0092B-C50C-407E-A947-70E740481C1C}">
+                          <a14:useLocalDpi xmlns:a14="http://schemas.microsoft.com/office/drawing/2010/main" val="0"/>
+                        </a:ext>
+                      </a:extLst>
+                    </a:blip>
+                    <a:stretch>
+                      <a:fillRect/>
+                    </a:stretch>
+                  </pic:blipFill>
+                  <pic:spPr>
+                    <a:xfrm>
+                      <a:off x="0" y="0"/>
+                      <a:ext cx="1771195" cy="3040380"/>
+                    </a:xfrm>
+                    <a:prstGeom prst="rect">
+                      <a:avLst/>
+                    </a:prstGeom>
+                  </pic:spPr>
+                </pic:pic>
+              </a:graphicData>
+            </a:graphic>
+          </wp:anchor>
+        </w:drawing>
+      </w:r>
+    </w:p>
+    <w:p>
+      <w:pPr>
+        <w:rPr>
+          <w:lang w:val="en-US"/>
+        </w:rPr>
+      </w:pPr>
+    </w:p>
+    <w:p>
+      <w:pPr>
+        <w:rPr>
+          <w:lang w:val="en-US"/>
+        </w:rPr>
+      </w:pPr>
+    </w:p>
+    <w:p>
+      <w:pPr>
+        <w:rPr>
+          <w:lang w:val="en-US"/>
+        </w:rPr>
+      </w:pPr>
+    </w:p>
+    <w:p>
+      <w:pPr>
+        <w:rPr>
+          <w:lang w:val="en-US"/>
+        </w:rPr>
+      </w:pPr>
+    </w:p>
+    <w:p>
+      <w:pPr>
+        <w:rPr>
+          <w:lang w:val="en-US"/>
+        </w:rPr>
+      </w:pPr>
+    </w:p>
+    <w:p>
+      <w:pPr>
+        <w:rPr>
+          <w:lang w:val="en-US"/>
+        </w:rPr>
+      </w:pPr>
+    </w:p>
+    <w:p>
+      <w:pPr>
+        <w:rPr>
+          <w:lang w:val="en-US"/>
+        </w:rPr>
+      </w:pPr>
+    </w:p>
+    <w:p>
+      <w:pPr>
+        <w:rPr>
+          <w:noProof/>
+        </w:rPr>
+      </w:pPr>
+    </w:p>
+    <w:p>
+      <w:pPr>
+        <w:rPr>
+          <w:lang w:val="en-US"/>
+        </w:rPr>
+      </w:pPr>
+      <w:r>
+        <w:rPr>
+          <w:lang w:val="en-US"/>
+        </w:rPr>
+        <w:br w:type="textWrapping" w:clear="all"/>
+      </w:r>
+    </w:p>
+    <w:p>
+      <w:pPr>
+        <w:rPr>
+          <w:lang w:val="en-US"/>
+        </w:rPr>
+      </w:pPr>
+      <w:r>
+        <w:rPr>
+          <w:lang w:val="en-US"/>
+        </w:rPr>
+        <w:t xml:space="preserve">Now it only </w:t>
+      </w:r>
+      <w:proofErr w:type="gramStart"/>
+      <w:r>
+        <w:rPr>
+          <w:lang w:val="en-US"/>
+        </w:rPr>
+        <w:t>has to</w:t>
+      </w:r>
+      <w:proofErr w:type="gramEnd"/>
+      <w:r>
+        <w:rPr>
+          <w:lang w:val="en-US"/>
+        </w:rPr>
+        <w:t xml:space="preserve"> work in the match…</w:t>
+      </w:r>
+    </w:p>
+    <w:p>
+      <w:pPr>
+        <w:rPr>
+          <w:lang w:val="en-US"/>
+        </w:rPr>
+      </w:pPr>
+    </w:p>
+    <w:p>
+      <w:pPr>
+        <w:rPr>
+          <w:lang w:val="en-US"/>
+        </w:rPr>
+      </w:pPr>
+    </w:p>
+    <w:p>
+      <w:pPr>
+        <w:rPr>
+          <w:lang w:val="en-US"/>
+        </w:rPr>
+      </w:pPr>
+    </w:p>
+    <w:p>
+      <w:pPr>
+        <w:rPr>
+          <w:lang w:val="en-US"/>
+        </w:rPr>
+      </w:pPr>
+    </w:p>
+    <w:p>
+      <w:pPr>
+        <w:pStyle w:val="Heading2"/>
+        <w:rPr>
+          <w:lang w:val="en-US"/>
+        </w:rPr>
+      </w:pPr>
+      <w:r>
+        <w:rPr>
+          <w:lang w:val="en-US"/>
+        </w:rPr>
+        <w:t>Roadmap for Cake 1.86 (only eval!)</w:t>
+      </w:r>
+    </w:p>
+    <w:p>
+      <w:pPr>
+        <w:pStyle w:val="ListParagraph"/>
+        <w:numPr>
+          <w:ilvl w:val="0"/>
+          <w:numId w:val="5"/>
+        </w:numPr>
+        <w:rPr>
+          <w:lang w:val="en-US"/>
+        </w:rPr>
+      </w:pPr>
+      <w:r>
+        <w:rPr>
+          <w:lang w:val="en-US"/>
+        </w:rPr>
+        <w:t xml:space="preserve">Make all remaining parameters accessible for </w:t>
+      </w:r>
+      <w:proofErr w:type="gramStart"/>
+      <w:r>
+        <w:rPr>
+          <w:lang w:val="en-US"/>
+        </w:rPr>
+        <w:t>optimizer  (</w:t>
+      </w:r>
+      <w:proofErr w:type="gramEnd"/>
+      <w:r>
+        <w:rPr>
+          <w:lang w:val="en-US"/>
+        </w:rPr>
+        <w:t xml:space="preserve">already added last 9, finish with adding </w:t>
+      </w:r>
+      <w:proofErr w:type="spellStart"/>
+      <w:r>
+        <w:rPr>
+          <w:lang w:val="en-US"/>
+        </w:rPr>
+        <w:t>tmod</w:t>
+      </w:r>
+      <w:proofErr w:type="spellEnd"/>
+      <w:r>
+        <w:rPr>
+          <w:lang w:val="en-US"/>
+        </w:rPr>
+        <w:t xml:space="preserve"> array!), and run optimization + matches</w:t>
+      </w:r>
+    </w:p>
+    <w:p>
+      <w:pPr>
+        <w:pStyle w:val="ListParagraph"/>
+        <w:numPr>
+          <w:ilvl w:val="0"/>
+          <w:numId w:val="5"/>
+        </w:numPr>
+        <w:rPr>
+          <w:lang w:val="en-US"/>
+        </w:rPr>
+      </w:pPr>
+      <w:r>
+        <w:rPr>
+          <w:lang w:val="en-US"/>
+        </w:rPr>
+        <w:t>Identify parameters to remove in the end (obviously all parameters with weight 0), but perhaps also check for each parameter what happens if I set it to 0?</w:t>
+      </w:r>
+    </w:p>
+    <w:p>
+      <w:pPr>
+        <w:pStyle w:val="ListParagraph"/>
+        <w:numPr>
+          <w:ilvl w:val="0"/>
+          <w:numId w:val="5"/>
+        </w:numPr>
+        <w:rPr>
+          <w:lang w:val="en-US"/>
+        </w:rPr>
+      </w:pPr>
+      <w:r>
+        <w:rPr>
+          <w:lang w:val="en-US"/>
+        </w:rPr>
+        <w:t xml:space="preserve">Perhaps: divide </w:t>
+      </w:r>
+      <w:proofErr w:type="spellStart"/>
+      <w:r>
+        <w:rPr>
+          <w:lang w:val="en-US"/>
+        </w:rPr>
+        <w:t>fineeval</w:t>
+      </w:r>
+      <w:proofErr w:type="spellEnd"/>
+      <w:r>
+        <w:rPr>
+          <w:lang w:val="en-US"/>
+        </w:rPr>
+        <w:t xml:space="preserve"> return value by 2 or 4 to allow finer grained eval and rerun optimizer?</w:t>
+      </w:r>
+    </w:p>
+    <w:p>
+      <w:pPr>
+        <w:pStyle w:val="ListParagraph"/>
+        <w:numPr>
+          <w:ilvl w:val="0"/>
+          <w:numId w:val="5"/>
+        </w:numPr>
+        <w:rPr>
+          <w:lang w:val="en-US"/>
+        </w:rPr>
+      </w:pPr>
+      <w:r>
+        <w:rPr>
+          <w:lang w:val="en-US"/>
+        </w:rPr>
+        <w:t>Menial task: logfile</w:t>
+      </w:r>
+    </w:p>
+    <w:p>
+      <w:pPr>
+        <w:pStyle w:val="ListParagraph"/>
+        <w:numPr>
+          <w:ilvl w:val="0"/>
+          <w:numId w:val="5"/>
+        </w:numPr>
+        <w:rPr>
+          <w:lang w:val="en-US"/>
+        </w:rPr>
+      </w:pPr>
+      <w:r>
+        <w:rPr>
+          <w:lang w:val="en-US"/>
+        </w:rPr>
+        <w:t>Menial task: repetition draws?</w:t>
+      </w:r>
+    </w:p>
+    <w:p>
+      <w:pPr>
+        <w:pStyle w:val="ListParagraph"/>
+        <w:numPr>
+          <w:ilvl w:val="0"/>
+          <w:numId w:val="5"/>
+        </w:numPr>
+        <w:rPr>
+          <w:lang w:val="en-US"/>
+        </w:rPr>
+      </w:pPr>
+      <w:r>
+        <w:rPr>
+          <w:lang w:val="en-US"/>
+        </w:rPr>
+        <w:lastRenderedPageBreak/>
+        <w:t xml:space="preserve">Menial task: return a fail high but not completed move from MTDF if </w:t>
+      </w:r>
+      <w:proofErr w:type="spellStart"/>
+      <w:r>
+        <w:rPr>
+          <w:lang w:val="en-US"/>
+        </w:rPr>
+        <w:t>si</w:t>
+      </w:r>
+      <w:proofErr w:type="spellEnd"/>
+      <w:r>
+        <w:rPr>
+          <w:lang w:val="en-US"/>
+        </w:rPr>
+        <w:t>-&gt;play!</w:t>
+      </w:r>
+      <w:r>
+        <w:rPr>
+          <w:lang w:val="en-US"/>
+        </w:rPr>
+        <w:t xml:space="preserve"> (FASTUPDATE?)</w:t>
+      </w:r>
+    </w:p>
+    <w:p>
+      <w:pPr>
+        <w:rPr>
+          <w:lang w:val="en-US"/>
+        </w:rPr>
+      </w:pPr>
+    </w:p>
+    <w:p>
+      <w:pPr>
+        <w:pStyle w:val="ListParagraph"/>
+        <w:numPr>
+          <w:ilvl w:val="0"/>
+          <w:numId w:val="6"/>
+        </w:numPr>
+        <w:rPr>
+          <w:lang w:val="en-US"/>
+        </w:rPr>
+      </w:pPr>
+      <w:r>
+        <w:rPr>
+          <w:lang w:val="en-US"/>
+        </w:rPr>
+        <w:t>Find all losses of Cake in 5s classic match to make a test set</w:t>
+      </w:r>
+    </w:p>
+    <w:p>
+      <w:pPr>
+        <w:rPr>
+          <w:lang w:val="en-US"/>
+        </w:rPr>
+      </w:pPr>
+    </w:p>
+    <w:p>
+      <w:pPr>
+        <w:pStyle w:val="Heading2"/>
+        <w:rPr>
+          <w:lang w:val="en-US"/>
+        </w:rPr>
+      </w:pPr>
+      <w:r>
+        <w:rPr>
+          <w:lang w:val="en-US"/>
+        </w:rPr>
+        <w:t>Roadmap for Cake 1.87 (only eval!)</w:t>
+      </w:r>
+    </w:p>
+    <w:p>
+      <w:pPr>
+        <w:pStyle w:val="ListParagraph"/>
+        <w:numPr>
+          <w:ilvl w:val="0"/>
+          <w:numId w:val="5"/>
+        </w:numPr>
+        <w:rPr>
+          <w:lang w:val="en-US"/>
+        </w:rPr>
+      </w:pPr>
+      <w:r>
+        <w:rPr>
+          <w:lang w:val="en-US"/>
+        </w:rPr>
+        <w:t>Test further parameters (ungrounded contacts, backward men as nascent issue, endangered bridgehead)</w:t>
+      </w:r>
+    </w:p>
+    <w:p>
+      <w:pPr>
+        <w:pStyle w:val="ListParagraph"/>
+        <w:numPr>
+          <w:ilvl w:val="0"/>
+          <w:numId w:val="5"/>
+        </w:numPr>
+        <w:rPr>
+          <w:lang w:val="en-US"/>
+        </w:rPr>
+      </w:pPr>
+      <w:r>
+        <w:rPr>
+          <w:lang w:val="en-US"/>
+        </w:rPr>
+        <w:t xml:space="preserve">Expand </w:t>
+      </w:r>
+      <w:proofErr w:type="spellStart"/>
+      <w:r>
+        <w:rPr>
+          <w:lang w:val="en-US"/>
+        </w:rPr>
+        <w:t>backrank</w:t>
+      </w:r>
+      <w:proofErr w:type="spellEnd"/>
+      <w:r>
+        <w:rPr>
+          <w:lang w:val="en-US"/>
+        </w:rPr>
+        <w:t xml:space="preserve"> to 256 values instead of 32</w:t>
+      </w:r>
+      <w:r>
+        <w:rPr>
+          <w:lang w:val="en-US"/>
+        </w:rPr>
+        <w:br/>
+      </w:r>
+      <w:r>
+        <w:rPr>
+          <w:lang w:val="en-US"/>
+        </w:rPr>
+        <w:br/>
+      </w:r>
+    </w:p>
+    <w:p>
+      <w:pPr>
+        <w:pStyle w:val="ListParagraph"/>
+        <w:numPr>
+          <w:ilvl w:val="0"/>
+          <w:numId w:val="6"/>
+        </w:numPr>
+        <w:rPr>
+          <w:lang w:val="en-US"/>
+        </w:rPr>
+      </w:pPr>
+      <w:r>
+        <w:rPr>
+          <w:lang w:val="en-US"/>
+        </w:rPr>
+        <w:t>Run longer matches (1-5s) as baselines for search changes!</w:t>
+      </w:r>
+    </w:p>
+    <w:p>
+      <w:pPr>
+        <w:pStyle w:val="Heading2"/>
+        <w:rPr>
+          <w:lang w:val="en-US"/>
+        </w:rPr>
+      </w:pPr>
+      <w:r>
+        <w:rPr>
+          <w:lang w:val="en-US"/>
+        </w:rPr>
+        <w:t>Roadmap for Cake 1.88 (only eval!)</w:t>
+      </w:r>
+    </w:p>
+    <w:p>
+      <w:pPr>
+        <w:pStyle w:val="ListParagraph"/>
+        <w:numPr>
+          <w:ilvl w:val="0"/>
+          <w:numId w:val="5"/>
+        </w:numPr>
+        <w:rPr>
+          <w:lang w:val="en-US"/>
+        </w:rPr>
+      </w:pPr>
+      <w:r>
+        <w:rPr>
+          <w:lang w:val="en-US"/>
+        </w:rPr>
+        <w:t>Try stone dependent dual eval, perhaps starting with those parameters first that make the biggest difference</w:t>
+      </w:r>
+    </w:p>
+    <w:p>
+      <w:pPr>
+        <w:pStyle w:val="Heading2"/>
+        <w:rPr>
+          <w:lang w:val="en-US"/>
+        </w:rPr>
+      </w:pPr>
+      <w:r>
+        <w:rPr>
+          <w:lang w:val="en-US"/>
+        </w:rPr>
+        <w:t>Roadmap for Cake 1.8</w:t>
+      </w:r>
+      <w:r>
+        <w:rPr>
+          <w:lang w:val="en-US"/>
+        </w:rPr>
+        <w:t>9</w:t>
+      </w:r>
+      <w:r>
+        <w:rPr>
+          <w:lang w:val="en-US"/>
+        </w:rPr>
+        <w:t xml:space="preserve"> (search!)</w:t>
+      </w:r>
+    </w:p>
+    <w:p>
+      <w:pPr>
+        <w:pStyle w:val="ListParagraph"/>
+        <w:numPr>
+          <w:ilvl w:val="0"/>
+          <w:numId w:val="5"/>
+        </w:numPr>
+        <w:rPr>
+          <w:lang w:val="en-US"/>
+        </w:rPr>
+      </w:pPr>
+      <w:r>
+        <w:rPr>
+          <w:lang w:val="en-US"/>
+        </w:rPr>
+        <w:t>Try increasing pruning since hopefully eval will be better than it used to be</w:t>
+      </w:r>
+    </w:p>
+    <w:p>
+      <w:pPr>
+        <w:pStyle w:val="ListParagraph"/>
+        <w:numPr>
+          <w:ilvl w:val="0"/>
+          <w:numId w:val="5"/>
+        </w:numPr>
+        <w:rPr>
+          <w:lang w:val="en-US"/>
+        </w:rPr>
+      </w:pPr>
+      <w:r>
+        <w:rPr>
+          <w:lang w:val="en-US"/>
+        </w:rPr>
+        <w:t>Look into LMR again ("</w:t>
+      </w:r>
+      <w:r>
+        <w:rPr>
+          <w:lang w:val="en-US"/>
+        </w:rPr>
+        <w:t xml:space="preserve">I added </w:t>
+      </w:r>
+      <w:proofErr w:type="spellStart"/>
+      <w:r>
+        <w:rPr>
+          <w:lang w:val="en-US"/>
+        </w:rPr>
+        <w:t>lmr</w:t>
+      </w:r>
+      <w:proofErr w:type="spellEnd"/>
+      <w:r>
+        <w:rPr>
+          <w:lang w:val="en-US"/>
+        </w:rPr>
+        <w:t xml:space="preserve"> to </w:t>
+      </w:r>
+      <w:proofErr w:type="spellStart"/>
+      <w:r>
+        <w:rPr>
+          <w:lang w:val="en-US"/>
+        </w:rPr>
+        <w:t>kingsrow</w:t>
+      </w:r>
+      <w:proofErr w:type="spellEnd"/>
+      <w:r>
+        <w:rPr>
+          <w:lang w:val="en-US"/>
+        </w:rPr>
+        <w:t xml:space="preserve"> a few years ago and it seems to work quite well. Very simple to implement also. I reduce by 1 ply for the second, third, and 4th moves, and 2 plies for any additional moves ranked below those.</w:t>
+      </w:r>
+      <w:r>
+        <w:rPr>
+          <w:lang w:val="en-US"/>
+        </w:rPr>
+        <w:t>"</w:t>
+      </w:r>
+      <w:r>
+        <w:rPr>
+          <w:lang w:val="en-US"/>
+        </w:rPr>
+        <w:t>(</w:t>
+      </w:r>
+    </w:p>
+    <w:p>
+      <w:pPr>
+        <w:pStyle w:val="ListParagraph"/>
+        <w:numPr>
+          <w:ilvl w:val="0"/>
+          <w:numId w:val="5"/>
+        </w:numPr>
+        <w:rPr>
+          <w:lang w:val="en-US"/>
+        </w:rPr>
+      </w:pPr>
+      <w:r>
+        <w:rPr>
+          <w:lang w:val="en-US"/>
+        </w:rPr>
+        <w:t xml:space="preserve">Look at </w:t>
+      </w:r>
+      <w:proofErr w:type="spellStart"/>
+      <w:r>
+        <w:rPr>
+          <w:lang w:val="en-US"/>
+        </w:rPr>
+        <w:t>Qsearch</w:t>
+      </w:r>
+      <w:proofErr w:type="spellEnd"/>
+      <w:r>
+        <w:rPr>
+          <w:lang w:val="en-US"/>
+        </w:rPr>
+        <w:t xml:space="preserve"> again, separate into squeeze and pitch moves and see if either or combined helps</w:t>
+      </w:r>
+    </w:p>
+    <w:p>
+      <w:pPr>
+        <w:rPr>
+          <w:lang w:val="en-US"/>
+        </w:rPr>
+      </w:pPr>
+    </w:p>
+    <w:p>
+      <w:pPr>
+        <w:pStyle w:val="Heading2"/>
+        <w:rPr>
+          <w:lang w:val="en-US"/>
+        </w:rPr>
+      </w:pPr>
+      <w:r>
+        <w:rPr>
+          <w:lang w:val="en-US"/>
+        </w:rPr>
+        <w:t>Future things to check</w:t>
+      </w:r>
+    </w:p>
+    <w:p>
+      <w:pPr>
+        <w:rPr>
+          <w:lang w:val="en-US"/>
+        </w:rPr>
+      </w:pPr>
+      <w:r>
+        <w:rPr>
+          <w:lang w:val="en-US"/>
+        </w:rPr>
+        <w:t xml:space="preserve">Logfile </w:t>
+      </w:r>
+      <w:proofErr w:type="gramStart"/>
+      <w:r>
+        <w:rPr>
+          <w:lang w:val="en-US"/>
+        </w:rPr>
+        <w:t>has to</w:t>
+      </w:r>
+      <w:proofErr w:type="gramEnd"/>
+      <w:r>
+        <w:rPr>
+          <w:lang w:val="en-US"/>
+        </w:rPr>
+        <w:t xml:space="preserve"> be written again, but with less </w:t>
+      </w:r>
+      <w:proofErr w:type="spellStart"/>
+      <w:r>
+        <w:rPr>
+          <w:lang w:val="en-US"/>
+        </w:rPr>
+        <w:t>fopen</w:t>
+      </w:r>
+      <w:proofErr w:type="spellEnd"/>
+      <w:r>
+        <w:rPr>
+          <w:lang w:val="en-US"/>
+        </w:rPr>
+        <w:t>/</w:t>
+      </w:r>
+      <w:proofErr w:type="spellStart"/>
+      <w:r>
+        <w:rPr>
+          <w:lang w:val="en-US"/>
+        </w:rPr>
+        <w:t>fclose</w:t>
+      </w:r>
+      <w:proofErr w:type="spellEnd"/>
+      <w:r>
+        <w:rPr>
+          <w:lang w:val="en-US"/>
+        </w:rPr>
+        <w:t>/</w:t>
+      </w:r>
+      <w:proofErr w:type="spellStart"/>
+      <w:r>
+        <w:rPr>
+          <w:lang w:val="en-US"/>
+        </w:rPr>
+        <w:t>fflush</w:t>
+      </w:r>
+      <w:proofErr w:type="spellEnd"/>
+      <w:r>
+        <w:rPr>
+          <w:lang w:val="en-US"/>
+        </w:rPr>
+        <w:t>!</w:t>
+      </w:r>
+    </w:p>
+    <w:p>
+      <w:pPr>
+        <w:rPr>
+          <w:lang w:val="en-US"/>
+        </w:rPr>
+      </w:pPr>
+      <w:r>
+        <w:rPr>
+          <w:lang w:val="en-US"/>
+        </w:rPr>
+        <w:t xml:space="preserve">Possibly it's not that the logfile was being opened and closed, but that I don't clear the </w:t>
+      </w:r>
+      <w:proofErr w:type="spellStart"/>
+      <w:r>
+        <w:rPr>
+          <w:lang w:val="en-US"/>
+        </w:rPr>
+        <w:t>hashtable</w:t>
+      </w:r>
+      <w:proofErr w:type="spellEnd"/>
+      <w:r>
+        <w:rPr>
+          <w:lang w:val="en-US"/>
+        </w:rPr>
+        <w:t xml:space="preserve"> </w:t>
+      </w:r>
+      <w:proofErr w:type="spellStart"/>
+      <w:r>
+        <w:rPr>
+          <w:lang w:val="en-US"/>
+        </w:rPr>
+        <w:t>any more</w:t>
+      </w:r>
+      <w:proofErr w:type="spellEnd"/>
+      <w:r>
+        <w:rPr>
+          <w:lang w:val="en-US"/>
+        </w:rPr>
+        <w:t>!</w:t>
+      </w:r>
+    </w:p>
+    <w:p>
+      <w:pPr>
+        <w:pStyle w:val="Heading3"/>
+        <w:rPr>
+          <w:lang w:val="en-US"/>
+        </w:rPr>
+      </w:pPr>
+      <w:r>
+        <w:rPr>
+          <w:lang w:val="en-US"/>
+        </w:rPr>
+        <w:lastRenderedPageBreak/>
+        <w:t xml:space="preserve">Repetition issue: </w:t>
+      </w:r>
+    </w:p>
+    <w:p>
+      <w:pPr>
+        <w:rPr>
+          <w:lang w:val="en-US"/>
+        </w:rPr>
+      </w:pPr>
+      <w:r>
+        <w:rPr>
+          <w:noProof/>
+        </w:rPr>
+        <w:drawing>
+          <wp:inline distT="0" distB="0" distL="0" distR="0" wp14:anchorId="208E9108" wp14:editId="3AF01288">
+            <wp:extent cx="3218786" cy="3693160"/>
+            <wp:effectExtent l="0" t="0" r="1270" b="2540"/>
+            <wp:docPr id="44" name="Picture 44"/>
+            <wp:cNvGraphicFramePr>
+              <a:graphicFrameLocks xmlns:a="http://schemas.openxmlformats.org/drawingml/2006/main" noChangeAspect="1"/>
+            </wp:cNvGraphicFramePr>
+            <a:graphic xmlns:a="http://schemas.openxmlformats.org/drawingml/2006/main">
+              <a:graphicData uri="http://schemas.openxmlformats.org/drawingml/2006/picture">
+                <pic:pic xmlns:pic="http://schemas.openxmlformats.org/drawingml/2006/picture">
+                  <pic:nvPicPr>
+                    <pic:cNvPr id="1" name=""/>
+                    <pic:cNvPicPr/>
+                  </pic:nvPicPr>
+                  <pic:blipFill>
+                    <a:blip r:embed="rId54"/>
+                    <a:stretch>
+                      <a:fillRect/>
+                    </a:stretch>
+                  </pic:blipFill>
+                  <pic:spPr>
+                    <a:xfrm>
+                      <a:off x="0" y="0"/>
                       <a:ext cx="3227006" cy="3702591"/>
                     </a:xfrm>
                     <a:prstGeom prst="rect">
@@ -8072,6 +9348,342 @@
         </w:rPr>
         <w:t xml:space="preserve"> repeated moves!? Check this game and move rep code?</w:t>
       </w:r>
+    </w:p>
+    <w:p>
+      <w:pPr>
+        <w:rPr>
+          <w:lang w:val="en-US"/>
+        </w:rPr>
+      </w:pPr>
+      <w:r>
+        <w:rPr>
+          <w:lang w:val="en-US"/>
+        </w:rPr>
+        <w:t>…and in Match46 another game it didn't win due to repeating:</w:t>
+      </w:r>
+    </w:p>
+    <w:p>
+      <w:pPr>
+        <w:rPr>
+          <w:lang w:val="en-US"/>
+        </w:rPr>
+      </w:pPr>
+      <w:r>
+        <w:rPr>
+          <w:lang w:val="en-US"/>
+        </w:rPr>
+        <w:t>[Event "game 743: "]</w:t>
+      </w:r>
+    </w:p>
+    <w:p>
+      <w:pPr>
+        <w:rPr>
+          <w:lang w:val="en-US"/>
+        </w:rPr>
+      </w:pPr>
+      <w:r>
+        <w:rPr>
+          <w:lang w:val="en-US"/>
+        </w:rPr>
+        <w:t>[Date ""]</w:t>
+      </w:r>
+    </w:p>
+    <w:p>
+      <w:pPr>
+        <w:rPr>
+          <w:lang w:val="en-US"/>
+        </w:rPr>
+      </w:pPr>
+      <w:r>
+        <w:rPr>
+          <w:lang w:val="en-US"/>
+        </w:rPr>
+        <w:t>[Black "Cake 1.85g 5534k (103p)"]</w:t>
+      </w:r>
+    </w:p>
+    <w:p>
+      <w:pPr>
+        <w:rPr>
+          <w:lang w:val="en-US"/>
+        </w:rPr>
+      </w:pPr>
+      <w:r>
+        <w:rPr>
+          <w:lang w:val="en-US"/>
+        </w:rPr>
+        <w:t>[White "</w:t>
+      </w:r>
+      <w:proofErr w:type="spellStart"/>
+      <w:r>
+        <w:rPr>
+          <w:lang w:val="en-US"/>
+        </w:rPr>
+        <w:t>Kingsrow</w:t>
+      </w:r>
+      <w:proofErr w:type="spellEnd"/>
+      <w:r>
+        <w:rPr>
+          <w:lang w:val="en-US"/>
+        </w:rPr>
+        <w:t>(x64) 1.18f"]</w:t>
+      </w:r>
+    </w:p>
+    <w:p>
+      <w:pPr>
+        <w:rPr>
+          <w:lang w:val="en-US"/>
+        </w:rPr>
+      </w:pPr>
+      <w:r>
+        <w:rPr>
+          <w:lang w:val="en-US"/>
+        </w:rPr>
+        <w:t>[Result "*"]</w:t>
+      </w:r>
+    </w:p>
+    <w:p>
+      <w:r>
+        <w:t>[FEN "B:W21,22,23,24,25,26,27,29,30,31,32:B1,2,3,4,5,6,7,9,10,11,16"]</w:t>
+      </w:r>
+    </w:p>
+    <w:p>
+      <w:r>
+        <w:t xml:space="preserve">1. 4-8 22-18 2. 10-15 24-20 3. 15x22 25x18 4. 7-10 29-25 5. 10-15 25-22 6. 6-10 27-24 7. </w:t>
+      </w:r>
+    </w:p>
+    <w:p>
+      <w:pPr>
+        <w:rPr>
+          <w:lang w:val="en-US"/>
+        </w:rPr>
+      </w:pPr>
+      <w:r>
+        <w:t xml:space="preserve">8-12 32-28 8. 3-7 23-19 9. 16x23 26x19 10. </w:t>
+      </w:r>
+      <w:r>
+        <w:rPr>
+          <w:lang w:val="en-US"/>
+        </w:rPr>
+        <w:t xml:space="preserve">9-14 18x9 11. 5x14 21-17 12. 14x21 22-18 13. </w:t>
+      </w:r>
+    </w:p>
+    <w:p>
+      <w:pPr>
+        <w:rPr>
+          <w:lang w:val="en-US"/>
+        </w:rPr>
+      </w:pPr>
+      <w:r>
+        <w:rPr>
+          <w:lang w:val="en-US"/>
+        </w:rPr>
+        <w:t xml:space="preserve">15x22 19-16 14. 12x19 24x8 15. 22-25 8-3 16. 25-29 20-16 17. 29-25 16-12 18. 25-22 12-8 </w:t>
+      </w:r>
+    </w:p>
+    <w:p>
+      <w:pPr>
+        <w:rPr>
+          <w:lang w:val="en-US"/>
+        </w:rPr>
+      </w:pPr>
+      <w:r>
+        <w:rPr>
+          <w:lang w:val="en-US"/>
+        </w:rPr>
+        <w:t xml:space="preserve">19. 22-17 28-24 20. 7-11 24-19 21. 11-15 19-16 22. 15-18 8-4 23. 18-22 4-8 24. 22-25 16-11 </w:t>
+      </w:r>
+    </w:p>
+    <w:p>
+      <w:pPr>
+        <w:rPr>
+          <w:lang w:val="en-US"/>
+        </w:rPr>
+      </w:pPr>
+      <w:r>
+        <w:rPr>
+          <w:lang w:val="en-US"/>
+        </w:rPr>
+        <w:t xml:space="preserve">25. 25-29 8-12 26. 29-25 12-16 27. 25-22 3-8 28. 22-18 16-19 29. 18-14 19-24 30. 10-15 </w:t>
+      </w:r>
+    </w:p>
+    <w:p>
+      <w:pPr>
+        <w:rPr>
+          <w:lang w:val="en-US"/>
+        </w:rPr>
+      </w:pPr>
+      <w:r>
+        <w:rPr>
+          <w:lang w:val="en-US"/>
+        </w:rPr>
+        <w:t xml:space="preserve">8-12 31. 15-18 12-16 32. 18-22 24-27 33. 14-18 11-8 34. 17-14 16-11 35. 14-10 8-3 36. </w:t>
+      </w:r>
+    </w:p>
+    <w:p>
+      <w:pPr>
+        <w:rPr>
+          <w:lang w:val="en-US"/>
+        </w:rPr>
+      </w:pPr>
+      <w:r>
+        <w:rPr>
+          <w:lang w:val="en-US"/>
+        </w:rPr>
+        <w:t xml:space="preserve">22-25 31-26 37. 25-29 3-8 38. 29-25 11-16 39. 18-14 27-31 40. 14-17 16-19 41. 25-22 19-16 </w:t>
+      </w:r>
+    </w:p>
+    <w:p>
+      <w:pPr>
+        <w:rPr>
+          <w:lang w:val="en-US"/>
+        </w:rPr>
+      </w:pPr>
+      <w:r>
+        <w:rPr>
+          <w:lang w:val="en-US"/>
+        </w:rPr>
+        <w:t xml:space="preserve">42. 22-18 8-3 43. 18-22 3-8 44. 10-6 16-11 45. 6-10 11-16 46. 10-6 16-11 47. 6-10 11-16 </w:t>
+      </w:r>
+    </w:p>
+    <w:p>
+      <w:pPr>
+        <w:rPr>
+          <w:lang w:val="en-US"/>
+        </w:rPr>
+      </w:pPr>
+      <w:r>
+        <w:rPr>
+          <w:lang w:val="en-US"/>
+        </w:rPr>
+        <w:t xml:space="preserve">48. 10-15 16-11 49. 15-10 11-16 50. 22-18 8-3 51. 18-15 3-8 52. 17-14 16-11 53. 15-19 8-3 </w:t>
+      </w:r>
+    </w:p>
+    <w:p>
+      <w:pPr>
+        <w:rPr>
+          <w:lang w:val="en-US"/>
+        </w:rPr>
+      </w:pPr>
+      <w:r>
+        <w:rPr>
+          <w:lang w:val="en-US"/>
+        </w:rPr>
+        <w:lastRenderedPageBreak/>
+        <w:t xml:space="preserve">54. 19-24 26-22 55. 24-19 31-26 56. 10-6 3-8 57. 14-10 8-12 58. 10-7 11-16 59. 19-15 16-20 </w:t>
+      </w:r>
+    </w:p>
+    <w:p>
+      <w:pPr>
+        <w:rPr>
+          <w:lang w:val="en-US"/>
+        </w:rPr>
+      </w:pPr>
+      <w:r>
+        <w:rPr>
+          <w:lang w:val="en-US"/>
+        </w:rPr>
+        <w:t xml:space="preserve">60. 7-11 12-16 61. 6-9 16x7 62. 2x11 20-24 63. 9-14 26-23 64. 11-16 24-27 65. 1-6 27-31 </w:t>
+      </w:r>
+    </w:p>
+    <w:p>
+      <w:pPr>
+        <w:rPr>
+          <w:lang w:val="en-US"/>
+        </w:rPr>
+      </w:pPr>
+      <w:r>
+        <w:rPr>
+          <w:lang w:val="en-US"/>
+        </w:rPr>
+        <w:t xml:space="preserve">66. 6-10 31-27 67. 15-19 23-26 68. 16-20 26-31 69. 10-15 27-32 70. 14-18 22-17 71. 19-16 </w:t>
+      </w:r>
+    </w:p>
+    <w:p>
+      <w:pPr>
+        <w:rPr>
+          <w:lang w:val="en-US"/>
+        </w:rPr>
+      </w:pPr>
+      <w:r>
+        <w:rPr>
+          <w:lang w:val="en-US"/>
+        </w:rPr>
+        <w:t xml:space="preserve">31-27 72. 15-19 27-31 73. 18-22 17-14 74. 19-24 14-9 75. 16-11 9-6 76. 11-15 6-2 77. 15-10 </w:t>
+      </w:r>
+    </w:p>
+    <w:p>
+      <w:pPr>
+        <w:rPr>
+          <w:lang w:val="en-US"/>
+        </w:rPr>
+      </w:pPr>
+      <w:r>
+        <w:rPr>
+          <w:lang w:val="en-US"/>
+        </w:rPr>
+        <w:t xml:space="preserve">32-27 78. 22-18 27-32 79. 10-14 32-27 80. 14-10 27-32 81. 10-14 32-27 82. 14-10 27-32 83. </w:t>
+      </w:r>
+    </w:p>
+    <w:p>
+      <w:pPr>
+        <w:rPr>
+          <w:lang w:val="en-US"/>
+        </w:rPr>
+      </w:pPr>
+      <w:r>
+        <w:rPr>
+          <w:lang w:val="en-US"/>
+        </w:rPr>
+        <w:t xml:space="preserve">10-14 32-27 84. 14-10 27-32 85. 18-22 32-27 86. 22-18 27-32 87. 24-28 31-27 88. 18-15 </w:t>
+      </w:r>
+    </w:p>
+    <w:p>
+      <w:pPr>
+        <w:rPr>
+          <w:lang w:val="en-US"/>
+        </w:rPr>
+      </w:pPr>
+      <w:r>
+        <w:rPr>
+          <w:lang w:val="en-US"/>
+        </w:rPr>
+        <w:t xml:space="preserve">27-31 89. 15-18 31-27 90. 18-15 27-31 91. 15-19 31-26 92. 20-24 26-31 93. 19-16 31-26 94. </w:t>
+      </w:r>
+    </w:p>
+    <w:p>
+      <w:pPr>
+        <w:rPr>
+          <w:lang w:val="en-US"/>
+        </w:rPr>
+      </w:pPr>
+      <w:r>
+        <w:rPr>
+          <w:lang w:val="en-US"/>
+        </w:rPr>
+        <w:t xml:space="preserve">16-11 26-31 95. 11-16 31-26 96. 16-11 26-31 97. 11-16 31-26 98. 16-19 26-31 99. 19-23 </w:t>
+      </w:r>
+    </w:p>
+    <w:p>
+      <w:pPr>
+        <w:rPr>
+          <w:lang w:val="en-US"/>
+        </w:rPr>
+      </w:pPr>
+      <w:r>
+        <w:rPr>
+          <w:lang w:val="en-US"/>
+        </w:rPr>
+        <w:t>31-26 100. 23-19 26-31 101. 10-14 *</w:t>
+      </w:r>
+      <w:bookmarkStart w:id="0" w:name="_GoBack"/>
+      <w:bookmarkEnd w:id="0"/>
+    </w:p>
+    <w:p>
+      <w:pPr>
+        <w:rPr>
+          <w:lang w:val="en-US"/>
+        </w:rPr>
+      </w:pPr>
     </w:p>
     <w:p>
       <w:pPr>
@@ -8544,6 +10156,230 @@
     </w:lvl>
   </w:abstractNum>
   <w:abstractNum w:abstractNumId="3" w15:restartNumberingAfterBreak="0">
+    <w:nsid w:val="483A2768"/>
+    <w:multiLevelType w:val="hybridMultilevel"/>
+    <w:tmpl w:val="89805816"/>
+    <w:lvl w:ilvl="0" w:tplc="16287E94">
+      <w:numFmt w:val="bullet"/>
+      <w:lvlText w:val=""/>
+      <w:lvlJc w:val="left"/>
+      <w:pPr>
+        <w:ind w:left="720" w:hanging="360"/>
+      </w:pPr>
+      <w:rPr>
+        <w:rFonts w:ascii="Wingdings" w:eastAsiaTheme="minorHAnsi" w:hAnsi="Wingdings" w:cstheme="minorBidi" w:hint="default"/>
+      </w:rPr>
+    </w:lvl>
+    <w:lvl w:ilvl="1" w:tplc="08070003" w:tentative="1">
+      <w:start w:val="1"/>
+      <w:numFmt w:val="bullet"/>
+      <w:lvlText w:val="o"/>
+      <w:lvlJc w:val="left"/>
+      <w:pPr>
+        <w:ind w:left="1440" w:hanging="360"/>
+      </w:pPr>
+      <w:rPr>
+        <w:rFonts w:ascii="Courier New" w:hAnsi="Courier New" w:cs="Courier New" w:hint="default"/>
+      </w:rPr>
+    </w:lvl>
+    <w:lvl w:ilvl="2" w:tplc="08070005" w:tentative="1">
+      <w:start w:val="1"/>
+      <w:numFmt w:val="bullet"/>
+      <w:lvlText w:val=""/>
+      <w:lvlJc w:val="left"/>
+      <w:pPr>
+        <w:ind w:left="2160" w:hanging="360"/>
+      </w:pPr>
+      <w:rPr>
+        <w:rFonts w:ascii="Wingdings" w:hAnsi="Wingdings" w:hint="default"/>
+      </w:rPr>
+    </w:lvl>
+    <w:lvl w:ilvl="3" w:tplc="08070001" w:tentative="1">
+      <w:start w:val="1"/>
+      <w:numFmt w:val="bullet"/>
+      <w:lvlText w:val=""/>
+      <w:lvlJc w:val="left"/>
+      <w:pPr>
+        <w:ind w:left="2880" w:hanging="360"/>
+      </w:pPr>
+      <w:rPr>
+        <w:rFonts w:ascii="Symbol" w:hAnsi="Symbol" w:hint="default"/>
+      </w:rPr>
+    </w:lvl>
+    <w:lvl w:ilvl="4" w:tplc="08070003" w:tentative="1">
+      <w:start w:val="1"/>
+      <w:numFmt w:val="bullet"/>
+      <w:lvlText w:val="o"/>
+      <w:lvlJc w:val="left"/>
+      <w:pPr>
+        <w:ind w:left="3600" w:hanging="360"/>
+      </w:pPr>
+      <w:rPr>
+        <w:rFonts w:ascii="Courier New" w:hAnsi="Courier New" w:cs="Courier New" w:hint="default"/>
+      </w:rPr>
+    </w:lvl>
+    <w:lvl w:ilvl="5" w:tplc="08070005" w:tentative="1">
+      <w:start w:val="1"/>
+      <w:numFmt w:val="bullet"/>
+      <w:lvlText w:val=""/>
+      <w:lvlJc w:val="left"/>
+      <w:pPr>
+        <w:ind w:left="4320" w:hanging="360"/>
+      </w:pPr>
+      <w:rPr>
+        <w:rFonts w:ascii="Wingdings" w:hAnsi="Wingdings" w:hint="default"/>
+      </w:rPr>
+    </w:lvl>
+    <w:lvl w:ilvl="6" w:tplc="08070001" w:tentative="1">
+      <w:start w:val="1"/>
+      <w:numFmt w:val="bullet"/>
+      <w:lvlText w:val=""/>
+      <w:lvlJc w:val="left"/>
+      <w:pPr>
+        <w:ind w:left="5040" w:hanging="360"/>
+      </w:pPr>
+      <w:rPr>
+        <w:rFonts w:ascii="Symbol" w:hAnsi="Symbol" w:hint="default"/>
+      </w:rPr>
+    </w:lvl>
+    <w:lvl w:ilvl="7" w:tplc="08070003" w:tentative="1">
+      <w:start w:val="1"/>
+      <w:numFmt w:val="bullet"/>
+      <w:lvlText w:val="o"/>
+      <w:lvlJc w:val="left"/>
+      <w:pPr>
+        <w:ind w:left="5760" w:hanging="360"/>
+      </w:pPr>
+      <w:rPr>
+        <w:rFonts w:ascii="Courier New" w:hAnsi="Courier New" w:cs="Courier New" w:hint="default"/>
+      </w:rPr>
+    </w:lvl>
+    <w:lvl w:ilvl="8" w:tplc="08070005" w:tentative="1">
+      <w:start w:val="1"/>
+      <w:numFmt w:val="bullet"/>
+      <w:lvlText w:val=""/>
+      <w:lvlJc w:val="left"/>
+      <w:pPr>
+        <w:ind w:left="6480" w:hanging="360"/>
+      </w:pPr>
+      <w:rPr>
+        <w:rFonts w:ascii="Wingdings" w:hAnsi="Wingdings" w:hint="default"/>
+      </w:rPr>
+    </w:lvl>
+  </w:abstractNum>
+  <w:abstractNum w:abstractNumId="4" w15:restartNumberingAfterBreak="0">
+    <w:nsid w:val="4C150035"/>
+    <w:multiLevelType w:val="hybridMultilevel"/>
+    <w:tmpl w:val="55FAF0F2"/>
+    <w:lvl w:ilvl="0" w:tplc="52BA1B22">
+      <w:numFmt w:val="bullet"/>
+      <w:lvlText w:val=""/>
+      <w:lvlJc w:val="left"/>
+      <w:pPr>
+        <w:ind w:left="720" w:hanging="360"/>
+      </w:pPr>
+      <w:rPr>
+        <w:rFonts w:ascii="Symbol" w:eastAsiaTheme="minorHAnsi" w:hAnsi="Symbol" w:cstheme="minorBidi" w:hint="default"/>
+      </w:rPr>
+    </w:lvl>
+    <w:lvl w:ilvl="1" w:tplc="08070003" w:tentative="1">
+      <w:start w:val="1"/>
+      <w:numFmt w:val="bullet"/>
+      <w:lvlText w:val="o"/>
+      <w:lvlJc w:val="left"/>
+      <w:pPr>
+        <w:ind w:left="1440" w:hanging="360"/>
+      </w:pPr>
+      <w:rPr>
+        <w:rFonts w:ascii="Courier New" w:hAnsi="Courier New" w:cs="Courier New" w:hint="default"/>
+      </w:rPr>
+    </w:lvl>
+    <w:lvl w:ilvl="2" w:tplc="08070005" w:tentative="1">
+      <w:start w:val="1"/>
+      <w:numFmt w:val="bullet"/>
+      <w:lvlText w:val=""/>
+      <w:lvlJc w:val="left"/>
+      <w:pPr>
+        <w:ind w:left="2160" w:hanging="360"/>
+      </w:pPr>
+      <w:rPr>
+        <w:rFonts w:ascii="Wingdings" w:hAnsi="Wingdings" w:hint="default"/>
+      </w:rPr>
+    </w:lvl>
+    <w:lvl w:ilvl="3" w:tplc="08070001" w:tentative="1">
+      <w:start w:val="1"/>
+      <w:numFmt w:val="bullet"/>
+      <w:lvlText w:val=""/>
+      <w:lvlJc w:val="left"/>
+      <w:pPr>
+        <w:ind w:left="2880" w:hanging="360"/>
+      </w:pPr>
+      <w:rPr>
+        <w:rFonts w:ascii="Symbol" w:hAnsi="Symbol" w:hint="default"/>
+      </w:rPr>
+    </w:lvl>
+    <w:lvl w:ilvl="4" w:tplc="08070003" w:tentative="1">
+      <w:start w:val="1"/>
+      <w:numFmt w:val="bullet"/>
+      <w:lvlText w:val="o"/>
+      <w:lvlJc w:val="left"/>
+      <w:pPr>
+        <w:ind w:left="3600" w:hanging="360"/>
+      </w:pPr>
+      <w:rPr>
+        <w:rFonts w:ascii="Courier New" w:hAnsi="Courier New" w:cs="Courier New" w:hint="default"/>
+      </w:rPr>
+    </w:lvl>
+    <w:lvl w:ilvl="5" w:tplc="08070005" w:tentative="1">
+      <w:start w:val="1"/>
+      <w:numFmt w:val="bullet"/>
+      <w:lvlText w:val=""/>
+      <w:lvlJc w:val="left"/>
+      <w:pPr>
+        <w:ind w:left="4320" w:hanging="360"/>
+      </w:pPr>
+      <w:rPr>
+        <w:rFonts w:ascii="Wingdings" w:hAnsi="Wingdings" w:hint="default"/>
+      </w:rPr>
+    </w:lvl>
+    <w:lvl w:ilvl="6" w:tplc="08070001" w:tentative="1">
+      <w:start w:val="1"/>
+      <w:numFmt w:val="bullet"/>
+      <w:lvlText w:val=""/>
+      <w:lvlJc w:val="left"/>
+      <w:pPr>
+        <w:ind w:left="5040" w:hanging="360"/>
+      </w:pPr>
+      <w:rPr>
+        <w:rFonts w:ascii="Symbol" w:hAnsi="Symbol" w:hint="default"/>
+      </w:rPr>
+    </w:lvl>
+    <w:lvl w:ilvl="7" w:tplc="08070003" w:tentative="1">
+      <w:start w:val="1"/>
+      <w:numFmt w:val="bullet"/>
+      <w:lvlText w:val="o"/>
+      <w:lvlJc w:val="left"/>
+      <w:pPr>
+        <w:ind w:left="5760" w:hanging="360"/>
+      </w:pPr>
+      <w:rPr>
+        <w:rFonts w:ascii="Courier New" w:hAnsi="Courier New" w:cs="Courier New" w:hint="default"/>
+      </w:rPr>
+    </w:lvl>
+    <w:lvl w:ilvl="8" w:tplc="08070005" w:tentative="1">
+      <w:start w:val="1"/>
+      <w:numFmt w:val="bullet"/>
+      <w:lvlText w:val=""/>
+      <w:lvlJc w:val="left"/>
+      <w:pPr>
+        <w:ind w:left="6480" w:hanging="360"/>
+      </w:pPr>
+      <w:rPr>
+        <w:rFonts w:ascii="Wingdings" w:hAnsi="Wingdings" w:hint="default"/>
+      </w:rPr>
+    </w:lvl>
+  </w:abstractNum>
+  <w:abstractNum w:abstractNumId="5" w15:restartNumberingAfterBreak="0">
     <w:nsid w:val="5D204F25"/>
     <w:multiLevelType w:val="hybridMultilevel"/>
     <w:tmpl w:val="162A9EF0"/>
@@ -8639,10 +10475,16 @@
     <w:abstractNumId w:val="0"/>
   </w:num>
   <w:num w:numId="3">
-    <w:abstractNumId w:val="3"/>
+    <w:abstractNumId w:val="5"/>
   </w:num>
   <w:num w:numId="4">
     <w:abstractNumId w:val="1"/>
+  </w:num>
+  <w:num w:numId="5">
+    <w:abstractNumId w:val="4"/>
+  </w:num>
+  <w:num w:numId="6">
+    <w:abstractNumId w:val="3"/>
   </w:num>
 </w:numbering>
 </file>

</xml_diff>

<commit_message>
added some code for logging and repetition detection, still dormant
</commit_message>
<xml_diff>
--- a/2019_04_22_EvaluationTuning.docx
+++ b/2019_04_22_EvaluationTuning.docx
@@ -8542,61 +8542,6 @@
           <w:lang w:val="en-US"/>
         </w:rPr>
       </w:pPr>
-    </w:p>
-    <w:p>
-      <w:pPr>
-        <w:rPr>
-          <w:lang w:val="en-US"/>
-        </w:rPr>
-      </w:pPr>
-    </w:p>
-    <w:p>
-      <w:pPr>
-        <w:rPr>
-          <w:lang w:val="en-US"/>
-        </w:rPr>
-      </w:pPr>
-    </w:p>
-    <w:p>
-      <w:pPr>
-        <w:rPr>
-          <w:lang w:val="en-US"/>
-        </w:rPr>
-      </w:pPr>
-    </w:p>
-    <w:p>
-      <w:pPr>
-        <w:rPr>
-          <w:lang w:val="en-US"/>
-        </w:rPr>
-      </w:pPr>
-    </w:p>
-    <w:p>
-      <w:pPr>
-        <w:rPr>
-          <w:noProof/>
-        </w:rPr>
-      </w:pPr>
-    </w:p>
-    <w:p>
-      <w:pPr>
-        <w:rPr>
-          <w:lang w:val="en-US"/>
-        </w:rPr>
-      </w:pPr>
-      <w:r>
-        <w:rPr>
-          <w:lang w:val="en-US"/>
-        </w:rPr>
-        <w:br w:type="textWrapping" w:clear="all"/>
-      </w:r>
-    </w:p>
-    <w:p>
-      <w:pPr>
-        <w:rPr>
-          <w:lang w:val="en-US"/>
-        </w:rPr>
-      </w:pPr>
       <w:r>
         <w:rPr>
           <w:lang w:val="en-US"/>
@@ -8617,6 +8562,89 @@
         </w:rPr>
         <w:t xml:space="preserve"> work in the match…</w:t>
       </w:r>
+    </w:p>
+    <w:p>
+      <w:pPr>
+        <w:pStyle w:val="Heading2"/>
+        <w:rPr>
+          <w:lang w:val="en-US"/>
+        </w:rPr>
+      </w:pPr>
+      <w:r>
+        <w:rPr>
+          <w:lang w:val="en-US"/>
+        </w:rPr>
+        <w:t>Multi-run of optimizer (20.5.2019)</w:t>
+      </w:r>
+    </w:p>
+    <w:p>
+      <w:pPr>
+        <w:rPr>
+          <w:lang w:val="en-US"/>
+        </w:rPr>
+      </w:pPr>
+      <w:r>
+        <w:rPr>
+          <w:lang w:val="en-US"/>
+        </w:rPr>
+        <w:t>I may or may not have messed up the code a bit based on a too short (4-move) match against an older Cake version; in any case I tried to redo the changes above, and then I ran the optimizer from "</w:t>
+      </w:r>
+      <w:proofErr w:type="spellStart"/>
+      <w:r>
+        <w:rPr>
+          <w:lang w:val="en-US"/>
+        </w:rPr>
+        <w:t>optimalparams</w:t>
+      </w:r>
+      <w:proofErr w:type="spellEnd"/>
+      <w:r>
+        <w:rPr>
+          <w:lang w:val="en-US"/>
+        </w:rPr>
+        <w:t xml:space="preserve">" on expecting nothing to change. But I noticed that it did change things, so first I thought I had messed up, then I realized that the optimizer first figures out which are the quiet positions, and works only on these, and it does that comparing its evaluation with the search evaluation of an older Cake version that was used to create the tagged-and-evaluated-positions =&gt; depending on the starting params, the optimizer uses a different position set. I ran the optimizer multiple times, always starting at </w:t>
+      </w:r>
+      <w:proofErr w:type="spellStart"/>
+      <w:r>
+        <w:rPr>
+          <w:lang w:val="en-US"/>
+        </w:rPr>
+        <w:t>optimalparams</w:t>
+      </w:r>
+      <w:proofErr w:type="spellEnd"/>
+      <w:r>
+        <w:rPr>
+          <w:lang w:val="en-US"/>
+        </w:rPr>
+        <w:t xml:space="preserve">, it took about 3 runs until it was converged. Then I created Cake_5550k_103p based on </w:t>
+      </w:r>
+      <w:proofErr w:type="gramStart"/>
+      <w:r>
+        <w:rPr>
+          <w:lang w:val="en-US"/>
+        </w:rPr>
+        <w:t>that, and</w:t>
+      </w:r>
+      <w:proofErr w:type="gramEnd"/>
+      <w:r>
+        <w:rPr>
+          <w:lang w:val="en-US"/>
+        </w:rPr>
+        <w:t xml:space="preserve"> ran matches. Results:</w:t>
+      </w:r>
+    </w:p>
+    <w:p>
+      <w:pPr>
+        <w:rPr>
+          <w:lang w:val="en-US"/>
+        </w:rPr>
+      </w:pPr>
+    </w:p>
+    <w:p>
+      <w:pPr>
+        <w:rPr>
+          <w:lang w:val="en-US"/>
+        </w:rPr>
+      </w:pPr>
     </w:p>
     <w:p>
       <w:pPr>
@@ -8721,7 +8749,35 @@
         <w:rPr>
           <w:lang w:val="en-US"/>
         </w:rPr>
-        <w:t>Identify parameters to remove in the end (obviously all parameters with weight 0), but perhaps also check for each parameter what happens if I set it to 0?</w:t>
+        <w:t xml:space="preserve">Try to-re-add endangered bridge </w:t>
+      </w:r>
+      <w:proofErr w:type="spellStart"/>
+      <w:r>
+        <w:rPr>
+          <w:lang w:val="en-US"/>
+        </w:rPr>
+        <w:t>val</w:t>
+      </w:r>
+      <w:proofErr w:type="spellEnd"/>
+      <w:r>
+        <w:rPr>
+          <w:lang w:val="en-US"/>
+        </w:rPr>
+        <w:t xml:space="preserve">, </w:t>
+      </w:r>
+      <w:proofErr w:type="spellStart"/>
+      <w:r>
+        <w:rPr>
+          <w:lang w:val="en-US"/>
+        </w:rPr>
+        <w:t>mandown</w:t>
+      </w:r>
+      <w:proofErr w:type="spellEnd"/>
+      <w:r>
+        <w:rPr>
+          <w:lang w:val="en-US"/>
+        </w:rPr>
+        <w:t>-compensation without runaway, and backward ungrounded men</w:t>
       </w:r>
     </w:p>
     <w:p>
@@ -8739,21 +8795,7 @@
         <w:rPr>
           <w:lang w:val="en-US"/>
         </w:rPr>
-        <w:t xml:space="preserve">Perhaps: divide </w:t>
-      </w:r>
-      <w:proofErr w:type="spellStart"/>
-      <w:r>
-        <w:rPr>
-          <w:lang w:val="en-US"/>
-        </w:rPr>
-        <w:t>fineeval</w:t>
-      </w:r>
-      <w:proofErr w:type="spellEnd"/>
-      <w:r>
-        <w:rPr>
-          <w:lang w:val="en-US"/>
-        </w:rPr>
-        <w:t xml:space="preserve"> return value by 2 or 4 to allow finer grained eval and rerun optimizer?</w:t>
+        <w:t>Identify parameters to remove in the end (obviously all parameters with weight 0), but perhaps also check for each parameter what happens if I set it to 0?</w:t>
       </w:r>
     </w:p>
     <w:p>
@@ -8771,8 +8813,25 @@
         <w:rPr>
           <w:lang w:val="en-US"/>
         </w:rPr>
-        <w:t>Menial task: logfile</w:t>
-      </w:r>
+        <w:lastRenderedPageBreak/>
+        <w:t xml:space="preserve">Check different </w:t>
+      </w:r>
+      <w:proofErr w:type="spellStart"/>
+      <w:r>
+        <w:rPr>
+          <w:lang w:val="en-US"/>
+        </w:rPr>
+        <w:t>hashtable</w:t>
+      </w:r>
+      <w:proofErr w:type="spellEnd"/>
+      <w:r>
+        <w:rPr>
+          <w:lang w:val="en-US"/>
+        </w:rPr>
+        <w:t xml:space="preserve"> schemes: clear at start of game once, clear every X moves?</w:t>
+      </w:r>
+      <w:bookmarkStart w:id="0" w:name="_GoBack"/>
+      <w:bookmarkEnd w:id="0"/>
     </w:p>
     <w:p>
       <w:pPr>
@@ -8789,7 +8848,21 @@
         <w:rPr>
           <w:lang w:val="en-US"/>
         </w:rPr>
-        <w:t>Menial task: repetition draws?</w:t>
+        <w:t xml:space="preserve">Perhaps: divide </w:t>
+      </w:r>
+      <w:proofErr w:type="spellStart"/>
+      <w:r>
+        <w:rPr>
+          <w:lang w:val="en-US"/>
+        </w:rPr>
+        <w:t>fineeval</w:t>
+      </w:r>
+      <w:proofErr w:type="spellEnd"/>
+      <w:r>
+        <w:rPr>
+          <w:lang w:val="en-US"/>
+        </w:rPr>
+        <w:t xml:space="preserve"> return value by 2 or 4 to allow finer grained eval and rerun optimizer?</w:t>
       </w:r>
     </w:p>
     <w:p>
@@ -8807,7 +8880,93 @@
         <w:rPr>
           <w:lang w:val="en-US"/>
         </w:rPr>
-        <w:lastRenderedPageBreak/>
+        <w:t>Menial task: logfile</w:t>
+      </w:r>
+      <w:r>
+        <w:rPr>
+          <w:lang w:val="en-US"/>
+        </w:rPr>
+        <w:t xml:space="preserve">; also log to file what repetition detection is doing in </w:t>
+      </w:r>
+      <w:proofErr w:type="spellStart"/>
+      <w:r>
+        <w:rPr>
+          <w:lang w:val="en-US"/>
+        </w:rPr>
+        <w:t>cake_getmove</w:t>
+      </w:r>
+      <w:proofErr w:type="spellEnd"/>
+      <w:r>
+        <w:rPr>
+          <w:lang w:val="en-US"/>
+        </w:rPr>
+        <w:t>; and write to file if reset is 1</w:t>
+      </w:r>
+      <w:r>
+        <w:rPr>
+          <w:lang w:val="en-US"/>
+        </w:rPr>
+        <w:t>. Use #define NEWLOG to test!</w:t>
+      </w:r>
+    </w:p>
+    <w:p>
+      <w:pPr>
+        <w:pStyle w:val="ListParagraph"/>
+        <w:numPr>
+          <w:ilvl w:val="0"/>
+          <w:numId w:val="5"/>
+        </w:numPr>
+        <w:rPr>
+          <w:highlight w:val="green"/>
+          <w:lang w:val="en-US"/>
+        </w:rPr>
+      </w:pPr>
+      <w:r>
+        <w:rPr>
+          <w:highlight w:val="green"/>
+          <w:lang w:val="en-US"/>
+        </w:rPr>
+        <w:t>Menial task: repetition draws?</w:t>
+      </w:r>
+      <w:r>
+        <w:rPr>
+          <w:highlight w:val="green"/>
+          <w:lang w:val="en-US"/>
+        </w:rPr>
+        <w:t xml:space="preserve"> (coded, needs testing with #define NEWREPDETECTION in </w:t>
+      </w:r>
+      <w:proofErr w:type="spellStart"/>
+      <w:r>
+        <w:rPr>
+          <w:highlight w:val="green"/>
+          <w:lang w:val="en-US"/>
+        </w:rPr>
+        <w:t>switches.h</w:t>
+      </w:r>
+      <w:proofErr w:type="spellEnd"/>
+      <w:r>
+        <w:rPr>
+          <w:highlight w:val="green"/>
+          <w:lang w:val="en-US"/>
+        </w:rPr>
+        <w:t>)</w:t>
+      </w:r>
+    </w:p>
+    <w:p>
+      <w:pPr>
+        <w:pStyle w:val="ListParagraph"/>
+        <w:numPr>
+          <w:ilvl w:val="0"/>
+          <w:numId w:val="5"/>
+        </w:numPr>
+        <w:rPr>
+          <w:lang w:val="en-US"/>
+        </w:rPr>
+      </w:pPr>
+      <w:r>
+        <w:rPr>
+          <w:lang w:val="en-US"/>
+        </w:rPr>
         <w:t xml:space="preserve">Menial task: return a fail high but not completed move from MTDF if </w:t>
       </w:r>
       <w:proofErr w:type="spellStart"/>
@@ -9082,13 +9241,7 @@
         <w:rPr>
           <w:lang w:val="en-US"/>
         </w:rPr>
-        <w:t xml:space="preserve"> a few years ago and it seems to work quite well. Very simple to implement also. I reduce by 1 ply for the second, third, and 4th moves, and 2 plies for any additional moves ranked below those.</w:t>
-      </w:r>
-      <w:r>
-        <w:rPr>
-          <w:lang w:val="en-US"/>
-        </w:rPr>
-        <w:t>"</w:t>
+        <w:t xml:space="preserve"> a few years ago and it seems to work quite well. Very simple to implement also. I reduce by 1 ply for the second, third, and 4th moves, and 2 plies for any additional moves ranked below those."</w:t>
       </w:r>
       <w:r>
         <w:rPr>
@@ -9443,7 +9596,15 @@
     </w:p>
     <w:p>
       <w:r>
-        <w:t>[FEN "B:W21,22,23,24,25,26,27,29,30,31,32:B1,2,3,4,5,6,7,9,10,11,16"]</w:t>
+        <w:t>[FEN "</w:t>
+      </w:r>
+      <w:proofErr w:type="gramStart"/>
+      <w:r>
+        <w:t>B:W</w:t>
+      </w:r>
+      <w:proofErr w:type="gramEnd"/>
+      <w:r>
+        <w:t>21,22,23,24,25,26,27,29,30,31,32:B1,2,3,4,5,6,7,9,10,11,16"]</w:t>
       </w:r>
     </w:p>
     <w:p>
@@ -9675,8 +9836,6 @@
         </w:rPr>
         <w:t>31-26 100. 23-19 26-31 101. 10-14 *</w:t>
       </w:r>
-      <w:bookmarkStart w:id="0" w:name="_GoBack"/>
-      <w:bookmarkEnd w:id="0"/>
     </w:p>
     <w:p>
       <w:pPr>

</xml_diff>